<commit_message>
hws-analysis: add load curves and row-depth charts to the report
Show main-table overflow and collision-table failure from 25% to 100%
load, with the occupancy histogram of each table.

Co-authored-by: zsdaka <zsdaka@users.noreply.github.com>
</commit_message>
<xml_diff>
--- a/mlx5-hws-analysis/mlx5-hws-model.docx
+++ b/mlx5-hws-analysis/mlx5-hws-model.docx
@@ -4099,6 +4099,1061 @@
     </w:p>
     <w:p>
       <w:pPr>
+        <w:pStyle w:val="Heading2"/>
+      </w:pPr>
+      <w:r>
+        <w:rPr>
+          <w:rFonts w:ascii="Calibri" w:hAnsi="Calibri" w:eastAsia="微软雅黑"/>
+          <w:b/>
+          <w:color w:val="1B3A4B"/>
+          <w:sz w:val="30"/>
+        </w:rPr>
+        <w:t>7.3  主表负载 25% 到 100%</w:t>
+      </w:r>
+    </w:p>
+    <w:p>
+      <w:pPr>
+        <w:spacing w:after="120" w:before="0" w:line="276" w:lineRule="auto"/>
+      </w:pPr>
+      <w:r>
+        <w:rPr>
+          <w:rFonts w:ascii="Calibri" w:hAnsi="Calibri" w:eastAsia="微软雅黑"/>
+          <w:b w:val="0"/>
+          <w:sz w:val="22"/>
+        </w:rPr>
+        <w:t>负载按插入条数除以 2^24 计算。2^24 是驱动为 num_log = 24 配出的主表行数，100% 就是平均每行 1 条 key。五档的条数是 4,194,304、8,388,608、11,744,051、15,099,494 和 16,777,216。70% 对应 bwc.c 里开始扩行的水位（规则数达到 2^size_log 的 70%）。哈希仍是均匀的，表几何仍是主表每行 4 个 STE、冲突表 2^19 行、每行 16 个 STE。</w:t>
+      </w:r>
+    </w:p>
+    <w:p>
+      <w:pPr>
+        <w:spacing w:after="120" w:before="0" w:line="276" w:lineRule="auto"/>
+      </w:pPr>
+      <w:r>
+        <w:rPr>
+          <w:rFonts w:ascii="Calibri" w:hAnsi="Calibri" w:eastAsia="微软雅黑"/>
+          <w:b w:val="0"/>
+          <w:sz w:val="22"/>
+        </w:rPr>
+        <w:t>主表溢出率是主行 4 个槽放不下、因而改写冲突表的规则占全部插入的比例。冲突表溢出率是冲突行 16 个槽也放不下的规则占全部插入的比例，也就是插入失败率。</w:t>
+      </w:r>
+    </w:p>
+    <w:tbl>
+      <w:tblPr>
+        <w:tblStyle w:val="TableGrid"/>
+        <w:tblW w:type="auto" w:w="0"/>
+        <w:tblLook w:firstColumn="1" w:firstRow="1" w:lastColumn="0" w:lastRow="0" w:noHBand="0" w:noVBand="1" w:val="04A0"/>
+      </w:tblPr>
+      <w:tblGrid>
+        <w:gridCol w:w="1275"/>
+        <w:gridCol w:w="1275"/>
+        <w:gridCol w:w="1275"/>
+        <w:gridCol w:w="1275"/>
+        <w:gridCol w:w="1275"/>
+        <w:gridCol w:w="1275"/>
+        <w:gridCol w:w="1275"/>
+        <w:gridCol w:w="1275"/>
+      </w:tblGrid>
+      <w:tr>
+        <w:tc>
+          <w:tcPr>
+            <w:tcW w:type="dxa" w:w="1275"/>
+            <w:shd w:fill="1B3A4B" w:val="clear"/>
+          </w:tcPr>
+          <w:p>
+            <w:r/>
+            <w:r>
+              <w:rPr>
+                <w:rFonts w:ascii="Calibri" w:hAnsi="Calibri" w:eastAsia="微软雅黑"/>
+                <w:b/>
+                <w:color w:val="FFFFFF"/>
+                <w:sz w:val="18"/>
+              </w:rPr>
+              <w:t>负载</w:t>
+            </w:r>
+          </w:p>
+        </w:tc>
+        <w:tc>
+          <w:tcPr>
+            <w:tcW w:type="dxa" w:w="1275"/>
+            <w:shd w:fill="1B3A4B" w:val="clear"/>
+          </w:tcPr>
+          <w:p>
+            <w:r/>
+            <w:r>
+              <w:rPr>
+                <w:rFonts w:ascii="Calibri" w:hAnsi="Calibri" w:eastAsia="微软雅黑"/>
+                <w:b/>
+                <w:color w:val="FFFFFF"/>
+                <w:sz w:val="18"/>
+              </w:rPr>
+              <w:t>插入条数</w:t>
+            </w:r>
+          </w:p>
+        </w:tc>
+        <w:tc>
+          <w:tcPr>
+            <w:tcW w:type="dxa" w:w="1275"/>
+            <w:shd w:fill="1B3A4B" w:val="clear"/>
+          </w:tcPr>
+          <w:p>
+            <w:r/>
+            <w:r>
+              <w:rPr>
+                <w:rFonts w:ascii="Calibri" w:hAnsi="Calibri" w:eastAsia="微软雅黑"/>
+                <w:b/>
+                <w:color w:val="FFFFFF"/>
+                <w:sz w:val="18"/>
+              </w:rPr>
+              <w:t>主表溢出条数</w:t>
+            </w:r>
+          </w:p>
+        </w:tc>
+        <w:tc>
+          <w:tcPr>
+            <w:tcW w:type="dxa" w:w="1275"/>
+            <w:shd w:fill="1B3A4B" w:val="clear"/>
+          </w:tcPr>
+          <w:p>
+            <w:r/>
+            <w:r>
+              <w:rPr>
+                <w:rFonts w:ascii="Calibri" w:hAnsi="Calibri" w:eastAsia="微软雅黑"/>
+                <w:b/>
+                <w:color w:val="FFFFFF"/>
+                <w:sz w:val="18"/>
+              </w:rPr>
+              <w:t>主表溢出率</w:t>
+            </w:r>
+          </w:p>
+        </w:tc>
+        <w:tc>
+          <w:tcPr>
+            <w:tcW w:type="dxa" w:w="1275"/>
+            <w:shd w:fill="1B3A4B" w:val="clear"/>
+          </w:tcPr>
+          <w:p>
+            <w:r/>
+            <w:r>
+              <w:rPr>
+                <w:rFonts w:ascii="Calibri" w:hAnsi="Calibri" w:eastAsia="微软雅黑"/>
+                <w:b/>
+                <w:color w:val="FFFFFF"/>
+                <w:sz w:val="18"/>
+              </w:rPr>
+              <w:t>公式</w:t>
+            </w:r>
+          </w:p>
+        </w:tc>
+        <w:tc>
+          <w:tcPr>
+            <w:tcW w:type="dxa" w:w="1275"/>
+            <w:shd w:fill="1B3A4B" w:val="clear"/>
+          </w:tcPr>
+          <w:p>
+            <w:r/>
+            <w:r>
+              <w:rPr>
+                <w:rFonts w:ascii="Calibri" w:hAnsi="Calibri" w:eastAsia="微软雅黑"/>
+                <w:b/>
+                <w:color w:val="FFFFFF"/>
+                <w:sz w:val="18"/>
+              </w:rPr>
+              <w:t>冲突表溢出条数</w:t>
+            </w:r>
+          </w:p>
+        </w:tc>
+        <w:tc>
+          <w:tcPr>
+            <w:tcW w:type="dxa" w:w="1275"/>
+            <w:shd w:fill="1B3A4B" w:val="clear"/>
+          </w:tcPr>
+          <w:p>
+            <w:r/>
+            <w:r>
+              <w:rPr>
+                <w:rFonts w:ascii="Calibri" w:hAnsi="Calibri" w:eastAsia="微软雅黑"/>
+                <w:b/>
+                <w:color w:val="FFFFFF"/>
+                <w:sz w:val="18"/>
+              </w:rPr>
+              <w:t>冲突表溢出率（失败率）</w:t>
+            </w:r>
+          </w:p>
+        </w:tc>
+        <w:tc>
+          <w:tcPr>
+            <w:tcW w:type="dxa" w:w="1275"/>
+            <w:shd w:fill="1B3A4B" w:val="clear"/>
+          </w:tcPr>
+          <w:p>
+            <w:r/>
+            <w:r>
+              <w:rPr>
+                <w:rFonts w:ascii="Calibri" w:hAnsi="Calibri" w:eastAsia="微软雅黑"/>
+                <w:b/>
+                <w:color w:val="FFFFFF"/>
+                <w:sz w:val="18"/>
+              </w:rPr>
+              <w:t>失败公式</w:t>
+            </w:r>
+          </w:p>
+        </w:tc>
+      </w:tr>
+      <w:tr>
+        <w:tc>
+          <w:tcPr>
+            <w:tcW w:type="dxa" w:w="1275"/>
+          </w:tcPr>
+          <w:p>
+            <w:r/>
+            <w:r>
+              <w:rPr>
+                <w:rFonts w:ascii="Calibri" w:hAnsi="Calibri" w:eastAsia="微软雅黑"/>
+                <w:b w:val="0"/>
+                <w:sz w:val="16"/>
+              </w:rPr>
+              <w:t>25%</w:t>
+            </w:r>
+          </w:p>
+        </w:tc>
+        <w:tc>
+          <w:tcPr>
+            <w:tcW w:type="dxa" w:w="1275"/>
+          </w:tcPr>
+          <w:p>
+            <w:r/>
+            <w:r>
+              <w:rPr>
+                <w:rFonts w:ascii="Calibri" w:hAnsi="Calibri" w:eastAsia="微软雅黑"/>
+                <w:b w:val="0"/>
+                <w:sz w:val="16"/>
+              </w:rPr>
+              <w:t>4,194,304</w:t>
+            </w:r>
+          </w:p>
+        </w:tc>
+        <w:tc>
+          <w:tcPr>
+            <w:tcW w:type="dxa" w:w="1275"/>
+          </w:tcPr>
+          <w:p>
+            <w:r/>
+            <w:r>
+              <w:rPr>
+                <w:rFonts w:ascii="Calibri" w:hAnsi="Calibri" w:eastAsia="微软雅黑"/>
+                <w:b w:val="0"/>
+                <w:sz w:val="16"/>
+              </w:rPr>
+              <w:t>124</w:t>
+            </w:r>
+          </w:p>
+        </w:tc>
+        <w:tc>
+          <w:tcPr>
+            <w:tcW w:type="dxa" w:w="1275"/>
+          </w:tcPr>
+          <w:p>
+            <w:r/>
+            <w:r>
+              <w:rPr>
+                <w:rFonts w:ascii="Calibri" w:hAnsi="Calibri" w:eastAsia="微软雅黑"/>
+                <w:b w:val="0"/>
+                <w:sz w:val="16"/>
+              </w:rPr>
+              <w:t>0.0030%</w:t>
+            </w:r>
+          </w:p>
+        </w:tc>
+        <w:tc>
+          <w:tcPr>
+            <w:tcW w:type="dxa" w:w="1275"/>
+          </w:tcPr>
+          <w:p>
+            <w:r/>
+            <w:r>
+              <w:rPr>
+                <w:rFonts w:ascii="Calibri" w:hAnsi="Calibri" w:eastAsia="微软雅黑"/>
+                <w:b w:val="0"/>
+                <w:sz w:val="16"/>
+              </w:rPr>
+              <w:t>0.0028%</w:t>
+            </w:r>
+          </w:p>
+        </w:tc>
+        <w:tc>
+          <w:tcPr>
+            <w:tcW w:type="dxa" w:w="1275"/>
+          </w:tcPr>
+          <w:p>
+            <w:r/>
+            <w:r>
+              <w:rPr>
+                <w:rFonts w:ascii="Calibri" w:hAnsi="Calibri" w:eastAsia="微软雅黑"/>
+                <w:b w:val="0"/>
+                <w:sz w:val="16"/>
+              </w:rPr>
+              <w:t>0</w:t>
+            </w:r>
+          </w:p>
+        </w:tc>
+        <w:tc>
+          <w:tcPr>
+            <w:tcW w:type="dxa" w:w="1275"/>
+          </w:tcPr>
+          <w:p>
+            <w:r/>
+            <w:r>
+              <w:rPr>
+                <w:rFonts w:ascii="Calibri" w:hAnsi="Calibri" w:eastAsia="微软雅黑"/>
+                <w:b w:val="0"/>
+                <w:sz w:val="16"/>
+              </w:rPr>
+              <w:t>0.0000%</w:t>
+            </w:r>
+          </w:p>
+        </w:tc>
+        <w:tc>
+          <w:tcPr>
+            <w:tcW w:type="dxa" w:w="1275"/>
+          </w:tcPr>
+          <w:p>
+            <w:r/>
+            <w:r>
+              <w:rPr>
+                <w:rFonts w:ascii="Calibri" w:hAnsi="Calibri" w:eastAsia="微软雅黑"/>
+                <w:b w:val="0"/>
+                <w:sz w:val="16"/>
+              </w:rPr>
+              <w:t>0.0000%</w:t>
+            </w:r>
+          </w:p>
+        </w:tc>
+      </w:tr>
+      <w:tr>
+        <w:tc>
+          <w:tcPr>
+            <w:tcW w:type="dxa" w:w="1275"/>
+          </w:tcPr>
+          <w:p>
+            <w:r/>
+            <w:r>
+              <w:rPr>
+                <w:rFonts w:ascii="Calibri" w:hAnsi="Calibri" w:eastAsia="微软雅黑"/>
+                <w:b w:val="0"/>
+                <w:sz w:val="16"/>
+              </w:rPr>
+              <w:t>50%</w:t>
+            </w:r>
+          </w:p>
+        </w:tc>
+        <w:tc>
+          <w:tcPr>
+            <w:tcW w:type="dxa" w:w="1275"/>
+          </w:tcPr>
+          <w:p>
+            <w:r/>
+            <w:r>
+              <w:rPr>
+                <w:rFonts w:ascii="Calibri" w:hAnsi="Calibri" w:eastAsia="微软雅黑"/>
+                <w:b w:val="0"/>
+                <w:sz w:val="16"/>
+              </w:rPr>
+              <w:t>8,388,608</w:t>
+            </w:r>
+          </w:p>
+        </w:tc>
+        <w:tc>
+          <w:tcPr>
+            <w:tcW w:type="dxa" w:w="1275"/>
+          </w:tcPr>
+          <w:p>
+            <w:r/>
+            <w:r>
+              <w:rPr>
+                <w:rFonts w:ascii="Calibri" w:hAnsi="Calibri" w:eastAsia="微软雅黑"/>
+                <w:b w:val="0"/>
+                <w:sz w:val="16"/>
+              </w:rPr>
+              <w:t>3,199</w:t>
+            </w:r>
+          </w:p>
+        </w:tc>
+        <w:tc>
+          <w:tcPr>
+            <w:tcW w:type="dxa" w:w="1275"/>
+          </w:tcPr>
+          <w:p>
+            <w:r/>
+            <w:r>
+              <w:rPr>
+                <w:rFonts w:ascii="Calibri" w:hAnsi="Calibri" w:eastAsia="微软雅黑"/>
+                <w:b w:val="0"/>
+                <w:sz w:val="16"/>
+              </w:rPr>
+              <w:t>0.0381%</w:t>
+            </w:r>
+          </w:p>
+        </w:tc>
+        <w:tc>
+          <w:tcPr>
+            <w:tcW w:type="dxa" w:w="1275"/>
+          </w:tcPr>
+          <w:p>
+            <w:r/>
+            <w:r>
+              <w:rPr>
+                <w:rFonts w:ascii="Calibri" w:hAnsi="Calibri" w:eastAsia="微软雅黑"/>
+                <w:b w:val="0"/>
+                <w:sz w:val="16"/>
+              </w:rPr>
+              <w:t>0.0375%</w:t>
+            </w:r>
+          </w:p>
+        </w:tc>
+        <w:tc>
+          <w:tcPr>
+            <w:tcW w:type="dxa" w:w="1275"/>
+          </w:tcPr>
+          <w:p>
+            <w:r/>
+            <w:r>
+              <w:rPr>
+                <w:rFonts w:ascii="Calibri" w:hAnsi="Calibri" w:eastAsia="微软雅黑"/>
+                <w:b w:val="0"/>
+                <w:sz w:val="16"/>
+              </w:rPr>
+              <w:t>0</w:t>
+            </w:r>
+          </w:p>
+        </w:tc>
+        <w:tc>
+          <w:tcPr>
+            <w:tcW w:type="dxa" w:w="1275"/>
+          </w:tcPr>
+          <w:p>
+            <w:r/>
+            <w:r>
+              <w:rPr>
+                <w:rFonts w:ascii="Calibri" w:hAnsi="Calibri" w:eastAsia="微软雅黑"/>
+                <w:b w:val="0"/>
+                <w:sz w:val="16"/>
+              </w:rPr>
+              <w:t>0.0000%</w:t>
+            </w:r>
+          </w:p>
+        </w:tc>
+        <w:tc>
+          <w:tcPr>
+            <w:tcW w:type="dxa" w:w="1275"/>
+          </w:tcPr>
+          <w:p>
+            <w:r/>
+            <w:r>
+              <w:rPr>
+                <w:rFonts w:ascii="Calibri" w:hAnsi="Calibri" w:eastAsia="微软雅黑"/>
+                <w:b w:val="0"/>
+                <w:sz w:val="16"/>
+              </w:rPr>
+              <w:t>0.0000%</w:t>
+            </w:r>
+          </w:p>
+        </w:tc>
+      </w:tr>
+      <w:tr>
+        <w:tc>
+          <w:tcPr>
+            <w:tcW w:type="dxa" w:w="1275"/>
+          </w:tcPr>
+          <w:p>
+            <w:r/>
+            <w:r>
+              <w:rPr>
+                <w:rFonts w:ascii="Calibri" w:hAnsi="Calibri" w:eastAsia="微软雅黑"/>
+                <w:b w:val="0"/>
+                <w:sz w:val="16"/>
+              </w:rPr>
+              <w:t>70%</w:t>
+            </w:r>
+          </w:p>
+        </w:tc>
+        <w:tc>
+          <w:tcPr>
+            <w:tcW w:type="dxa" w:w="1275"/>
+          </w:tcPr>
+          <w:p>
+            <w:r/>
+            <w:r>
+              <w:rPr>
+                <w:rFonts w:ascii="Calibri" w:hAnsi="Calibri" w:eastAsia="微软雅黑"/>
+                <w:b w:val="0"/>
+                <w:sz w:val="16"/>
+              </w:rPr>
+              <w:t>11,744,051</w:t>
+            </w:r>
+          </w:p>
+        </w:tc>
+        <w:tc>
+          <w:tcPr>
+            <w:tcW w:type="dxa" w:w="1275"/>
+          </w:tcPr>
+          <w:p>
+            <w:r/>
+            <w:r>
+              <w:rPr>
+                <w:rFonts w:ascii="Calibri" w:hAnsi="Calibri" w:eastAsia="微软雅黑"/>
+                <w:b w:val="0"/>
+                <w:sz w:val="16"/>
+              </w:rPr>
+              <w:t>14,970</w:t>
+            </w:r>
+          </w:p>
+        </w:tc>
+        <w:tc>
+          <w:tcPr>
+            <w:tcW w:type="dxa" w:w="1275"/>
+          </w:tcPr>
+          <w:p>
+            <w:r/>
+            <w:r>
+              <w:rPr>
+                <w:rFonts w:ascii="Calibri" w:hAnsi="Calibri" w:eastAsia="微软雅黑"/>
+                <w:b w:val="0"/>
+                <w:sz w:val="16"/>
+              </w:rPr>
+              <w:t>0.1275%</w:t>
+            </w:r>
+          </w:p>
+        </w:tc>
+        <w:tc>
+          <w:tcPr>
+            <w:tcW w:type="dxa" w:w="1275"/>
+          </w:tcPr>
+          <w:p>
+            <w:r/>
+            <w:r>
+              <w:rPr>
+                <w:rFonts w:ascii="Calibri" w:hAnsi="Calibri" w:eastAsia="微软雅黑"/>
+                <w:b w:val="0"/>
+                <w:sz w:val="16"/>
+              </w:rPr>
+              <w:t>0.1265%</w:t>
+            </w:r>
+          </w:p>
+        </w:tc>
+        <w:tc>
+          <w:tcPr>
+            <w:tcW w:type="dxa" w:w="1275"/>
+          </w:tcPr>
+          <w:p>
+            <w:r/>
+            <w:r>
+              <w:rPr>
+                <w:rFonts w:ascii="Calibri" w:hAnsi="Calibri" w:eastAsia="微软雅黑"/>
+                <w:b w:val="0"/>
+                <w:sz w:val="16"/>
+              </w:rPr>
+              <w:t>0</w:t>
+            </w:r>
+          </w:p>
+        </w:tc>
+        <w:tc>
+          <w:tcPr>
+            <w:tcW w:type="dxa" w:w="1275"/>
+          </w:tcPr>
+          <w:p>
+            <w:r/>
+            <w:r>
+              <w:rPr>
+                <w:rFonts w:ascii="Calibri" w:hAnsi="Calibri" w:eastAsia="微软雅黑"/>
+                <w:b w:val="0"/>
+                <w:sz w:val="16"/>
+              </w:rPr>
+              <w:t>0.0000%</w:t>
+            </w:r>
+          </w:p>
+        </w:tc>
+        <w:tc>
+          <w:tcPr>
+            <w:tcW w:type="dxa" w:w="1275"/>
+          </w:tcPr>
+          <w:p>
+            <w:r/>
+            <w:r>
+              <w:rPr>
+                <w:rFonts w:ascii="Calibri" w:hAnsi="Calibri" w:eastAsia="微软雅黑"/>
+                <w:b w:val="0"/>
+                <w:sz w:val="16"/>
+              </w:rPr>
+              <w:t>0.0000%</w:t>
+            </w:r>
+          </w:p>
+        </w:tc>
+      </w:tr>
+      <w:tr>
+        <w:tc>
+          <w:tcPr>
+            <w:tcW w:type="dxa" w:w="1275"/>
+          </w:tcPr>
+          <w:p>
+            <w:r/>
+            <w:r>
+              <w:rPr>
+                <w:rFonts w:ascii="Calibri" w:hAnsi="Calibri" w:eastAsia="微软雅黑"/>
+                <w:b w:val="0"/>
+                <w:sz w:val="16"/>
+              </w:rPr>
+              <w:t>90%</w:t>
+            </w:r>
+          </w:p>
+        </w:tc>
+        <w:tc>
+          <w:tcPr>
+            <w:tcW w:type="dxa" w:w="1275"/>
+          </w:tcPr>
+          <w:p>
+            <w:r/>
+            <w:r>
+              <w:rPr>
+                <w:rFonts w:ascii="Calibri" w:hAnsi="Calibri" w:eastAsia="微软雅黑"/>
+                <w:b w:val="0"/>
+                <w:sz w:val="16"/>
+              </w:rPr>
+              <w:t>15,099,494</w:t>
+            </w:r>
+          </w:p>
+        </w:tc>
+        <w:tc>
+          <w:tcPr>
+            <w:tcW w:type="dxa" w:w="1275"/>
+          </w:tcPr>
+          <w:p>
+            <w:r/>
+            <w:r>
+              <w:rPr>
+                <w:rFonts w:ascii="Calibri" w:hAnsi="Calibri" w:eastAsia="微软雅黑"/>
+                <w:b w:val="0"/>
+                <w:sz w:val="16"/>
+              </w:rPr>
+              <w:t>46,369</w:t>
+            </w:r>
+          </w:p>
+        </w:tc>
+        <w:tc>
+          <w:tcPr>
+            <w:tcW w:type="dxa" w:w="1275"/>
+          </w:tcPr>
+          <w:p>
+            <w:r/>
+            <w:r>
+              <w:rPr>
+                <w:rFonts w:ascii="Calibri" w:hAnsi="Calibri" w:eastAsia="微软雅黑"/>
+                <w:b w:val="0"/>
+                <w:sz w:val="16"/>
+              </w:rPr>
+              <w:t>0.3071%</w:t>
+            </w:r>
+          </w:p>
+        </w:tc>
+        <w:tc>
+          <w:tcPr>
+            <w:tcW w:type="dxa" w:w="1275"/>
+          </w:tcPr>
+          <w:p>
+            <w:r/>
+            <w:r>
+              <w:rPr>
+                <w:rFonts w:ascii="Calibri" w:hAnsi="Calibri" w:eastAsia="微软雅黑"/>
+                <w:b w:val="0"/>
+                <w:sz w:val="16"/>
+              </w:rPr>
+              <w:t>0.3040%</w:t>
+            </w:r>
+          </w:p>
+        </w:tc>
+        <w:tc>
+          <w:tcPr>
+            <w:tcW w:type="dxa" w:w="1275"/>
+          </w:tcPr>
+          <w:p>
+            <w:r/>
+            <w:r>
+              <w:rPr>
+                <w:rFonts w:ascii="Calibri" w:hAnsi="Calibri" w:eastAsia="微软雅黑"/>
+                <w:b w:val="0"/>
+                <w:sz w:val="16"/>
+              </w:rPr>
+              <w:t>0</w:t>
+            </w:r>
+          </w:p>
+        </w:tc>
+        <w:tc>
+          <w:tcPr>
+            <w:tcW w:type="dxa" w:w="1275"/>
+          </w:tcPr>
+          <w:p>
+            <w:r/>
+            <w:r>
+              <w:rPr>
+                <w:rFonts w:ascii="Calibri" w:hAnsi="Calibri" w:eastAsia="微软雅黑"/>
+                <w:b w:val="0"/>
+                <w:sz w:val="16"/>
+              </w:rPr>
+              <w:t>0.0000%</w:t>
+            </w:r>
+          </w:p>
+        </w:tc>
+        <w:tc>
+          <w:tcPr>
+            <w:tcW w:type="dxa" w:w="1275"/>
+          </w:tcPr>
+          <w:p>
+            <w:r/>
+            <w:r>
+              <w:rPr>
+                <w:rFonts w:ascii="Calibri" w:hAnsi="Calibri" w:eastAsia="微软雅黑"/>
+                <w:b w:val="0"/>
+                <w:sz w:val="16"/>
+              </w:rPr>
+              <w:t>0.0000%</w:t>
+            </w:r>
+          </w:p>
+        </w:tc>
+      </w:tr>
+      <w:tr>
+        <w:tc>
+          <w:tcPr>
+            <w:tcW w:type="dxa" w:w="1275"/>
+          </w:tcPr>
+          <w:p>
+            <w:r/>
+            <w:r>
+              <w:rPr>
+                <w:rFonts w:ascii="Calibri" w:hAnsi="Calibri" w:eastAsia="微软雅黑"/>
+                <w:b w:val="0"/>
+                <w:sz w:val="16"/>
+              </w:rPr>
+              <w:t>100%</w:t>
+            </w:r>
+          </w:p>
+        </w:tc>
+        <w:tc>
+          <w:tcPr>
+            <w:tcW w:type="dxa" w:w="1275"/>
+          </w:tcPr>
+          <w:p>
+            <w:r/>
+            <w:r>
+              <w:rPr>
+                <w:rFonts w:ascii="Calibri" w:hAnsi="Calibri" w:eastAsia="微软雅黑"/>
+                <w:b w:val="0"/>
+                <w:sz w:val="16"/>
+              </w:rPr>
+              <w:t>16,777,216</w:t>
+            </w:r>
+          </w:p>
+        </w:tc>
+        <w:tc>
+          <w:tcPr>
+            <w:tcW w:type="dxa" w:w="1275"/>
+          </w:tcPr>
+          <w:p>
+            <w:r/>
+            <w:r>
+              <w:rPr>
+                <w:rFonts w:ascii="Calibri" w:hAnsi="Calibri" w:eastAsia="微软雅黑"/>
+                <w:b w:val="0"/>
+                <w:sz w:val="16"/>
+              </w:rPr>
+              <w:t>73,470</w:t>
+            </w:r>
+          </w:p>
+        </w:tc>
+        <w:tc>
+          <w:tcPr>
+            <w:tcW w:type="dxa" w:w="1275"/>
+          </w:tcPr>
+          <w:p>
+            <w:r/>
+            <w:r>
+              <w:rPr>
+                <w:rFonts w:ascii="Calibri" w:hAnsi="Calibri" w:eastAsia="微软雅黑"/>
+                <w:b w:val="0"/>
+                <w:sz w:val="16"/>
+              </w:rPr>
+              <w:t>0.4379%</w:t>
+            </w:r>
+          </w:p>
+        </w:tc>
+        <w:tc>
+          <w:tcPr>
+            <w:tcW w:type="dxa" w:w="1275"/>
+          </w:tcPr>
+          <w:p>
+            <w:r/>
+            <w:r>
+              <w:rPr>
+                <w:rFonts w:ascii="Calibri" w:hAnsi="Calibri" w:eastAsia="微软雅黑"/>
+                <w:b w:val="0"/>
+                <w:sz w:val="16"/>
+              </w:rPr>
+              <w:t>0.4349%</w:t>
+            </w:r>
+          </w:p>
+        </w:tc>
+        <w:tc>
+          <w:tcPr>
+            <w:tcW w:type="dxa" w:w="1275"/>
+          </w:tcPr>
+          <w:p>
+            <w:r/>
+            <w:r>
+              <w:rPr>
+                <w:rFonts w:ascii="Calibri" w:hAnsi="Calibri" w:eastAsia="微软雅黑"/>
+                <w:b w:val="0"/>
+                <w:sz w:val="16"/>
+              </w:rPr>
+              <w:t>0</w:t>
+            </w:r>
+          </w:p>
+        </w:tc>
+        <w:tc>
+          <w:tcPr>
+            <w:tcW w:type="dxa" w:w="1275"/>
+          </w:tcPr>
+          <w:p>
+            <w:r/>
+            <w:r>
+              <w:rPr>
+                <w:rFonts w:ascii="Calibri" w:hAnsi="Calibri" w:eastAsia="微软雅黑"/>
+                <w:b w:val="0"/>
+                <w:sz w:val="16"/>
+              </w:rPr>
+              <w:t>0.0000%</w:t>
+            </w:r>
+          </w:p>
+        </w:tc>
+        <w:tc>
+          <w:tcPr>
+            <w:tcW w:type="dxa" w:w="1275"/>
+          </w:tcPr>
+          <w:p>
+            <w:r/>
+            <w:r>
+              <w:rPr>
+                <w:rFonts w:ascii="Calibri" w:hAnsi="Calibri" w:eastAsia="微软雅黑"/>
+                <w:b w:val="0"/>
+                <w:sz w:val="16"/>
+              </w:rPr>
+              <w:t>0.0000%</w:t>
+            </w:r>
+          </w:p>
+        </w:tc>
+      </w:tr>
+    </w:tbl>
+    <w:p/>
+    <w:p>
+      <w:pPr>
+        <w:spacing w:after="120" w:before="0" w:line="276" w:lineRule="auto"/>
+      </w:pPr>
+      <w:r>
+        <w:rPr>
+          <w:rFonts w:ascii="Calibri" w:hAnsi="Calibri" w:eastAsia="微软雅黑"/>
+          <w:b w:val="0"/>
+          <w:sz w:val="18"/>
+        </w:rPr>
+        <w:t>表 2  均匀哈希、驱动几何。冲突表溢出率等于插入失败率。</w:t>
+      </w:r>
+    </w:p>
+    <w:p>
+      <w:pPr>
+        <w:jc w:val="center"/>
+      </w:pPr>
+      <w:r>
+        <w:drawing>
+          <wp:inline xmlns:a="http://schemas.openxmlformats.org/drawingml/2006/main" xmlns:pic="http://schemas.openxmlformats.org/drawingml/2006/picture">
+            <wp:extent cx="5806440" cy="2272085"/>
+            <wp:docPr id="14" name="Picture 14"/>
+            <wp:cNvGraphicFramePr>
+              <a:graphicFrameLocks noChangeAspect="1"/>
+            </wp:cNvGraphicFramePr>
+            <a:graphic>
+              <a:graphicData uri="http://schemas.openxmlformats.org/drawingml/2006/picture">
+                <pic:pic>
+                  <pic:nvPicPr>
+                    <pic:cNvPr id="0" name="14_load_overflow.png"/>
+                    <pic:cNvPicPr/>
+                  </pic:nvPicPr>
+                  <pic:blipFill>
+                    <a:blip r:embed="rId22"/>
+                    <a:stretch>
+                      <a:fillRect/>
+                    </a:stretch>
+                  </pic:blipFill>
+                  <pic:spPr>
+                    <a:xfrm>
+                      <a:off x="0" y="0"/>
+                      <a:ext cx="5806440" cy="2272085"/>
+                    </a:xfrm>
+                    <a:prstGeom prst="rect"/>
+                  </pic:spPr>
+                </pic:pic>
+              </a:graphicData>
+            </a:graphic>
+          </wp:inline>
+        </w:drawing>
+      </w:r>
+    </w:p>
+    <w:p>
+      <w:pPr>
+        <w:spacing w:after="240"/>
+        <w:jc w:val="center"/>
+      </w:pPr>
+      <w:r>
+        <w:rPr>
+          <w:rFonts w:ascii="Calibri" w:hAnsi="Calibri" w:eastAsia="微软雅黑"/>
+          <w:b w:val="0"/>
+          <w:color w:val="3C4650"/>
+          <w:sz w:val="18"/>
+        </w:rPr>
+        <w:t>图 14  五档负载下的主表溢出率和冲突表溢出率</w:t>
+      </w:r>
+    </w:p>
+    <w:p>
+      <w:pPr>
+        <w:jc w:val="center"/>
+      </w:pPr>
+      <w:r>
+        <w:drawing>
+          <wp:inline xmlns:a="http://schemas.openxmlformats.org/drawingml/2006/main" xmlns:pic="http://schemas.openxmlformats.org/drawingml/2006/picture">
+            <wp:extent cx="5806440" cy="3210620"/>
+            <wp:docPr id="15" name="Picture 15"/>
+            <wp:cNvGraphicFramePr>
+              <a:graphicFrameLocks noChangeAspect="1"/>
+            </wp:cNvGraphicFramePr>
+            <a:graphic>
+              <a:graphicData uri="http://schemas.openxmlformats.org/drawingml/2006/picture">
+                <pic:pic>
+                  <pic:nvPicPr>
+                    <pic:cNvPr id="0" name="15_main_row_depth.png"/>
+                    <pic:cNvPicPr/>
+                  </pic:nvPicPr>
+                  <pic:blipFill>
+                    <a:blip r:embed="rId23"/>
+                    <a:stretch>
+                      <a:fillRect/>
+                    </a:stretch>
+                  </pic:blipFill>
+                  <pic:spPr>
+                    <a:xfrm>
+                      <a:off x="0" y="0"/>
+                      <a:ext cx="5806440" cy="3210620"/>
+                    </a:xfrm>
+                    <a:prstGeom prst="rect"/>
+                  </pic:spPr>
+                </pic:pic>
+              </a:graphicData>
+            </a:graphic>
+          </wp:inline>
+        </w:drawing>
+      </w:r>
+    </w:p>
+    <w:p>
+      <w:pPr>
+        <w:spacing w:after="240"/>
+        <w:jc w:val="center"/>
+      </w:pPr>
+      <w:r>
+        <w:rPr>
+          <w:rFonts w:ascii="Calibri" w:hAnsi="Calibri" w:eastAsia="微软雅黑"/>
+          <w:b w:val="0"/>
+          <w:color w:val="3C4650"/>
+          <w:sz w:val="18"/>
+        </w:rPr>
+        <w:t>图 15  主表每行已占用的 STE 数。深度只有 0 到 4</w:t>
+      </w:r>
+    </w:p>
+    <w:p>
+      <w:pPr>
+        <w:jc w:val="center"/>
+      </w:pPr>
+      <w:r>
+        <w:drawing>
+          <wp:inline xmlns:a="http://schemas.openxmlformats.org/drawingml/2006/main" xmlns:pic="http://schemas.openxmlformats.org/drawingml/2006/picture">
+            <wp:extent cx="5806440" cy="2998931"/>
+            <wp:docPr id="16" name="Picture 16"/>
+            <wp:cNvGraphicFramePr>
+              <a:graphicFrameLocks noChangeAspect="1"/>
+            </wp:cNvGraphicFramePr>
+            <a:graphic>
+              <a:graphicData uri="http://schemas.openxmlformats.org/drawingml/2006/picture">
+                <pic:pic>
+                  <pic:nvPicPr>
+                    <pic:cNvPr id="0" name="16_col_row_depth.png"/>
+                    <pic:cNvPicPr/>
+                  </pic:nvPicPr>
+                  <pic:blipFill>
+                    <a:blip r:embed="rId24"/>
+                    <a:stretch>
+                      <a:fillRect/>
+                    </a:stretch>
+                  </pic:blipFill>
+                  <pic:spPr>
+                    <a:xfrm>
+                      <a:off x="0" y="0"/>
+                      <a:ext cx="5806440" cy="2998931"/>
+                    </a:xfrm>
+                    <a:prstGeom prst="rect"/>
+                  </pic:spPr>
+                </pic:pic>
+              </a:graphicData>
+            </a:graphic>
+          </wp:inline>
+        </w:drawing>
+      </w:r>
+    </w:p>
+    <w:p>
+      <w:pPr>
+        <w:spacing w:after="240"/>
+        <w:jc w:val="center"/>
+      </w:pPr>
+      <w:r>
+        <w:rPr>
+          <w:rFonts w:ascii="Calibri" w:hAnsi="Calibri" w:eastAsia="微软雅黑"/>
+          <w:b w:val="0"/>
+          <w:color w:val="3C4650"/>
+          <w:sz w:val="18"/>
+        </w:rPr>
+        <w:t>图 16  冲突表每行已占用的 STE 数。空行占绝大多数，纵轴用对数</w:t>
+      </w:r>
+    </w:p>
+    <w:p>
+      <w:pPr>
+        <w:spacing w:after="120" w:before="0" w:line="276" w:lineRule="auto"/>
+      </w:pPr>
+      <w:r>
+        <w:rPr>
+          <w:rFonts w:ascii="Calibri" w:hAnsi="Calibri" w:eastAsia="微软雅黑"/>
+          <w:b w:val="0"/>
+          <w:sz w:val="22"/>
+        </w:rPr>
+        <w:t>主表溢出从 25% 负载的 124 条（0.0030%，公式 0.0028%）增到 100% 负载的 73,470 条（0.4379%，公式 0.4349%）。五档的冲突表溢出条数都是 0，插入失败率是 0。25% 这一档期望溢出只有一百条出头，仿真比公式多几条，相对误差会显得大一些；50% 以上相对误差回到 2% 以内。</w:t>
+      </w:r>
+    </w:p>
+    <w:p>
+      <w:pPr>
+        <w:spacing w:after="120" w:before="0" w:line="276" w:lineRule="auto"/>
+      </w:pPr>
+      <w:r>
+        <w:rPr>
+          <w:rFonts w:ascii="Calibri" w:hAnsi="Calibri" w:eastAsia="微软雅黑"/>
+          <w:b w:val="0"/>
+          <w:sz w:val="22"/>
+        </w:rPr>
+        <w:t>主表深度是这一行里实际写下的 STE 个数，到达数超过 4 的行记为深度 4，多出来的 key 记在冲突表上。100% 负载时主表深度分布是：0 占 36.78%，1 占 36.80%，2 占 18.39%，3 占 6.13%，4 占 1.90%，与 λ = 1 的 Poisson 在 0 到 3 的概率以及 P(X ≥ 4) 对齐。冲突表同一负载下 86.92% 的行深度为 0，12.19% 为 1，0.85% 为 2，最深只到 4。深度 5 到 16 的行数是 0，所以 16 个槽的上限没有被碰到，失败率保持为 0。</w:t>
+      </w:r>
+    </w:p>
+    <w:p>
+      <w:pPr>
         <w:pStyle w:val="Heading1"/>
       </w:pPr>
       <w:r>
@@ -4200,7 +5255,7 @@
           <w:b w:val="0"/>
           <w:sz w:val="22"/>
         </w:rPr>
-        <w:t>仿真输出在 sim/out/summary.csv 与 hist.csv。各次运行的墙钟时间在 0.5 秒到 8 秒之间，包含插入和全量查找，只说明这个用户态模型在单线程下的速度。</w:t>
+        <w:t>仿真输出在 sim/out/summary.csv、hist.csv 和 depth.csv。depth.csv 是主表和冲突表每一档占用深度的行数。各次运行的墙钟时间在 0.5 秒到 8 秒之间，包含插入和全量查找，只说明这个用户态模型在单线程下的速度。</w:t>
       </w:r>
     </w:p>
     <w:sectPr>

</xml_diff>

<commit_message>
hws-analysis: add the 2^22-row comparison to the report
Section 7.4 puts overflow, insertion failure, and per-row depth for
the tight table next to the driver 2^24-row numbers.

Co-authored-by: zsdaka <zsdaka@users.noreply.github.com>
</commit_message>
<xml_diff>
--- a/mlx5-hws-analysis/mlx5-hws-model.docx
+++ b/mlx5-hws-analysis/mlx5-hws-model.docx
@@ -5154,6 +5154,1102 @@
     </w:p>
     <w:p>
       <w:pPr>
+        <w:pStyle w:val="Heading2"/>
+      </w:pPr>
+      <w:r>
+        <w:rPr>
+          <w:rFonts w:ascii="Calibri" w:hAnsi="Calibri" w:eastAsia="微软雅黑"/>
+          <w:b/>
+          <w:color w:val="1B3A4B"/>
+          <w:sz w:val="30"/>
+        </w:rPr>
+        <w:t>7.4  2^22 行的对照</w:t>
+      </w:r>
+    </w:p>
+    <w:p>
+      <w:pPr>
+        <w:spacing w:after="120" w:before="0" w:line="276" w:lineRule="auto"/>
+      </w:pPr>
+      <w:r>
+        <w:rPr>
+          <w:rFonts w:ascii="Calibri" w:hAnsi="Calibri" w:eastAsia="微软雅黑"/>
+          <w:b w:val="0"/>
+          <w:sz w:val="22"/>
+        </w:rPr>
+        <w:t>对照表把主表收成 2^22 行、每行仍是 4 个槽，冲突表按同样的规则减 5，得到 2^17 行、每行 16 个槽。五档使用和上一节相同的 key 条数，负载仍按 n / 2^24 标注。100% 就是把 2^24 条 key 放进 2^22 行，平均每行 4 条，槽位总数等于 key 数。这是实验 D-tight 的同一张表，这里把它补到 25%、50%、70%、90%、100% 五档，并给出每行深度。</w:t>
+      </w:r>
+    </w:p>
+    <w:tbl>
+      <w:tblPr>
+        <w:tblStyle w:val="TableGrid"/>
+        <w:tblW w:type="auto" w:w="0"/>
+        <w:tblLook w:firstColumn="1" w:firstRow="1" w:lastColumn="0" w:lastRow="0" w:noHBand="0" w:noVBand="1" w:val="04A0"/>
+      </w:tblPr>
+      <w:tblGrid>
+        <w:gridCol w:w="1275"/>
+        <w:gridCol w:w="1275"/>
+        <w:gridCol w:w="1275"/>
+        <w:gridCol w:w="1275"/>
+        <w:gridCol w:w="1275"/>
+        <w:gridCol w:w="1275"/>
+        <w:gridCol w:w="1275"/>
+        <w:gridCol w:w="1275"/>
+      </w:tblGrid>
+      <w:tr>
+        <w:tc>
+          <w:tcPr>
+            <w:tcW w:type="dxa" w:w="1275"/>
+            <w:shd w:fill="1B3A4B" w:val="clear"/>
+          </w:tcPr>
+          <w:p>
+            <w:r/>
+            <w:r>
+              <w:rPr>
+                <w:rFonts w:ascii="Calibri" w:hAnsi="Calibri" w:eastAsia="微软雅黑"/>
+                <w:b/>
+                <w:color w:val="FFFFFF"/>
+                <w:sz w:val="18"/>
+              </w:rPr>
+              <w:t>负载</w:t>
+            </w:r>
+          </w:p>
+        </w:tc>
+        <w:tc>
+          <w:tcPr>
+            <w:tcW w:type="dxa" w:w="1275"/>
+            <w:shd w:fill="1B3A4B" w:val="clear"/>
+          </w:tcPr>
+          <w:p>
+            <w:r/>
+            <w:r>
+              <w:rPr>
+                <w:rFonts w:ascii="Calibri" w:hAnsi="Calibri" w:eastAsia="微软雅黑"/>
+                <w:b/>
+                <w:color w:val="FFFFFF"/>
+                <w:sz w:val="18"/>
+              </w:rPr>
+              <w:t>插入条数</w:t>
+            </w:r>
+          </w:p>
+        </w:tc>
+        <w:tc>
+          <w:tcPr>
+            <w:tcW w:type="dxa" w:w="1275"/>
+            <w:shd w:fill="1B3A4B" w:val="clear"/>
+          </w:tcPr>
+          <w:p>
+            <w:r/>
+            <w:r>
+              <w:rPr>
+                <w:rFonts w:ascii="Calibri" w:hAnsi="Calibri" w:eastAsia="微软雅黑"/>
+                <w:b/>
+                <w:color w:val="FFFFFF"/>
+                <w:sz w:val="18"/>
+              </w:rPr>
+              <w:t>2^24 主表溢出</w:t>
+            </w:r>
+          </w:p>
+        </w:tc>
+        <w:tc>
+          <w:tcPr>
+            <w:tcW w:type="dxa" w:w="1275"/>
+            <w:shd w:fill="1B3A4B" w:val="clear"/>
+          </w:tcPr>
+          <w:p>
+            <w:r/>
+            <w:r>
+              <w:rPr>
+                <w:rFonts w:ascii="Calibri" w:hAnsi="Calibri" w:eastAsia="微软雅黑"/>
+                <w:b/>
+                <w:color w:val="FFFFFF"/>
+                <w:sz w:val="18"/>
+              </w:rPr>
+              <w:t>2^22 主表溢出</w:t>
+            </w:r>
+          </w:p>
+        </w:tc>
+        <w:tc>
+          <w:tcPr>
+            <w:tcW w:type="dxa" w:w="1275"/>
+            <w:shd w:fill="1B3A4B" w:val="clear"/>
+          </w:tcPr>
+          <w:p>
+            <w:r/>
+            <w:r>
+              <w:rPr>
+                <w:rFonts w:ascii="Calibri" w:hAnsi="Calibri" w:eastAsia="微软雅黑"/>
+                <w:b/>
+                <w:color w:val="FFFFFF"/>
+                <w:sz w:val="18"/>
+              </w:rPr>
+              <w:t>2^22 溢出公式</w:t>
+            </w:r>
+          </w:p>
+        </w:tc>
+        <w:tc>
+          <w:tcPr>
+            <w:tcW w:type="dxa" w:w="1275"/>
+            <w:shd w:fill="1B3A4B" w:val="clear"/>
+          </w:tcPr>
+          <w:p>
+            <w:r/>
+            <w:r>
+              <w:rPr>
+                <w:rFonts w:ascii="Calibri" w:hAnsi="Calibri" w:eastAsia="微软雅黑"/>
+                <w:b/>
+                <w:color w:val="FFFFFF"/>
+                <w:sz w:val="18"/>
+              </w:rPr>
+              <w:t>2^24 失败率</w:t>
+            </w:r>
+          </w:p>
+        </w:tc>
+        <w:tc>
+          <w:tcPr>
+            <w:tcW w:type="dxa" w:w="1275"/>
+            <w:shd w:fill="1B3A4B" w:val="clear"/>
+          </w:tcPr>
+          <w:p>
+            <w:r/>
+            <w:r>
+              <w:rPr>
+                <w:rFonts w:ascii="Calibri" w:hAnsi="Calibri" w:eastAsia="微软雅黑"/>
+                <w:b/>
+                <w:color w:val="FFFFFF"/>
+                <w:sz w:val="18"/>
+              </w:rPr>
+              <w:t>2^22 失败率</w:t>
+            </w:r>
+          </w:p>
+        </w:tc>
+        <w:tc>
+          <w:tcPr>
+            <w:tcW w:type="dxa" w:w="1275"/>
+            <w:shd w:fill="1B3A4B" w:val="clear"/>
+          </w:tcPr>
+          <w:p>
+            <w:r/>
+            <w:r>
+              <w:rPr>
+                <w:rFonts w:ascii="Calibri" w:hAnsi="Calibri" w:eastAsia="微软雅黑"/>
+                <w:b/>
+                <w:color w:val="FFFFFF"/>
+                <w:sz w:val="18"/>
+              </w:rPr>
+              <w:t>2^22 失败公式</w:t>
+            </w:r>
+          </w:p>
+        </w:tc>
+      </w:tr>
+      <w:tr>
+        <w:tc>
+          <w:tcPr>
+            <w:tcW w:type="dxa" w:w="1275"/>
+          </w:tcPr>
+          <w:p>
+            <w:r/>
+            <w:r>
+              <w:rPr>
+                <w:rFonts w:ascii="Calibri" w:hAnsi="Calibri" w:eastAsia="微软雅黑"/>
+                <w:b w:val="0"/>
+                <w:sz w:val="16"/>
+              </w:rPr>
+              <w:t>25%</w:t>
+            </w:r>
+          </w:p>
+        </w:tc>
+        <w:tc>
+          <w:tcPr>
+            <w:tcW w:type="dxa" w:w="1275"/>
+          </w:tcPr>
+          <w:p>
+            <w:r/>
+            <w:r>
+              <w:rPr>
+                <w:rFonts w:ascii="Calibri" w:hAnsi="Calibri" w:eastAsia="微软雅黑"/>
+                <w:b w:val="0"/>
+                <w:sz w:val="16"/>
+              </w:rPr>
+              <w:t>4,194,304</w:t>
+            </w:r>
+          </w:p>
+        </w:tc>
+        <w:tc>
+          <w:tcPr>
+            <w:tcW w:type="dxa" w:w="1275"/>
+          </w:tcPr>
+          <w:p>
+            <w:r/>
+            <w:r>
+              <w:rPr>
+                <w:rFonts w:ascii="Calibri" w:hAnsi="Calibri" w:eastAsia="微软雅黑"/>
+                <w:b w:val="0"/>
+                <w:sz w:val="16"/>
+              </w:rPr>
+              <w:t>0.0030%</w:t>
+            </w:r>
+          </w:p>
+        </w:tc>
+        <w:tc>
+          <w:tcPr>
+            <w:tcW w:type="dxa" w:w="1275"/>
+          </w:tcPr>
+          <w:p>
+            <w:r/>
+            <w:r>
+              <w:rPr>
+                <w:rFonts w:ascii="Calibri" w:hAnsi="Calibri" w:eastAsia="微软雅黑"/>
+                <w:b w:val="0"/>
+                <w:sz w:val="16"/>
+              </w:rPr>
+              <w:t>0.4310%</w:t>
+            </w:r>
+          </w:p>
+        </w:tc>
+        <w:tc>
+          <w:tcPr>
+            <w:tcW w:type="dxa" w:w="1275"/>
+          </w:tcPr>
+          <w:p>
+            <w:r/>
+            <w:r>
+              <w:rPr>
+                <w:rFonts w:ascii="Calibri" w:hAnsi="Calibri" w:eastAsia="微软雅黑"/>
+                <w:b w:val="0"/>
+                <w:sz w:val="16"/>
+              </w:rPr>
+              <w:t>0.4349%</w:t>
+            </w:r>
+          </w:p>
+        </w:tc>
+        <w:tc>
+          <w:tcPr>
+            <w:tcW w:type="dxa" w:w="1275"/>
+          </w:tcPr>
+          <w:p>
+            <w:r/>
+            <w:r>
+              <w:rPr>
+                <w:rFonts w:ascii="Calibri" w:hAnsi="Calibri" w:eastAsia="微软雅黑"/>
+                <w:b w:val="0"/>
+                <w:sz w:val="16"/>
+              </w:rPr>
+              <w:t>0.0000%</w:t>
+            </w:r>
+          </w:p>
+        </w:tc>
+        <w:tc>
+          <w:tcPr>
+            <w:tcW w:type="dxa" w:w="1275"/>
+          </w:tcPr>
+          <w:p>
+            <w:r/>
+            <w:r>
+              <w:rPr>
+                <w:rFonts w:ascii="Calibri" w:hAnsi="Calibri" w:eastAsia="微软雅黑"/>
+                <w:b w:val="0"/>
+                <w:sz w:val="16"/>
+              </w:rPr>
+              <w:t>0.0000%</w:t>
+            </w:r>
+          </w:p>
+        </w:tc>
+        <w:tc>
+          <w:tcPr>
+            <w:tcW w:type="dxa" w:w="1275"/>
+          </w:tcPr>
+          <w:p>
+            <w:r/>
+            <w:r>
+              <w:rPr>
+                <w:rFonts w:ascii="Calibri" w:hAnsi="Calibri" w:eastAsia="微软雅黑"/>
+                <w:b w:val="0"/>
+                <w:sz w:val="16"/>
+              </w:rPr>
+              <w:t>0.0000%</w:t>
+            </w:r>
+          </w:p>
+        </w:tc>
+      </w:tr>
+      <w:tr>
+        <w:tc>
+          <w:tcPr>
+            <w:tcW w:type="dxa" w:w="1275"/>
+          </w:tcPr>
+          <w:p>
+            <w:r/>
+            <w:r>
+              <w:rPr>
+                <w:rFonts w:ascii="Calibri" w:hAnsi="Calibri" w:eastAsia="微软雅黑"/>
+                <w:b w:val="0"/>
+                <w:sz w:val="16"/>
+              </w:rPr>
+              <w:t>50%</w:t>
+            </w:r>
+          </w:p>
+        </w:tc>
+        <w:tc>
+          <w:tcPr>
+            <w:tcW w:type="dxa" w:w="1275"/>
+          </w:tcPr>
+          <w:p>
+            <w:r/>
+            <w:r>
+              <w:rPr>
+                <w:rFonts w:ascii="Calibri" w:hAnsi="Calibri" w:eastAsia="微软雅黑"/>
+                <w:b w:val="0"/>
+                <w:sz w:val="16"/>
+              </w:rPr>
+              <w:t>8,388,608</w:t>
+            </w:r>
+          </w:p>
+        </w:tc>
+        <w:tc>
+          <w:tcPr>
+            <w:tcW w:type="dxa" w:w="1275"/>
+          </w:tcPr>
+          <w:p>
+            <w:r/>
+            <w:r>
+              <w:rPr>
+                <w:rFonts w:ascii="Calibri" w:hAnsi="Calibri" w:eastAsia="微软雅黑"/>
+                <w:b w:val="0"/>
+                <w:sz w:val="16"/>
+              </w:rPr>
+              <w:t>0.0381%</w:t>
+            </w:r>
+          </w:p>
+        </w:tc>
+        <w:tc>
+          <w:tcPr>
+            <w:tcW w:type="dxa" w:w="1275"/>
+          </w:tcPr>
+          <w:p>
+            <w:r/>
+            <w:r>
+              <w:rPr>
+                <w:rFonts w:ascii="Calibri" w:hAnsi="Calibri" w:eastAsia="微软雅黑"/>
+                <w:b w:val="0"/>
+                <w:sz w:val="16"/>
+              </w:rPr>
+              <w:t>3.7534%</w:t>
+            </w:r>
+          </w:p>
+        </w:tc>
+        <w:tc>
+          <w:tcPr>
+            <w:tcW w:type="dxa" w:w="1275"/>
+          </w:tcPr>
+          <w:p>
+            <w:r/>
+            <w:r>
+              <w:rPr>
+                <w:rFonts w:ascii="Calibri" w:hAnsi="Calibri" w:eastAsia="微软雅黑"/>
+                <w:b w:val="0"/>
+                <w:sz w:val="16"/>
+              </w:rPr>
+              <w:t>3.7571%</w:t>
+            </w:r>
+          </w:p>
+        </w:tc>
+        <w:tc>
+          <w:tcPr>
+            <w:tcW w:type="dxa" w:w="1275"/>
+          </w:tcPr>
+          <w:p>
+            <w:r/>
+            <w:r>
+              <w:rPr>
+                <w:rFonts w:ascii="Calibri" w:hAnsi="Calibri" w:eastAsia="微软雅黑"/>
+                <w:b w:val="0"/>
+                <w:sz w:val="16"/>
+              </w:rPr>
+              <w:t>0.0000%</w:t>
+            </w:r>
+          </w:p>
+        </w:tc>
+        <w:tc>
+          <w:tcPr>
+            <w:tcW w:type="dxa" w:w="1275"/>
+          </w:tcPr>
+          <w:p>
+            <w:r/>
+            <w:r>
+              <w:rPr>
+                <w:rFonts w:ascii="Calibri" w:hAnsi="Calibri" w:eastAsia="微软雅黑"/>
+                <w:b w:val="0"/>
+                <w:sz w:val="16"/>
+              </w:rPr>
+              <w:t>0.0000%</w:t>
+            </w:r>
+          </w:p>
+        </w:tc>
+        <w:tc>
+          <w:tcPr>
+            <w:tcW w:type="dxa" w:w="1275"/>
+          </w:tcPr>
+          <w:p>
+            <w:r/>
+            <w:r>
+              <w:rPr>
+                <w:rFonts w:ascii="Calibri" w:hAnsi="Calibri" w:eastAsia="微软雅黑"/>
+                <w:b w:val="0"/>
+                <w:sz w:val="16"/>
+              </w:rPr>
+              <w:t>0.0000%</w:t>
+            </w:r>
+          </w:p>
+        </w:tc>
+      </w:tr>
+      <w:tr>
+        <w:tc>
+          <w:tcPr>
+            <w:tcW w:type="dxa" w:w="1275"/>
+          </w:tcPr>
+          <w:p>
+            <w:r/>
+            <w:r>
+              <w:rPr>
+                <w:rFonts w:ascii="Calibri" w:hAnsi="Calibri" w:eastAsia="微软雅黑"/>
+                <w:b w:val="0"/>
+                <w:sz w:val="16"/>
+              </w:rPr>
+              <w:t>70%</w:t>
+            </w:r>
+          </w:p>
+        </w:tc>
+        <w:tc>
+          <w:tcPr>
+            <w:tcW w:type="dxa" w:w="1275"/>
+          </w:tcPr>
+          <w:p>
+            <w:r/>
+            <w:r>
+              <w:rPr>
+                <w:rFonts w:ascii="Calibri" w:hAnsi="Calibri" w:eastAsia="微软雅黑"/>
+                <w:b w:val="0"/>
+                <w:sz w:val="16"/>
+              </w:rPr>
+              <w:t>11,744,051</w:t>
+            </w:r>
+          </w:p>
+        </w:tc>
+        <w:tc>
+          <w:tcPr>
+            <w:tcW w:type="dxa" w:w="1275"/>
+          </w:tcPr>
+          <w:p>
+            <w:r/>
+            <w:r>
+              <w:rPr>
+                <w:rFonts w:ascii="Calibri" w:hAnsi="Calibri" w:eastAsia="微软雅黑"/>
+                <w:b w:val="0"/>
+                <w:sz w:val="16"/>
+              </w:rPr>
+              <w:t>0.1275%</w:t>
+            </w:r>
+          </w:p>
+        </w:tc>
+        <w:tc>
+          <w:tcPr>
+            <w:tcW w:type="dxa" w:w="1275"/>
+          </w:tcPr>
+          <w:p>
+            <w:r/>
+            <w:r>
+              <w:rPr>
+                <w:rFonts w:ascii="Calibri" w:hAnsi="Calibri" w:eastAsia="微软雅黑"/>
+                <w:b w:val="0"/>
+                <w:sz w:val="16"/>
+              </w:rPr>
+              <w:t>9.0383%</w:t>
+            </w:r>
+          </w:p>
+        </w:tc>
+        <w:tc>
+          <w:tcPr>
+            <w:tcW w:type="dxa" w:w="1275"/>
+          </w:tcPr>
+          <w:p>
+            <w:r/>
+            <w:r>
+              <w:rPr>
+                <w:rFonts w:ascii="Calibri" w:hAnsi="Calibri" w:eastAsia="微软雅黑"/>
+                <w:b w:val="0"/>
+                <w:sz w:val="16"/>
+              </w:rPr>
+              <w:t>9.0457%</w:t>
+            </w:r>
+          </w:p>
+        </w:tc>
+        <w:tc>
+          <w:tcPr>
+            <w:tcW w:type="dxa" w:w="1275"/>
+          </w:tcPr>
+          <w:p>
+            <w:r/>
+            <w:r>
+              <w:rPr>
+                <w:rFonts w:ascii="Calibri" w:hAnsi="Calibri" w:eastAsia="微软雅黑"/>
+                <w:b w:val="0"/>
+                <w:sz w:val="16"/>
+              </w:rPr>
+              <w:t>0.0000%</w:t>
+            </w:r>
+          </w:p>
+        </w:tc>
+        <w:tc>
+          <w:tcPr>
+            <w:tcW w:type="dxa" w:w="1275"/>
+          </w:tcPr>
+          <w:p>
+            <w:r/>
+            <w:r>
+              <w:rPr>
+                <w:rFonts w:ascii="Calibri" w:hAnsi="Calibri" w:eastAsia="微软雅黑"/>
+                <w:b w:val="0"/>
+                <w:sz w:val="16"/>
+              </w:rPr>
+              <w:t>0.0084%</w:t>
+            </w:r>
+          </w:p>
+        </w:tc>
+        <w:tc>
+          <w:tcPr>
+            <w:tcW w:type="dxa" w:w="1275"/>
+          </w:tcPr>
+          <w:p>
+            <w:r/>
+            <w:r>
+              <w:rPr>
+                <w:rFonts w:ascii="Calibri" w:hAnsi="Calibri" w:eastAsia="微软雅黑"/>
+                <w:b w:val="0"/>
+                <w:sz w:val="16"/>
+              </w:rPr>
+              <w:t>0.0081%</w:t>
+            </w:r>
+          </w:p>
+        </w:tc>
+      </w:tr>
+      <w:tr>
+        <w:tc>
+          <w:tcPr>
+            <w:tcW w:type="dxa" w:w="1275"/>
+          </w:tcPr>
+          <w:p>
+            <w:r/>
+            <w:r>
+              <w:rPr>
+                <w:rFonts w:ascii="Calibri" w:hAnsi="Calibri" w:eastAsia="微软雅黑"/>
+                <w:b w:val="0"/>
+                <w:sz w:val="16"/>
+              </w:rPr>
+              <w:t>90%</w:t>
+            </w:r>
+          </w:p>
+        </w:tc>
+        <w:tc>
+          <w:tcPr>
+            <w:tcW w:type="dxa" w:w="1275"/>
+          </w:tcPr>
+          <w:p>
+            <w:r/>
+            <w:r>
+              <w:rPr>
+                <w:rFonts w:ascii="Calibri" w:hAnsi="Calibri" w:eastAsia="微软雅黑"/>
+                <w:b w:val="0"/>
+                <w:sz w:val="16"/>
+              </w:rPr>
+              <w:t>15,099,494</w:t>
+            </w:r>
+          </w:p>
+        </w:tc>
+        <w:tc>
+          <w:tcPr>
+            <w:tcW w:type="dxa" w:w="1275"/>
+          </w:tcPr>
+          <w:p>
+            <w:r/>
+            <w:r>
+              <w:rPr>
+                <w:rFonts w:ascii="Calibri" w:hAnsi="Calibri" w:eastAsia="微软雅黑"/>
+                <w:b w:val="0"/>
+                <w:sz w:val="16"/>
+              </w:rPr>
+              <w:t>0.3071%</w:t>
+            </w:r>
+          </w:p>
+        </w:tc>
+        <w:tc>
+          <w:tcPr>
+            <w:tcW w:type="dxa" w:w="1275"/>
+          </w:tcPr>
+          <w:p>
+            <w:r/>
+            <w:r>
+              <w:rPr>
+                <w:rFonts w:ascii="Calibri" w:hAnsi="Calibri" w:eastAsia="微软雅黑"/>
+                <w:b w:val="0"/>
+                <w:sz w:val="16"/>
+              </w:rPr>
+              <w:t>15.8611%</w:t>
+            </w:r>
+          </w:p>
+        </w:tc>
+        <w:tc>
+          <w:tcPr>
+            <w:tcW w:type="dxa" w:w="1275"/>
+          </w:tcPr>
+          <w:p>
+            <w:r/>
+            <w:r>
+              <w:rPr>
+                <w:rFonts w:ascii="Calibri" w:hAnsi="Calibri" w:eastAsia="微软雅黑"/>
+                <w:b w:val="0"/>
+                <w:sz w:val="16"/>
+              </w:rPr>
+              <w:t>15.8604%</w:t>
+            </w:r>
+          </w:p>
+        </w:tc>
+        <w:tc>
+          <w:tcPr>
+            <w:tcW w:type="dxa" w:w="1275"/>
+          </w:tcPr>
+          <w:p>
+            <w:r/>
+            <w:r>
+              <w:rPr>
+                <w:rFonts w:ascii="Calibri" w:hAnsi="Calibri" w:eastAsia="微软雅黑"/>
+                <w:b w:val="0"/>
+                <w:sz w:val="16"/>
+              </w:rPr>
+              <w:t>0.0000%</w:t>
+            </w:r>
+          </w:p>
+        </w:tc>
+        <w:tc>
+          <w:tcPr>
+            <w:tcW w:type="dxa" w:w="1275"/>
+          </w:tcPr>
+          <w:p>
+            <w:r/>
+            <w:r>
+              <w:rPr>
+                <w:rFonts w:ascii="Calibri" w:hAnsi="Calibri" w:eastAsia="微软雅黑"/>
+                <w:b w:val="0"/>
+                <w:sz w:val="16"/>
+              </w:rPr>
+              <w:t>2.6347%</w:t>
+            </w:r>
+          </w:p>
+        </w:tc>
+        <w:tc>
+          <w:tcPr>
+            <w:tcW w:type="dxa" w:w="1275"/>
+          </w:tcPr>
+          <w:p>
+            <w:r/>
+            <w:r>
+              <w:rPr>
+                <w:rFonts w:ascii="Calibri" w:hAnsi="Calibri" w:eastAsia="微软雅黑"/>
+                <w:b w:val="0"/>
+                <w:sz w:val="16"/>
+              </w:rPr>
+              <w:t>2.6366%</w:t>
+            </w:r>
+          </w:p>
+        </w:tc>
+      </w:tr>
+      <w:tr>
+        <w:tc>
+          <w:tcPr>
+            <w:tcW w:type="dxa" w:w="1275"/>
+          </w:tcPr>
+          <w:p>
+            <w:r/>
+            <w:r>
+              <w:rPr>
+                <w:rFonts w:ascii="Calibri" w:hAnsi="Calibri" w:eastAsia="微软雅黑"/>
+                <w:b w:val="0"/>
+                <w:sz w:val="16"/>
+              </w:rPr>
+              <w:t>100%</w:t>
+            </w:r>
+          </w:p>
+        </w:tc>
+        <w:tc>
+          <w:tcPr>
+            <w:tcW w:type="dxa" w:w="1275"/>
+          </w:tcPr>
+          <w:p>
+            <w:r/>
+            <w:r>
+              <w:rPr>
+                <w:rFonts w:ascii="Calibri" w:hAnsi="Calibri" w:eastAsia="微软雅黑"/>
+                <w:b w:val="0"/>
+                <w:sz w:val="16"/>
+              </w:rPr>
+              <w:t>16,777,216</w:t>
+            </w:r>
+          </w:p>
+        </w:tc>
+        <w:tc>
+          <w:tcPr>
+            <w:tcW w:type="dxa" w:w="1275"/>
+          </w:tcPr>
+          <w:p>
+            <w:r/>
+            <w:r>
+              <w:rPr>
+                <w:rFonts w:ascii="Calibri" w:hAnsi="Calibri" w:eastAsia="微软雅黑"/>
+                <w:b w:val="0"/>
+                <w:sz w:val="16"/>
+              </w:rPr>
+              <w:t>0.4379%</w:t>
+            </w:r>
+          </w:p>
+        </w:tc>
+        <w:tc>
+          <w:tcPr>
+            <w:tcW w:type="dxa" w:w="1275"/>
+          </w:tcPr>
+          <w:p>
+            <w:r/>
+            <w:r>
+              <w:rPr>
+                <w:rFonts w:ascii="Calibri" w:hAnsi="Calibri" w:eastAsia="微软雅黑"/>
+                <w:b w:val="0"/>
+                <w:sz w:val="16"/>
+              </w:rPr>
+              <w:t>19.5342%</w:t>
+            </w:r>
+          </w:p>
+        </w:tc>
+        <w:tc>
+          <w:tcPr>
+            <w:tcW w:type="dxa" w:w="1275"/>
+          </w:tcPr>
+          <w:p>
+            <w:r/>
+            <w:r>
+              <w:rPr>
+                <w:rFonts w:ascii="Calibri" w:hAnsi="Calibri" w:eastAsia="微软雅黑"/>
+                <w:b w:val="0"/>
+                <w:sz w:val="16"/>
+              </w:rPr>
+              <w:t>19.5367%</w:t>
+            </w:r>
+          </w:p>
+        </w:tc>
+        <w:tc>
+          <w:tcPr>
+            <w:tcW w:type="dxa" w:w="1275"/>
+          </w:tcPr>
+          <w:p>
+            <w:r/>
+            <w:r>
+              <w:rPr>
+                <w:rFonts w:ascii="Calibri" w:hAnsi="Calibri" w:eastAsia="微软雅黑"/>
+                <w:b w:val="0"/>
+                <w:sz w:val="16"/>
+              </w:rPr>
+              <w:t>0.0000%</w:t>
+            </w:r>
+          </w:p>
+        </w:tc>
+        <w:tc>
+          <w:tcPr>
+            <w:tcW w:type="dxa" w:w="1275"/>
+          </w:tcPr>
+          <w:p>
+            <w:r/>
+            <w:r>
+              <w:rPr>
+                <w:rFonts w:ascii="Calibri" w:hAnsi="Calibri" w:eastAsia="微软雅黑"/>
+                <w:b w:val="0"/>
+                <w:sz w:val="16"/>
+              </w:rPr>
+              <w:t>7.0698%</w:t>
+            </w:r>
+          </w:p>
+        </w:tc>
+        <w:tc>
+          <w:tcPr>
+            <w:tcW w:type="dxa" w:w="1275"/>
+          </w:tcPr>
+          <w:p>
+            <w:r/>
+            <w:r>
+              <w:rPr>
+                <w:rFonts w:ascii="Calibri" w:hAnsi="Calibri" w:eastAsia="微软雅黑"/>
+                <w:b w:val="0"/>
+                <w:sz w:val="16"/>
+              </w:rPr>
+              <w:t>7.0730%</w:t>
+            </w:r>
+          </w:p>
+        </w:tc>
+      </w:tr>
+    </w:tbl>
+    <w:p/>
+    <w:p>
+      <w:pPr>
+        <w:spacing w:after="120" w:before="0" w:line="276" w:lineRule="auto"/>
+      </w:pPr>
+      <w:r>
+        <w:rPr>
+          <w:rFonts w:ascii="Calibri" w:hAnsi="Calibri" w:eastAsia="微软雅黑"/>
+          <w:b w:val="0"/>
+          <w:sz w:val="18"/>
+        </w:rPr>
+        <w:t>表 3  同一批均匀 key。2^22 行的失败率就是这张紧凑表的冲突表溢出率。</w:t>
+      </w:r>
+    </w:p>
+    <w:p>
+      <w:pPr>
+        <w:jc w:val="center"/>
+      </w:pPr>
+      <w:r>
+        <w:drawing>
+          <wp:inline xmlns:a="http://schemas.openxmlformats.org/drawingml/2006/main" xmlns:pic="http://schemas.openxmlformats.org/drawingml/2006/picture">
+            <wp:extent cx="5806440" cy="2272085"/>
+            <wp:docPr id="17" name="Picture 17"/>
+            <wp:cNvGraphicFramePr>
+              <a:graphicFrameLocks noChangeAspect="1"/>
+            </wp:cNvGraphicFramePr>
+            <a:graphic>
+              <a:graphicData uri="http://schemas.openxmlformats.org/drawingml/2006/picture">
+                <pic:pic>
+                  <pic:nvPicPr>
+                    <pic:cNvPr id="0" name="17_tight_overflow.png"/>
+                    <pic:cNvPicPr/>
+                  </pic:nvPicPr>
+                  <pic:blipFill>
+                    <a:blip r:embed="rId25"/>
+                    <a:stretch>
+                      <a:fillRect/>
+                    </a:stretch>
+                  </pic:blipFill>
+                  <pic:spPr>
+                    <a:xfrm>
+                      <a:off x="0" y="0"/>
+                      <a:ext cx="5806440" cy="2272085"/>
+                    </a:xfrm>
+                    <a:prstGeom prst="rect"/>
+                  </pic:spPr>
+                </pic:pic>
+              </a:graphicData>
+            </a:graphic>
+          </wp:inline>
+        </w:drawing>
+      </w:r>
+    </w:p>
+    <w:p>
+      <w:pPr>
+        <w:spacing w:after="240"/>
+        <w:jc w:val="center"/>
+      </w:pPr>
+      <w:r>
+        <w:rPr>
+          <w:rFonts w:ascii="Calibri" w:hAnsi="Calibri" w:eastAsia="微软雅黑"/>
+          <w:b w:val="0"/>
+          <w:color w:val="3C4650"/>
+          <w:sz w:val="18"/>
+        </w:rPr>
+        <w:t>图 17  2^22 行主表的溢出率，以及冲突表溢出率（插入失败率）</w:t>
+      </w:r>
+    </w:p>
+    <w:p>
+      <w:pPr>
+        <w:jc w:val="center"/>
+      </w:pPr>
+      <w:r>
+        <w:drawing>
+          <wp:inline xmlns:a="http://schemas.openxmlformats.org/drawingml/2006/main" xmlns:pic="http://schemas.openxmlformats.org/drawingml/2006/picture">
+            <wp:extent cx="5806440" cy="2272085"/>
+            <wp:docPr id="18" name="Picture 18"/>
+            <wp:cNvGraphicFramePr>
+              <a:graphicFrameLocks noChangeAspect="1"/>
+            </wp:cNvGraphicFramePr>
+            <a:graphic>
+              <a:graphicData uri="http://schemas.openxmlformats.org/drawingml/2006/picture">
+                <pic:pic>
+                  <pic:nvPicPr>
+                    <pic:cNvPr id="0" name="18_geometry_compare.png"/>
+                    <pic:cNvPicPr/>
+                  </pic:nvPicPr>
+                  <pic:blipFill>
+                    <a:blip r:embed="rId26"/>
+                    <a:stretch>
+                      <a:fillRect/>
+                    </a:stretch>
+                  </pic:blipFill>
+                  <pic:spPr>
+                    <a:xfrm>
+                      <a:off x="0" y="0"/>
+                      <a:ext cx="5806440" cy="2272085"/>
+                    </a:xfrm>
+                    <a:prstGeom prst="rect"/>
+                  </pic:spPr>
+                </pic:pic>
+              </a:graphicData>
+            </a:graphic>
+          </wp:inline>
+        </w:drawing>
+      </w:r>
+    </w:p>
+    <w:p>
+      <w:pPr>
+        <w:spacing w:after="240"/>
+        <w:jc w:val="center"/>
+      </w:pPr>
+      <w:r>
+        <w:rPr>
+          <w:rFonts w:ascii="Calibri" w:hAnsi="Calibri" w:eastAsia="微软雅黑"/>
+          <w:b w:val="0"/>
+          <w:color w:val="3C4650"/>
+          <w:sz w:val="18"/>
+        </w:rPr>
+        <w:t>图 18  同一批 key 下，2^24 行与 2^22 行的溢出和失败</w:t>
+      </w:r>
+    </w:p>
+    <w:p>
+      <w:pPr>
+        <w:jc w:val="center"/>
+      </w:pPr>
+      <w:r>
+        <w:drawing>
+          <wp:inline xmlns:a="http://schemas.openxmlformats.org/drawingml/2006/main" xmlns:pic="http://schemas.openxmlformats.org/drawingml/2006/picture">
+            <wp:extent cx="5806440" cy="3210620"/>
+            <wp:docPr id="19" name="Picture 19"/>
+            <wp:cNvGraphicFramePr>
+              <a:graphicFrameLocks noChangeAspect="1"/>
+            </wp:cNvGraphicFramePr>
+            <a:graphic>
+              <a:graphicData uri="http://schemas.openxmlformats.org/drawingml/2006/picture">
+                <pic:pic>
+                  <pic:nvPicPr>
+                    <pic:cNvPr id="0" name="19_tight_main_depth.png"/>
+                    <pic:cNvPicPr/>
+                  </pic:nvPicPr>
+                  <pic:blipFill>
+                    <a:blip r:embed="rId27"/>
+                    <a:stretch>
+                      <a:fillRect/>
+                    </a:stretch>
+                  </pic:blipFill>
+                  <pic:spPr>
+                    <a:xfrm>
+                      <a:off x="0" y="0"/>
+                      <a:ext cx="5806440" cy="3210620"/>
+                    </a:xfrm>
+                    <a:prstGeom prst="rect"/>
+                  </pic:spPr>
+                </pic:pic>
+              </a:graphicData>
+            </a:graphic>
+          </wp:inline>
+        </w:drawing>
+      </w:r>
+    </w:p>
+    <w:p>
+      <w:pPr>
+        <w:spacing w:after="240"/>
+        <w:jc w:val="center"/>
+      </w:pPr>
+      <w:r>
+        <w:rPr>
+          <w:rFonts w:ascii="Calibri" w:hAnsi="Calibri" w:eastAsia="微软雅黑"/>
+          <w:b w:val="0"/>
+          <w:color w:val="3C4650"/>
+          <w:sz w:val="18"/>
+        </w:rPr>
+        <w:t>图 19  2^22 行主表的每行深度。深度 4 表示这一行已经放满</w:t>
+      </w:r>
+    </w:p>
+    <w:p>
+      <w:pPr>
+        <w:jc w:val="center"/>
+      </w:pPr>
+      <w:r>
+        <w:drawing>
+          <wp:inline xmlns:a="http://schemas.openxmlformats.org/drawingml/2006/main" xmlns:pic="http://schemas.openxmlformats.org/drawingml/2006/picture">
+            <wp:extent cx="5806440" cy="2998931"/>
+            <wp:docPr id="20" name="Picture 20"/>
+            <wp:cNvGraphicFramePr>
+              <a:graphicFrameLocks noChangeAspect="1"/>
+            </wp:cNvGraphicFramePr>
+            <a:graphic>
+              <a:graphicData uri="http://schemas.openxmlformats.org/drawingml/2006/picture">
+                <pic:pic>
+                  <pic:nvPicPr>
+                    <pic:cNvPr id="0" name="20_tight_col_depth.png"/>
+                    <pic:cNvPicPr/>
+                  </pic:nvPicPr>
+                  <pic:blipFill>
+                    <a:blip r:embed="rId28"/>
+                    <a:stretch>
+                      <a:fillRect/>
+                    </a:stretch>
+                  </pic:blipFill>
+                  <pic:spPr>
+                    <a:xfrm>
+                      <a:off x="0" y="0"/>
+                      <a:ext cx="5806440" cy="2998931"/>
+                    </a:xfrm>
+                    <a:prstGeom prst="rect"/>
+                  </pic:spPr>
+                </pic:pic>
+              </a:graphicData>
+            </a:graphic>
+          </wp:inline>
+        </w:drawing>
+      </w:r>
+    </w:p>
+    <w:p>
+      <w:pPr>
+        <w:spacing w:after="240"/>
+        <w:jc w:val="center"/>
+      </w:pPr>
+      <w:r>
+        <w:rPr>
+          <w:rFonts w:ascii="Calibri" w:hAnsi="Calibri" w:eastAsia="微软雅黑"/>
+          <w:b w:val="0"/>
+          <w:color w:val="3C4650"/>
+          <w:sz w:val="18"/>
+        </w:rPr>
+        <w:t>图 20  2^22 行方案的冲突表每行深度</w:t>
+      </w:r>
+    </w:p>
+    <w:p>
+      <w:pPr>
+        <w:spacing w:after="120" w:before="0" w:line="276" w:lineRule="auto"/>
+      </w:pPr>
+      <w:r>
+        <w:rPr>
+          <w:rFonts w:ascii="Calibri" w:hAnsi="Calibri" w:eastAsia="微软雅黑"/>
+          <w:b w:val="0"/>
+          <w:sz w:val="22"/>
+        </w:rPr>
+        <w:t>25% 负载时，2^22 行主表的平均每行条数是 1，和 2^24 行在 100% 负载时的 λ 相同。这一档主表溢出 0.4310%，公式 0.4349%，失败 0 条。50% 时主表溢出 3.7534%，公式 3.7571%，失败仍是 0。70% 时失败第一次出现，989 条，失败率 0.0084%，公式 0.0081%。90% 时失败率 2.6347%，公式 2.6366%。100% 时主表溢出 19.5342%，公式 19.5367%；冲突表溢出即失败率 7.0698%，公式 7.0730%。同一批 16,777,216 条 key 放在 2^24 行上，失败数是 0。</w:t>
+      </w:r>
+    </w:p>
+    <w:p>
+      <w:pPr>
+        <w:spacing w:after="120" w:before="0" w:line="276" w:lineRule="auto"/>
+      </w:pPr>
+      <w:r>
+        <w:rPr>
+          <w:rFonts w:ascii="Calibri" w:hAnsi="Calibri" w:eastAsia="微软雅黑"/>
+          <w:b w:val="0"/>
+          <w:sz w:val="22"/>
+        </w:rPr>
+        <w:t>深度图和这个拐点对齐。25% 时主表深度 0 到 4 的行占 36.81%、36.75%、18.40%、6.13%、1.91%，冲突表最深只到 4。50% 时冲突表最深到 12，16 个槽还没有被顶满，所以失败仍是 0。70% 时冲突表第一次出现深度 16 的行，占冲突行的 0.94%，对应上面那 989 条插不进去的 key。90% 时 73.40% 的冲突行已经写满。100% 时主表深度 4 的行占 56.66%，冲突表 97.83% 的行停在深度 16。槽位总数等于 key 数时，哈希方差把约五分之一的 key 推出主行，其中约 7% 在冲突行里也找不到空槽。</w:t>
+      </w:r>
+    </w:p>
+    <w:p>
+      <w:pPr>
         <w:pStyle w:val="Heading1"/>
       </w:pPr>
       <w:r>

</xml_diff>

<commit_message>
hws-analysis: treat NIC_RX, NIC_TX, and FDB as three domains
The HWS entry in this tree only opens the FDB root. NIC_RX and NIC_TX
keep their own root namespaces and stay on firmware flow tables.

Co-authored-by: zsdaka <zsdaka@users.noreply.github.com>
</commit_message>
<xml_diff>
--- a/mlx5-hws-analysis/mlx5-hws-model.docx
+++ b/mlx5-hws-analysis/mlx5-hws-model.docx
@@ -81,7 +81,20 @@
           <w:b w:val="0"/>
           <w:sz w:val="22"/>
         </w:rPr>
-        <w:t>HWS 把一张逻辑流表拆成按优先级串起来的 matcher。每个 matcher 有一套匹配模板（key）和若干动作模板（action）。FDB 表会为同一条规则建两套 RTC：RX 服务线侧进入的包，TX 服务 vport 发出的包。大表在主 RTC 后面再挂一张碰撞 RTC，优先级与主 matcher 相同。</w:t>
+        <w:t>以太网方向上有三个并列的域：NIC_RX、NIC_TX、FDB。fs_core 为它们各建一个根 namespace。NIC_RX 和 NIC_TX 的命令留在固件流表。FDB 根可以切到 smfs 或 hmfs。后面关于 RTC、STE 和插入上界的部分，写的是切到 hmfs 之后的 FDB 域。FDB 内部的 RX、TX 两套 RTC 是这一个域的两个方向。</w:t>
+      </w:r>
+    </w:p>
+    <w:p>
+      <w:pPr>
+        <w:spacing w:after="120" w:before="0" w:line="276" w:lineRule="auto"/>
+      </w:pPr>
+      <w:r>
+        <w:rPr>
+          <w:rFonts w:ascii="Calibri" w:hAnsi="Calibri" w:eastAsia="微软雅黑"/>
+          <w:b w:val="0"/>
+          <w:sz w:val="22"/>
+        </w:rPr>
+        <w:t>HWS 把一张 FDB 流表拆成按优先级串起来的 matcher。每个 matcher 有一套匹配模板（key）和若干动作模板（action）。同一条规则建两套 RTC：RX 服务线侧进入的包，TX 服务 vport 发出的包。大表在主 RTC 后面再挂一张碰撞 RTC，优先级与主 matcher 相同。</w:t>
       </w:r>
     </w:p>
     <w:p>
@@ -694,7 +707,7 @@
           <w:color w:val="1B3A4B"/>
           <w:sz w:val="30"/>
         </w:rPr>
-        <w:t>3.1  域</w:t>
+        <w:t>3.1  三个域</w:t>
       </w:r>
     </w:p>
     <w:p>
@@ -707,7 +720,494 @@
           <w:b w:val="0"/>
           <w:sz w:val="22"/>
         </w:rPr>
-        <w:t>本树公开的 HWS 表类型只有 MLX5HWS_TABLE_TYPE_FDB。创建表时若 type 大于 FDB 会直接拒绝。FDB 在固件侧仍拆成两个资源类型：FS_FT_FDB_RX 与 FS_FT_FDB_TX。hws_matcher_create_rtc() 在表类型为 FDB 时创建第二套 RTC，STE 区间分别记在 ste_0_base 与 ste_1_base。</w:t>
+        <w:t>NIC_RX、NIC_TX、FDB 是三套并列的以太网流表域。驱动里有两层同名枚举。固件侧是 fs_flow_table_type：FS_FT_NIC_RX = 0，FS_FT_NIC_TX = 1，FS_FT_FDB = 4。软件转向侧是 steering/sws/mlx5dr.h 里的 mlx5dr_domain_type，三个取值也是 NIC_RX、NIC_TX、FDB。fs_core 初始化时各建一个根：init_root_ns() 得到 steering-&gt;root_ns，表类型 NIC_RX；init_egress_root_ns() 得到 egress_root_ns，表类型 NIC_TX；设备是 eswitch manager 且 FDB 能力打开时，init_fdb_root_ns() 得到 fdb_root_ns。SET_FLOW_TABLE_ROOT 按 table_type 分别挂根，NIC_TX 的入口在 mlx5_fs_cmd_set_tx_flow_table_root()。</w:t>
+      </w:r>
+    </w:p>
+    <w:p>
+      <w:pPr>
+        <w:jc w:val="center"/>
+      </w:pPr>
+      <w:r>
+        <w:drawing>
+          <wp:inline xmlns:a="http://schemas.openxmlformats.org/drawingml/2006/main" xmlns:pic="http://schemas.openxmlformats.org/drawingml/2006/picture">
+            <wp:extent cx="5806440" cy="3556901"/>
+            <wp:docPr id="1" name="Picture 1"/>
+            <wp:cNvGraphicFramePr>
+              <a:graphicFrameLocks noChangeAspect="1"/>
+            </wp:cNvGraphicFramePr>
+            <a:graphic>
+              <a:graphicData uri="http://schemas.openxmlformats.org/drawingml/2006/picture">
+                <pic:pic>
+                  <pic:nvPicPr>
+                    <pic:cNvPr id="0" name="21_domains.png"/>
+                    <pic:cNvPicPr/>
+                  </pic:nvPicPr>
+                  <pic:blipFill>
+                    <a:blip r:embed="rId9"/>
+                    <a:stretch>
+                      <a:fillRect/>
+                    </a:stretch>
+                  </pic:blipFill>
+                  <pic:spPr>
+                    <a:xfrm>
+                      <a:off x="0" y="0"/>
+                      <a:ext cx="5806440" cy="3556901"/>
+                    </a:xfrm>
+                    <a:prstGeom prst="rect"/>
+                  </pic:spPr>
+                </pic:pic>
+              </a:graphicData>
+            </a:graphic>
+          </wp:inline>
+        </w:drawing>
+      </w:r>
+    </w:p>
+    <w:p>
+      <w:pPr>
+        <w:spacing w:after="240"/>
+        <w:jc w:val="center"/>
+      </w:pPr>
+      <w:r>
+        <w:rPr>
+          <w:rFonts w:ascii="Calibri" w:hAnsi="Calibri" w:eastAsia="微软雅黑"/>
+          <w:b w:val="0"/>
+          <w:color w:val="3C4650"/>
+          <w:sz w:val="18"/>
+        </w:rPr>
+        <w:t>图 21  NIC_RX、NIC_TX、FDB 三个域。前两个在本树走固件流表，FDB 可以切到 HWS</w:t>
+      </w:r>
+    </w:p>
+    <w:tbl>
+      <w:tblPr>
+        <w:tblStyle w:val="TableGrid"/>
+        <w:tblW w:type="auto" w:w="0"/>
+        <w:tblLook w:firstColumn="1" w:firstRow="1" w:lastColumn="0" w:lastRow="0" w:noHBand="0" w:noVBand="1" w:val="04A0"/>
+      </w:tblPr>
+      <w:tblGrid>
+        <w:gridCol w:w="1700"/>
+        <w:gridCol w:w="1700"/>
+        <w:gridCol w:w="1700"/>
+        <w:gridCol w:w="1700"/>
+        <w:gridCol w:w="1700"/>
+        <w:gridCol w:w="1700"/>
+      </w:tblGrid>
+      <w:tr>
+        <w:tc>
+          <w:tcPr>
+            <w:tcW w:type="dxa" w:w="1700"/>
+            <w:shd w:fill="1B3A4B" w:val="clear"/>
+          </w:tcPr>
+          <w:p>
+            <w:r/>
+            <w:r>
+              <w:rPr>
+                <w:rFonts w:ascii="Calibri" w:hAnsi="Calibri" w:eastAsia="微软雅黑"/>
+                <w:b/>
+                <w:color w:val="FFFFFF"/>
+                <w:sz w:val="18"/>
+              </w:rPr>
+              <w:t>域</w:t>
+            </w:r>
+          </w:p>
+        </w:tc>
+        <w:tc>
+          <w:tcPr>
+            <w:tcW w:type="dxa" w:w="1700"/>
+            <w:shd w:fill="1B3A4B" w:val="clear"/>
+          </w:tcPr>
+          <w:p>
+            <w:r/>
+            <w:r>
+              <w:rPr>
+                <w:rFonts w:ascii="Calibri" w:hAnsi="Calibri" w:eastAsia="微软雅黑"/>
+                <w:b/>
+                <w:color w:val="FFFFFF"/>
+                <w:sz w:val="18"/>
+              </w:rPr>
+              <w:t>根</w:t>
+            </w:r>
+          </w:p>
+        </w:tc>
+        <w:tc>
+          <w:tcPr>
+            <w:tcW w:type="dxa" w:w="1700"/>
+            <w:shd w:fill="1B3A4B" w:val="clear"/>
+          </w:tcPr>
+          <w:p>
+            <w:r/>
+            <w:r>
+              <w:rPr>
+                <w:rFonts w:ascii="Calibri" w:hAnsi="Calibri" w:eastAsia="微软雅黑"/>
+                <w:b/>
+                <w:color w:val="FFFFFF"/>
+                <w:sz w:val="18"/>
+              </w:rPr>
+              <w:t>本树的命令</w:t>
+            </w:r>
+          </w:p>
+        </w:tc>
+        <w:tc>
+          <w:tcPr>
+            <w:tcW w:type="dxa" w:w="1700"/>
+            <w:shd w:fill="1B3A4B" w:val="clear"/>
+          </w:tcPr>
+          <w:p>
+            <w:r/>
+            <w:r>
+              <w:rPr>
+                <w:rFonts w:ascii="Calibri" w:hAnsi="Calibri" w:eastAsia="微软雅黑"/>
+                <w:b/>
+                <w:color w:val="FFFFFF"/>
+                <w:sz w:val="18"/>
+              </w:rPr>
+              <w:t>方向</w:t>
+            </w:r>
+          </w:p>
+        </w:tc>
+        <w:tc>
+          <w:tcPr>
+            <w:tcW w:type="dxa" w:w="1700"/>
+            <w:shd w:fill="1B3A4B" w:val="clear"/>
+          </w:tcPr>
+          <w:p>
+            <w:r/>
+            <w:r>
+              <w:rPr>
+                <w:rFonts w:ascii="Calibri" w:hAnsi="Calibri" w:eastAsia="微软雅黑"/>
+                <w:b/>
+                <w:color w:val="FFFFFF"/>
+                <w:sz w:val="18"/>
+              </w:rPr>
+              <w:t>namespace</w:t>
+            </w:r>
+          </w:p>
+        </w:tc>
+        <w:tc>
+          <w:tcPr>
+            <w:tcW w:type="dxa" w:w="1700"/>
+            <w:shd w:fill="1B3A4B" w:val="clear"/>
+          </w:tcPr>
+          <w:p>
+            <w:r/>
+            <w:r>
+              <w:rPr>
+                <w:rFonts w:ascii="Calibri" w:hAnsi="Calibri" w:eastAsia="微软雅黑"/>
+                <w:b/>
+                <w:color w:val="FFFFFF"/>
+                <w:sz w:val="18"/>
+              </w:rPr>
+              <w:t>典型终结</w:t>
+            </w:r>
+          </w:p>
+        </w:tc>
+      </w:tr>
+      <w:tr>
+        <w:tc>
+          <w:tcPr>
+            <w:tcW w:type="dxa" w:w="1700"/>
+          </w:tcPr>
+          <w:p>
+            <w:r/>
+            <w:r>
+              <w:rPr>
+                <w:rFonts w:ascii="Calibri" w:hAnsi="Calibri" w:eastAsia="微软雅黑"/>
+                <w:b w:val="0"/>
+                <w:sz w:val="16"/>
+              </w:rPr>
+              <w:t>NIC_RX</w:t>
+            </w:r>
+          </w:p>
+        </w:tc>
+        <w:tc>
+          <w:tcPr>
+            <w:tcW w:type="dxa" w:w="1700"/>
+          </w:tcPr>
+          <w:p>
+            <w:r/>
+            <w:r>
+              <w:rPr>
+                <w:rFonts w:ascii="Calibri" w:hAnsi="Calibri" w:eastAsia="微软雅黑"/>
+                <w:b w:val="0"/>
+                <w:sz w:val="16"/>
+              </w:rPr>
+              <w:t>root_ns</w:t>
+            </w:r>
+          </w:p>
+        </w:tc>
+        <w:tc>
+          <w:tcPr>
+            <w:tcW w:type="dxa" w:w="1700"/>
+          </w:tcPr>
+          <w:p>
+            <w:r/>
+            <w:r>
+              <w:rPr>
+                <w:rFonts w:ascii="Calibri" w:hAnsi="Calibri" w:eastAsia="微软雅黑"/>
+                <w:b w:val="0"/>
+                <w:sz w:val="16"/>
+              </w:rPr>
+              <w:t>固件 DMFS</w:t>
+            </w:r>
+          </w:p>
+        </w:tc>
+        <w:tc>
+          <w:tcPr>
+            <w:tcW w:type="dxa" w:w="1700"/>
+          </w:tcPr>
+          <w:p>
+            <w:r/>
+            <w:r>
+              <w:rPr>
+                <w:rFonts w:ascii="Calibri" w:hAnsi="Calibri" w:eastAsia="微软雅黑"/>
+                <w:b w:val="0"/>
+                <w:sz w:val="16"/>
+              </w:rPr>
+              <w:t>只建 RX 半边</w:t>
+            </w:r>
+          </w:p>
+        </w:tc>
+        <w:tc>
+          <w:tcPr>
+            <w:tcW w:type="dxa" w:w="1700"/>
+          </w:tcPr>
+          <w:p>
+            <w:r/>
+            <w:r>
+              <w:rPr>
+                <w:rFonts w:ascii="Calibri" w:hAnsi="Calibri" w:eastAsia="微软雅黑"/>
+                <w:b w:val="0"/>
+                <w:sz w:val="16"/>
+              </w:rPr>
+              <w:t>BYPASS、RX MACSEC、LAG、OFFLOADS、ETHTOOL、KERNEL、LEFTOVERS、ANCHOR</w:t>
+            </w:r>
+          </w:p>
+        </w:tc>
+        <w:tc>
+          <w:tcPr>
+            <w:tcW w:type="dxa" w:w="1700"/>
+          </w:tcPr>
+          <w:p>
+            <w:r/>
+            <w:r>
+              <w:rPr>
+                <w:rFonts w:ascii="Calibri" w:hAnsi="Calibri" w:eastAsia="微软雅黑"/>
+                <w:b w:val="0"/>
+                <w:sz w:val="16"/>
+              </w:rPr>
+              <w:t>TIR，再由 TIR 选 RQ</w:t>
+            </w:r>
+          </w:p>
+        </w:tc>
+      </w:tr>
+      <w:tr>
+        <w:tc>
+          <w:tcPr>
+            <w:tcW w:type="dxa" w:w="1700"/>
+          </w:tcPr>
+          <w:p>
+            <w:r/>
+            <w:r>
+              <w:rPr>
+                <w:rFonts w:ascii="Calibri" w:hAnsi="Calibri" w:eastAsia="微软雅黑"/>
+                <w:b w:val="0"/>
+                <w:sz w:val="16"/>
+              </w:rPr>
+              <w:t>NIC_TX</w:t>
+            </w:r>
+          </w:p>
+        </w:tc>
+        <w:tc>
+          <w:tcPr>
+            <w:tcW w:type="dxa" w:w="1700"/>
+          </w:tcPr>
+          <w:p>
+            <w:r/>
+            <w:r>
+              <w:rPr>
+                <w:rFonts w:ascii="Calibri" w:hAnsi="Calibri" w:eastAsia="微软雅黑"/>
+                <w:b w:val="0"/>
+                <w:sz w:val="16"/>
+              </w:rPr>
+              <w:t>egress_root_ns</w:t>
+            </w:r>
+          </w:p>
+        </w:tc>
+        <w:tc>
+          <w:tcPr>
+            <w:tcW w:type="dxa" w:w="1700"/>
+          </w:tcPr>
+          <w:p>
+            <w:r/>
+            <w:r>
+              <w:rPr>
+                <w:rFonts w:ascii="Calibri" w:hAnsi="Calibri" w:eastAsia="微软雅黑"/>
+                <w:b w:val="0"/>
+                <w:sz w:val="16"/>
+              </w:rPr>
+              <w:t>固件 DMFS</w:t>
+            </w:r>
+          </w:p>
+        </w:tc>
+        <w:tc>
+          <w:tcPr>
+            <w:tcW w:type="dxa" w:w="1700"/>
+          </w:tcPr>
+          <w:p>
+            <w:r/>
+            <w:r>
+              <w:rPr>
+                <w:rFonts w:ascii="Calibri" w:hAnsi="Calibri" w:eastAsia="微软雅黑"/>
+                <w:b w:val="0"/>
+                <w:sz w:val="16"/>
+              </w:rPr>
+              <w:t>只建 TX 半边</w:t>
+            </w:r>
+          </w:p>
+        </w:tc>
+        <w:tc>
+          <w:tcPr>
+            <w:tcW w:type="dxa" w:w="1700"/>
+          </w:tcPr>
+          <w:p>
+            <w:r/>
+            <w:r>
+              <w:rPr>
+                <w:rFonts w:ascii="Calibri" w:hAnsi="Calibri" w:eastAsia="微软雅黑"/>
+                <w:b w:val="0"/>
+                <w:sz w:val="16"/>
+              </w:rPr>
+              <w:t>EGRESS、EGRESS_IPSEC、EGRESS_MACSEC</w:t>
+            </w:r>
+          </w:p>
+        </w:tc>
+        <w:tc>
+          <w:tcPr>
+            <w:tcW w:type="dxa" w:w="1700"/>
+          </w:tcPr>
+          <w:p>
+            <w:r/>
+            <w:r>
+              <w:rPr>
+                <w:rFonts w:ascii="Calibri" w:hAnsi="Calibri" w:eastAsia="微软雅黑"/>
+                <w:b w:val="0"/>
+                <w:sz w:val="16"/>
+              </w:rPr>
+              <w:t>改头、L2 到隧道的封装，然后离开 function</w:t>
+            </w:r>
+          </w:p>
+        </w:tc>
+      </w:tr>
+      <w:tr>
+        <w:tc>
+          <w:tcPr>
+            <w:tcW w:type="dxa" w:w="1700"/>
+          </w:tcPr>
+          <w:p>
+            <w:r/>
+            <w:r>
+              <w:rPr>
+                <w:rFonts w:ascii="Calibri" w:hAnsi="Calibri" w:eastAsia="微软雅黑"/>
+                <w:b w:val="0"/>
+                <w:sz w:val="16"/>
+              </w:rPr>
+              <w:t>FDB</w:t>
+            </w:r>
+          </w:p>
+        </w:tc>
+        <w:tc>
+          <w:tcPr>
+            <w:tcW w:type="dxa" w:w="1700"/>
+          </w:tcPr>
+          <w:p>
+            <w:r/>
+            <w:r>
+              <w:rPr>
+                <w:rFonts w:ascii="Calibri" w:hAnsi="Calibri" w:eastAsia="微软雅黑"/>
+                <w:b w:val="0"/>
+                <w:sz w:val="16"/>
+              </w:rPr>
+              <w:t>fdb_root_ns</w:t>
+            </w:r>
+          </w:p>
+        </w:tc>
+        <w:tc>
+          <w:tcPr>
+            <w:tcW w:type="dxa" w:w="1700"/>
+          </w:tcPr>
+          <w:p>
+            <w:r/>
+            <w:r>
+              <w:rPr>
+                <w:rFonts w:ascii="Calibri" w:hAnsi="Calibri" w:eastAsia="微软雅黑"/>
+                <w:b w:val="0"/>
+                <w:sz w:val="16"/>
+              </w:rPr>
+              <w:t>dmfs、smfs 或 hmfs</w:t>
+            </w:r>
+          </w:p>
+        </w:tc>
+        <w:tc>
+          <w:tcPr>
+            <w:tcW w:type="dxa" w:w="1700"/>
+          </w:tcPr>
+          <w:p>
+            <w:r/>
+            <w:r>
+              <w:rPr>
+                <w:rFonts w:ascii="Calibri" w:hAnsi="Calibri" w:eastAsia="微软雅黑"/>
+                <w:b w:val="0"/>
+                <w:sz w:val="16"/>
+              </w:rPr>
+              <w:t>RX 与 TX 各一套 STE</w:t>
+            </w:r>
+          </w:p>
+        </w:tc>
+        <w:tc>
+          <w:tcPr>
+            <w:tcW w:type="dxa" w:w="1700"/>
+          </w:tcPr>
+          <w:p>
+            <w:r/>
+            <w:r>
+              <w:rPr>
+                <w:rFonts w:ascii="Calibri" w:hAnsi="Calibri" w:eastAsia="微软雅黑"/>
+                <w:b w:val="0"/>
+                <w:sz w:val="16"/>
+              </w:rPr>
+              <w:t>FDB 根、FDB_BYPASS，以及运行时的 TC chain</w:t>
+            </w:r>
+          </w:p>
+        </w:tc>
+        <w:tc>
+          <w:tcPr>
+            <w:tcW w:type="dxa" w:w="1700"/>
+          </w:tcPr>
+          <w:p>
+            <w:r/>
+            <w:r>
+              <w:rPr>
+                <w:rFonts w:ascii="Calibri" w:hAnsi="Calibri" w:eastAsia="微软雅黑"/>
+                <w:b w:val="0"/>
+                <w:sz w:val="16"/>
+              </w:rPr>
+              <w:t>vport、丢弃、跳表、封装</w:t>
+            </w:r>
+          </w:p>
+        </w:tc>
+      </w:tr>
+    </w:tbl>
+    <w:p/>
+    <w:p>
+      <w:pPr>
+        <w:spacing w:after="120" w:before="0" w:line="276" w:lineRule="auto"/>
+      </w:pPr>
+      <w:r>
+        <w:rPr>
+          <w:rFonts w:ascii="Calibri" w:hAnsi="Calibri" w:eastAsia="微软雅黑"/>
+          <w:b w:val="0"/>
+          <w:sz w:val="18"/>
+        </w:rPr>
+        <w:t>表 4  三个以太网域。RDMA、sniffer、port select、vport ACL 另外还有自己的根和表类型，不在这三列里。</w:t>
       </w:r>
     </w:p>
     <w:p>
@@ -720,7 +1220,46 @@
           <w:b w:val="0"/>
           <w:sz w:val="22"/>
         </w:rPr>
-        <w:t>context 初始化还要求 eswitch manager、WQE 更新、8DW STE、按哈希和按偏移两种 RTC 更新模式，以及 SELECT definer。不满足这些能力时，上下文不会置上 HWS_SUPPORT。</w:t>
+        <w:t>mlx5dr_domain_create() 按类型填半边。NIC_RX 要求接收方向的软件转向能力，默认 ICM 用 nic_rx_drop_address，只初始化 info.rx。NIC_TX 用 nic_tx_allow_address，只初始化 info.tx。FDB 要求 eswitch manager，RX、TX 的默认 ICM 取管理 vport 的两个地址，丢弃地址用 esw_rx_drop 和 esw_tx_drop。表和规则跟着分叉：NIC 域的一张表只有一个方向的锚点，FDB 的一张表在 dr_table_init_fdb() 里把 rx 和 tx 都建出来。FDB 规则还可以按 flow_source 和 source_port 跳过其中一边，这段在 dr_rule_skip()。</w:t>
+      </w:r>
+    </w:p>
+    <w:p>
+      <w:pPr>
+        <w:spacing w:after="120" w:before="0" w:line="276" w:lineRule="auto"/>
+      </w:pPr>
+      <w:r>
+        <w:rPr>
+          <w:rFonts w:ascii="Calibri" w:hAnsi="Calibri" w:eastAsia="微软雅黑"/>
+          <w:b w:val="0"/>
+          <w:sz w:val="22"/>
+        </w:rPr>
+        <w:t>上一版把域收成 FDB，是因为跟上了 HWS 的创建入口。mlx5_flow_namespace_set_mode() 在根的 table_type 不是 FS_FT_FDB 时返回 -EOPNOTSUPP。全库只有 esw_create_offloads_fdb_tables() 调用它，传入的 namespace 是 MLX5_FLOW_NAMESPACE_FDB。hmfs 因此只在 FDB 根上打开 mlx5hws_context。mlx5_cmd_hws_create_flow_table() 看到其它 table_type 直接返回 -EOPNOTSUPP。enum mlx5hws_table_type 里只有 MLX5HWS_TABLE_TYPE_FDB。smfs 的 mlx5_cmd_dr_create_ns() 调用 mlx5dr_domain_create() 时写死 MLX5DR_DOMAIN_TYPE_FDB。NIC_RX 和 NIC_TX 的创建分支在 dr_domain.c 里是完整的，fs 层没有走到。这两个根的 cmds 一直是 mlx5_fs_cmd_get_default() 返回的固件命令。</w:t>
+      </w:r>
+    </w:p>
+    <w:p>
+      <w:pPr>
+        <w:spacing w:after="120" w:before="0" w:line="276" w:lineRule="auto"/>
+      </w:pPr>
+      <w:r>
+        <w:rPr>
+          <w:rFonts w:ascii="Calibri" w:hAnsi="Calibri" w:eastAsia="微软雅黑"/>
+          <w:b w:val="0"/>
+          <w:sz w:val="22"/>
+        </w:rPr>
+        <w:t>HWS 源码还留着 NIC 域的口子。表类型不是 FDB 且带了 optimize_flow_src 时，matcher.c 打印 “NIC domain doesn't support flow_src”。table.c 在非 FDB 时用 nic_ft.max_level 填下一张表的 level。mlx5hws_table_get_fw_ft_type() 对非 FDB 返回 -EOPNOTSUPP。本树的 HWS 不会打开 NIC_RX 或 NIC_TX。</w:t>
+      </w:r>
+    </w:p>
+    <w:p>
+      <w:pPr>
+        <w:spacing w:after="120" w:before="0" w:line="276" w:lineRule="auto"/>
+      </w:pPr>
+      <w:r>
+        <w:rPr>
+          <w:rFonts w:ascii="Calibri" w:hAnsi="Calibri" w:eastAsia="微软雅黑"/>
+          <w:b w:val="0"/>
+          <w:sz w:val="22"/>
+        </w:rPr>
+        <w:t>FDB 域内部还有两个固件资源类型：FS_FT_FDB_RX 与 FS_FT_FDB_TX。hws_matcher_create_rtc() 在表类型为 FDB 时创建第二套 RTC，STE 区间记在 ste_0_base 与 ste_1_base。这两套 RTC 是 FDB 这一个域的两个方向，和 NIC_RX、NIC_TX 两个域并列。context 初始化还要求 eswitch manager、WQE 更新、8DW STE、按哈希和按偏移两种 RTC 更新模式，以及 SELECT definer。不满足这些能力时，上下文不会置上 HWS_SUPPORT。</w:t>
       </w:r>
     </w:p>
     <w:p>
@@ -747,7 +1286,7 @@
           <w:b w:val="0"/>
           <w:sz w:val="22"/>
         </w:rPr>
-        <w:t>mlx5_flow_namespace_type 列出了 BYPASS、KERNEL、FDB、EGRESS、RDMA、IPsec、MACsec 等二十余个 namespace。HWS 创建路径只接受 FS_FT_FDB。因此在这棵树里，HWS 流表全部挂在 FDB namespace 上，其它 namespace 没有 HWS matcher。</w:t>
+        <w:t>namespace 挂在某一个域的根下面。mlx5_get_flow_namespace() 把 BYPASS 到 ANCHOR 这 8 个类型交给 root_ns，把 EGRESS 三个类型交给 egress_root_ns，把 FDB 和 FDB_BYPASS 交给 fdb_root_ns。HWS 创建路径只接受 FS_FT_FDB，所以 hmfs 的 matcher 只出现在 FDB 域里。NIC_RX 和 NIC_TX 的表由固件流表命令创建。</w:t>
       </w:r>
     </w:p>
     <w:p>
@@ -1045,7 +1584,7 @@
           <w:b w:val="0"/>
           <w:sz w:val="22"/>
         </w:rPr>
-        <w:t>TIR 出现在 fs 的通用目的地结构里（mlx5_flow_destination.tir_num），供 NIC RX 的终结表使用。HWS 动作枚举里没有 TIR。FDB 命中之后的典型终结是 vport 或丢弃；报文到达代表口之后，才进入 NIC RX，由 TIR 选择 RQ。</w:t>
+        <w:t>NIC_RX 的 KERNEL namespace 由 en_fs.c 建 TTC。fs_ttc.c 用外层 ethertype、IP 版本和 L4 协议做 key，目的地类型是 TIR，tir_num 指向 RSS 或 direct TIR。NIC_TX 的表做该 function 发出方向的 IPsec 和 MACsec。软件转向代码里，NIC_RX 的重格式化只接受隧道到 L2，NIC_TX 只接受 L2 到隧道。HWS 动作枚举里没有 TIR。FDB 命中后的典型终结是 vport 或丢弃；报文到达目的 function 之后，再进入那个 function 的 NIC_RX 域，由 TIR 选择 RQ。</w:t>
       </w:r>
     </w:p>
     <w:p>
@@ -1070,7 +1609,7 @@
         <w:drawing>
           <wp:inline xmlns:a="http://schemas.openxmlformats.org/drawingml/2006/main" xmlns:pic="http://schemas.openxmlformats.org/drawingml/2006/picture">
             <wp:extent cx="5806440" cy="3531588"/>
-            <wp:docPr id="1" name="Picture 1"/>
+            <wp:docPr id="2" name="Picture 2"/>
             <wp:cNvGraphicFramePr>
               <a:graphicFrameLocks noChangeAspect="1"/>
             </wp:cNvGraphicFramePr>
@@ -1082,7 +1621,7 @@
                     <pic:cNvPicPr/>
                   </pic:nvPicPr>
                   <pic:blipFill>
-                    <a:blip r:embed="rId9"/>
+                    <a:blip r:embed="rId10"/>
                     <a:stretch>
                       <a:fillRect/>
                     </a:stretch>
@@ -1164,7 +1703,7 @@
         <w:drawing>
           <wp:inline xmlns:a="http://schemas.openxmlformats.org/drawingml/2006/main" xmlns:pic="http://schemas.openxmlformats.org/drawingml/2006/picture">
             <wp:extent cx="5806440" cy="3284575"/>
-            <wp:docPr id="2" name="Picture 2"/>
+            <wp:docPr id="3" name="Picture 3"/>
             <wp:cNvGraphicFramePr>
               <a:graphicFrameLocks noChangeAspect="1"/>
             </wp:cNvGraphicFramePr>
@@ -1176,7 +1715,7 @@
                     <pic:cNvPicPr/>
                   </pic:nvPicPr>
                   <pic:blipFill>
-                    <a:blip r:embed="rId10"/>
+                    <a:blip r:embed="rId11"/>
                     <a:stretch>
                       <a:fillRect/>
                     </a:stretch>
@@ -1232,7 +1771,7 @@
         <w:drawing>
           <wp:inline xmlns:a="http://schemas.openxmlformats.org/drawingml/2006/main" xmlns:pic="http://schemas.openxmlformats.org/drawingml/2006/picture">
             <wp:extent cx="5806440" cy="3444094"/>
-            <wp:docPr id="3" name="Picture 3"/>
+            <wp:docPr id="4" name="Picture 4"/>
             <wp:cNvGraphicFramePr>
               <a:graphicFrameLocks noChangeAspect="1"/>
             </wp:cNvGraphicFramePr>
@@ -1244,7 +1783,7 @@
                     <pic:cNvPicPr/>
                   </pic:nvPicPr>
                   <pic:blipFill>
-                    <a:blip r:embed="rId11"/>
+                    <a:blip r:embed="rId12"/>
                     <a:stretch>
                       <a:fillRect/>
                     </a:stretch>
@@ -1326,7 +1865,7 @@
         <w:drawing>
           <wp:inline xmlns:a="http://schemas.openxmlformats.org/drawingml/2006/main" xmlns:pic="http://schemas.openxmlformats.org/drawingml/2006/picture">
             <wp:extent cx="5806440" cy="3360577"/>
-            <wp:docPr id="4" name="Picture 4"/>
+            <wp:docPr id="5" name="Picture 5"/>
             <wp:cNvGraphicFramePr>
               <a:graphicFrameLocks noChangeAspect="1"/>
             </wp:cNvGraphicFramePr>
@@ -1338,7 +1877,7 @@
                     <pic:cNvPicPr/>
                   </pic:nvPicPr>
                   <pic:blipFill>
-                    <a:blip r:embed="rId12"/>
+                    <a:blip r:embed="rId13"/>
                     <a:stretch>
                       <a:fillRect/>
                     </a:stretch>
@@ -1406,8 +1945,8 @@
       <w:r>
         <w:drawing>
           <wp:inline xmlns:a="http://schemas.openxmlformats.org/drawingml/2006/main" xmlns:pic="http://schemas.openxmlformats.org/drawingml/2006/picture">
-            <wp:extent cx="5806440" cy="3312925"/>
-            <wp:docPr id="5" name="Picture 5"/>
+            <wp:extent cx="5806440" cy="3305084"/>
+            <wp:docPr id="6" name="Picture 6"/>
             <wp:cNvGraphicFramePr>
               <a:graphicFrameLocks noChangeAspect="1"/>
             </wp:cNvGraphicFramePr>
@@ -1419,7 +1958,7 @@
                     <pic:cNvPicPr/>
                   </pic:nvPicPr>
                   <pic:blipFill>
-                    <a:blip r:embed="rId13"/>
+                    <a:blip r:embed="rId14"/>
                     <a:stretch>
                       <a:fillRect/>
                     </a:stretch>
@@ -1427,7 +1966,7 @@
                   <pic:spPr>
                     <a:xfrm>
                       <a:off x="0" y="0"/>
-                      <a:ext cx="5806440" cy="3312925"/>
+                      <a:ext cx="5806440" cy="3305084"/>
                     </a:xfrm>
                     <a:prstGeom prst="rect"/>
                   </pic:spPr>
@@ -1450,7 +1989,7 @@
           <w:color w:val="3C4650"/>
           <w:sz w:val="18"/>
         </w:rPr>
-        <w:t>图 5  RX。HWS 流表在 FDB，TIR 和 RQ 在随后的 NIC RX</w:t>
+        <w:t>图 5  RX。FDB 域在前，目的 function 的 NIC_RX 域在后，TIR 和 RQ 属于 NIC_RX</w:t>
       </w:r>
     </w:p>
     <w:p>
@@ -1460,8 +1999,8 @@
       <w:r>
         <w:drawing>
           <wp:inline xmlns:a="http://schemas.openxmlformats.org/drawingml/2006/main" xmlns:pic="http://schemas.openxmlformats.org/drawingml/2006/picture">
-            <wp:extent cx="5806440" cy="3058085"/>
-            <wp:docPr id="6" name="Picture 6"/>
+            <wp:extent cx="5806440" cy="3050243"/>
+            <wp:docPr id="7" name="Picture 7"/>
             <wp:cNvGraphicFramePr>
               <a:graphicFrameLocks noChangeAspect="1"/>
             </wp:cNvGraphicFramePr>
@@ -1473,7 +2012,7 @@
                     <pic:cNvPicPr/>
                   </pic:nvPicPr>
                   <pic:blipFill>
-                    <a:blip r:embed="rId14"/>
+                    <a:blip r:embed="rId15"/>
                     <a:stretch>
                       <a:fillRect/>
                     </a:stretch>
@@ -1481,7 +2020,7 @@
                   <pic:spPr>
                     <a:xfrm>
                       <a:off x="0" y="0"/>
-                      <a:ext cx="5806440" cy="3058085"/>
+                      <a:ext cx="5806440" cy="3050243"/>
                     </a:xfrm>
                     <a:prstGeom prst="rect"/>
                   </pic:spPr>
@@ -1504,7 +2043,7 @@
           <w:color w:val="3C4650"/>
           <w:sz w:val="18"/>
         </w:rPr>
-        <w:t>图 6  TX。数据包先到 SQ 和 TIS，再进 FDB 的 TX RTC</w:t>
+        <w:t>图 6  TX。SQ 和 TIS 之后先过 NIC_TX 域，再进 FDB 域的 TX RTC</w:t>
       </w:r>
     </w:p>
     <w:p>
@@ -1515,7 +2054,7 @@
         <w:drawing>
           <wp:inline xmlns:a="http://schemas.openxmlformats.org/drawingml/2006/main" xmlns:pic="http://schemas.openxmlformats.org/drawingml/2006/picture">
             <wp:extent cx="5806440" cy="3425591"/>
-            <wp:docPr id="7" name="Picture 7"/>
+            <wp:docPr id="8" name="Picture 8"/>
             <wp:cNvGraphicFramePr>
               <a:graphicFrameLocks noChangeAspect="1"/>
             </wp:cNvGraphicFramePr>
@@ -1527,7 +2066,7 @@
                     <pic:cNvPicPr/>
                   </pic:nvPicPr>
                   <pic:blipFill>
-                    <a:blip r:embed="rId15"/>
+                    <a:blip r:embed="rId16"/>
                     <a:stretch>
                       <a:fillRect/>
                     </a:stretch>
@@ -1571,7 +2110,7 @@
           <w:b w:val="0"/>
           <w:sz w:val="22"/>
         </w:rPr>
-        <w:t>从报文方向看，层次是：端口或 vport，然后是 namespace 上的 flow table 链，然后是 matcher 的 RTC，然后是 STC。FDB 的 STC 把报文送到 vport 或丢掉。代表口上的 NIC RX 再用 TIR 选定 RQ。RQ 完成写进 CQ，CQ 的通知到达 EQ。</w:t>
+        <w:t>switchdev 下，RX 的层次是：上行口，FDB 域（hmfs 时走 RTC RX 和 STC），目的 vport，该 function 的 NIC_RX 域，TIR，RQ，CQ，EQ。NIC_RX 域里的表是固件流表，namespace 按 BYPASS 到 ANCHOR 的优先级串起来。没有 FDB offload 时，线侧报文直接进入 NIC_RX 域。</w:t>
       </w:r>
     </w:p>
     <w:p>
@@ -1584,7 +2123,7 @@
           <w:b w:val="0"/>
           <w:sz w:val="22"/>
         </w:rPr>
-        <w:t>TIS 是发送侧的传输接口。主机把数据包 WQE 放进 SQ 并敲门铃之后，报文带着 TIS 进入 TX 方向，FDB 用 TX RTC 做哈希。</w:t>
+        <w:t>TIS 是发送侧的传输接口。主机把数据包 WQE 放进 SQ 并敲门铃之后，报文先进入该 function 的 NIC_TX 域，做完 egress 规则再离开 function。switchdev 下下一站是 FDB 域的 TX 侧，hmfs 时用 TX RTC 做哈希。没有 FDB offload 时，NIC_TX 之后直接出端口。</w:t>
       </w:r>
     </w:p>
     <w:p>
@@ -1781,7 +2320,7 @@
         <w:drawing>
           <wp:inline xmlns:a="http://schemas.openxmlformats.org/drawingml/2006/main" xmlns:pic="http://schemas.openxmlformats.org/drawingml/2006/picture">
             <wp:extent cx="5806440" cy="2255394"/>
-            <wp:docPr id="8" name="Picture 8"/>
+            <wp:docPr id="9" name="Picture 9"/>
             <wp:cNvGraphicFramePr>
               <a:graphicFrameLocks noChangeAspect="1"/>
             </wp:cNvGraphicFramePr>
@@ -1793,7 +2332,7 @@
                     <pic:cNvPicPr/>
                   </pic:nvPicPr>
                   <pic:blipFill>
-                    <a:blip r:embed="rId16"/>
+                    <a:blip r:embed="rId17"/>
                     <a:stretch>
                       <a:fillRect/>
                     </a:stretch>
@@ -1835,7 +2374,7 @@
         <w:drawing>
           <wp:inline xmlns:a="http://schemas.openxmlformats.org/drawingml/2006/main" xmlns:pic="http://schemas.openxmlformats.org/drawingml/2006/picture">
             <wp:extent cx="5806440" cy="2292016"/>
-            <wp:docPr id="9" name="Picture 9"/>
+            <wp:docPr id="10" name="Picture 10"/>
             <wp:cNvGraphicFramePr>
               <a:graphicFrameLocks noChangeAspect="1"/>
             </wp:cNvGraphicFramePr>
@@ -1847,7 +2386,7 @@
                     <pic:cNvPicPr/>
                   </pic:nvPicPr>
                   <pic:blipFill>
-                    <a:blip r:embed="rId17"/>
+                    <a:blip r:embed="rId18"/>
                     <a:stretch>
                       <a:fillRect/>
                     </a:stretch>
@@ -1889,7 +2428,7 @@
         <w:drawing>
           <wp:inline xmlns:a="http://schemas.openxmlformats.org/drawingml/2006/main" xmlns:pic="http://schemas.openxmlformats.org/drawingml/2006/picture">
             <wp:extent cx="5806440" cy="3225800"/>
-            <wp:docPr id="10" name="Picture 10"/>
+            <wp:docPr id="11" name="Picture 11"/>
             <wp:cNvGraphicFramePr>
               <a:graphicFrameLocks noChangeAspect="1"/>
             </wp:cNvGraphicFramePr>
@@ -1901,7 +2440,7 @@
                     <pic:cNvPicPr/>
                   </pic:nvPicPr>
                   <pic:blipFill>
-                    <a:blip r:embed="rId18"/>
+                    <a:blip r:embed="rId19"/>
                     <a:stretch>
                       <a:fillRect/>
                     </a:stretch>
@@ -1943,7 +2482,7 @@
         <w:drawing>
           <wp:inline xmlns:a="http://schemas.openxmlformats.org/drawingml/2006/main" xmlns:pic="http://schemas.openxmlformats.org/drawingml/2006/picture">
             <wp:extent cx="5806440" cy="3287984"/>
-            <wp:docPr id="11" name="Picture 11"/>
+            <wp:docPr id="12" name="Picture 12"/>
             <wp:cNvGraphicFramePr>
               <a:graphicFrameLocks noChangeAspect="1"/>
             </wp:cNvGraphicFramePr>
@@ -1955,7 +2494,7 @@
                     <pic:cNvPicPr/>
                   </pic:nvPicPr>
                   <pic:blipFill>
-                    <a:blip r:embed="rId19"/>
+                    <a:blip r:embed="rId20"/>
                     <a:stretch>
                       <a:fillRect/>
                     </a:stretch>
@@ -1997,7 +2536,7 @@
         <w:drawing>
           <wp:inline xmlns:a="http://schemas.openxmlformats.org/drawingml/2006/main" xmlns:pic="http://schemas.openxmlformats.org/drawingml/2006/picture">
             <wp:extent cx="5806440" cy="3225800"/>
-            <wp:docPr id="12" name="Picture 12"/>
+            <wp:docPr id="13" name="Picture 13"/>
             <wp:cNvGraphicFramePr>
               <a:graphicFrameLocks noChangeAspect="1"/>
             </wp:cNvGraphicFramePr>
@@ -2009,7 +2548,7 @@
                     <pic:cNvPicPr/>
                   </pic:nvPicPr>
                   <pic:blipFill>
-                    <a:blip r:embed="rId20"/>
+                    <a:blip r:embed="rId21"/>
                     <a:stretch>
                       <a:fillRect/>
                     </a:stretch>
@@ -2051,7 +2590,7 @@
         <w:drawing>
           <wp:inline xmlns:a="http://schemas.openxmlformats.org/drawingml/2006/main" xmlns:pic="http://schemas.openxmlformats.org/drawingml/2006/picture">
             <wp:extent cx="5806440" cy="3225800"/>
-            <wp:docPr id="13" name="Picture 13"/>
+            <wp:docPr id="14" name="Picture 14"/>
             <wp:cNvGraphicFramePr>
               <a:graphicFrameLocks noChangeAspect="1"/>
             </wp:cNvGraphicFramePr>
@@ -2063,7 +2602,7 @@
                     <pic:cNvPicPr/>
                   </pic:nvPicPr>
                   <pic:blipFill>
-                    <a:blip r:embed="rId21"/>
+                    <a:blip r:embed="rId22"/>
                     <a:stretch>
                       <a:fillRect/>
                     </a:stretch>
@@ -4972,7 +5511,7 @@
         <w:drawing>
           <wp:inline xmlns:a="http://schemas.openxmlformats.org/drawingml/2006/main" xmlns:pic="http://schemas.openxmlformats.org/drawingml/2006/picture">
             <wp:extent cx="5806440" cy="2272085"/>
-            <wp:docPr id="14" name="Picture 14"/>
+            <wp:docPr id="15" name="Picture 15"/>
             <wp:cNvGraphicFramePr>
               <a:graphicFrameLocks noChangeAspect="1"/>
             </wp:cNvGraphicFramePr>
@@ -4984,7 +5523,7 @@
                     <pic:cNvPicPr/>
                   </pic:nvPicPr>
                   <pic:blipFill>
-                    <a:blip r:embed="rId22"/>
+                    <a:blip r:embed="rId23"/>
                     <a:stretch>
                       <a:fillRect/>
                     </a:stretch>
@@ -5026,7 +5565,7 @@
         <w:drawing>
           <wp:inline xmlns:a="http://schemas.openxmlformats.org/drawingml/2006/main" xmlns:pic="http://schemas.openxmlformats.org/drawingml/2006/picture">
             <wp:extent cx="5806440" cy="3210620"/>
-            <wp:docPr id="15" name="Picture 15"/>
+            <wp:docPr id="16" name="Picture 16"/>
             <wp:cNvGraphicFramePr>
               <a:graphicFrameLocks noChangeAspect="1"/>
             </wp:cNvGraphicFramePr>
@@ -5038,7 +5577,7 @@
                     <pic:cNvPicPr/>
                   </pic:nvPicPr>
                   <pic:blipFill>
-                    <a:blip r:embed="rId23"/>
+                    <a:blip r:embed="rId24"/>
                     <a:stretch>
                       <a:fillRect/>
                     </a:stretch>
@@ -5080,7 +5619,7 @@
         <w:drawing>
           <wp:inline xmlns:a="http://schemas.openxmlformats.org/drawingml/2006/main" xmlns:pic="http://schemas.openxmlformats.org/drawingml/2006/picture">
             <wp:extent cx="5806440" cy="2998931"/>
-            <wp:docPr id="16" name="Picture 16"/>
+            <wp:docPr id="17" name="Picture 17"/>
             <wp:cNvGraphicFramePr>
               <a:graphicFrameLocks noChangeAspect="1"/>
             </wp:cNvGraphicFramePr>
@@ -5092,7 +5631,7 @@
                     <pic:cNvPicPr/>
                   </pic:nvPicPr>
                   <pic:blipFill>
-                    <a:blip r:embed="rId24"/>
+                    <a:blip r:embed="rId25"/>
                     <a:stretch>
                       <a:fillRect/>
                     </a:stretch>
@@ -6014,7 +6553,7 @@
         <w:drawing>
           <wp:inline xmlns:a="http://schemas.openxmlformats.org/drawingml/2006/main" xmlns:pic="http://schemas.openxmlformats.org/drawingml/2006/picture">
             <wp:extent cx="5806440" cy="2272085"/>
-            <wp:docPr id="17" name="Picture 17"/>
+            <wp:docPr id="18" name="Picture 18"/>
             <wp:cNvGraphicFramePr>
               <a:graphicFrameLocks noChangeAspect="1"/>
             </wp:cNvGraphicFramePr>
@@ -6026,7 +6565,7 @@
                     <pic:cNvPicPr/>
                   </pic:nvPicPr>
                   <pic:blipFill>
-                    <a:blip r:embed="rId25"/>
+                    <a:blip r:embed="rId26"/>
                     <a:stretch>
                       <a:fillRect/>
                     </a:stretch>
@@ -6068,7 +6607,7 @@
         <w:drawing>
           <wp:inline xmlns:a="http://schemas.openxmlformats.org/drawingml/2006/main" xmlns:pic="http://schemas.openxmlformats.org/drawingml/2006/picture">
             <wp:extent cx="5806440" cy="2272085"/>
-            <wp:docPr id="18" name="Picture 18"/>
+            <wp:docPr id="19" name="Picture 19"/>
             <wp:cNvGraphicFramePr>
               <a:graphicFrameLocks noChangeAspect="1"/>
             </wp:cNvGraphicFramePr>
@@ -6080,7 +6619,7 @@
                     <pic:cNvPicPr/>
                   </pic:nvPicPr>
                   <pic:blipFill>
-                    <a:blip r:embed="rId26"/>
+                    <a:blip r:embed="rId27"/>
                     <a:stretch>
                       <a:fillRect/>
                     </a:stretch>
@@ -6122,7 +6661,7 @@
         <w:drawing>
           <wp:inline xmlns:a="http://schemas.openxmlformats.org/drawingml/2006/main" xmlns:pic="http://schemas.openxmlformats.org/drawingml/2006/picture">
             <wp:extent cx="5806440" cy="3210620"/>
-            <wp:docPr id="19" name="Picture 19"/>
+            <wp:docPr id="20" name="Picture 20"/>
             <wp:cNvGraphicFramePr>
               <a:graphicFrameLocks noChangeAspect="1"/>
             </wp:cNvGraphicFramePr>
@@ -6134,7 +6673,7 @@
                     <pic:cNvPicPr/>
                   </pic:nvPicPr>
                   <pic:blipFill>
-                    <a:blip r:embed="rId27"/>
+                    <a:blip r:embed="rId28"/>
                     <a:stretch>
                       <a:fillRect/>
                     </a:stretch>
@@ -6176,7 +6715,7 @@
         <w:drawing>
           <wp:inline xmlns:a="http://schemas.openxmlformats.org/drawingml/2006/main" xmlns:pic="http://schemas.openxmlformats.org/drawingml/2006/picture">
             <wp:extent cx="5806440" cy="2998931"/>
-            <wp:docPr id="20" name="Picture 20"/>
+            <wp:docPr id="21" name="Picture 21"/>
             <wp:cNvGraphicFramePr>
               <a:graphicFrameLocks noChangeAspect="1"/>
             </wp:cNvGraphicFramePr>
@@ -6188,7 +6727,7 @@
                     <pic:cNvPicPr/>
                   </pic:nvPicPr>
                   <pic:blipFill>
-                    <a:blip r:embed="rId28"/>
+                    <a:blip r:embed="rId29"/>
                     <a:stretch>
                       <a:fillRect/>
                     </a:stretch>

</xml_diff>

<commit_message>
hws-analysis: spell out legacy and switchdev flow tables
Both modes keep the NIC_RX, NIC_TX, and FDB roots. Legacy fills an L2
FDB and per-function NIC tables. Switchdev fills the slow-path FDB,
the OFFLOADS receive tables, and is the only mode that can enable HWS.

Co-authored-by: zsdaka <zsdaka@users.noreply.github.com>
</commit_message>
<xml_diff>
--- a/mlx5-hws-analysis/mlx5-hws-model.docx
+++ b/mlx5-hws-analysis/mlx5-hws-model.docx
@@ -1584,7 +1584,1757 @@
           <w:b w:val="0"/>
           <w:sz w:val="22"/>
         </w:rPr>
-        <w:t>NIC_RX 的 KERNEL namespace 由 en_fs.c 建 TTC。fs_ttc.c 用外层 ethertype、IP 版本和 L4 协议做 key，目的地类型是 TIR，tir_num 指向 RSS 或 direct TIR。NIC_TX 的表做该 function 发出方向的 IPsec 和 MACsec。软件转向代码里，NIC_RX 的重格式化只接受隧道到 L2，NIC_TX 只接受 L2 到隧道。HWS 动作枚举里没有 TIR。FDB 命中后的典型终结是 vport 或丢弃；报文到达目的 function 之后，再进入那个 function 的 NIC_RX 域，由 TIR 选择 RQ。</w:t>
+        <w:t>上面这张慢路径表是 switchdev 的 FDB。NIC_RX 的 KERNEL namespace 由 en_fs.c 建 TTC，两种模式的本机网口都会建。fs_ttc.c 用外层 ethertype、IP 版本和 L4 协议做 key，目的地类型是 TIR，tir_num 指向 RSS 或 direct TIR。HWS 动作枚举里没有 TIR。</w:t>
+      </w:r>
+    </w:p>
+    <w:p>
+      <w:pPr>
+        <w:pStyle w:val="Heading2"/>
+      </w:pPr>
+      <w:r>
+        <w:rPr>
+          <w:rFonts w:ascii="Calibri" w:hAnsi="Calibri" w:eastAsia="微软雅黑"/>
+          <w:b/>
+          <w:color w:val="1B3A4B"/>
+          <w:sz w:val="30"/>
+        </w:rPr>
+        <w:t>3.4  legacy 和 switchdev</w:t>
+      </w:r>
+    </w:p>
+    <w:p>
+      <w:pPr>
+        <w:spacing w:after="120" w:before="0" w:line="276" w:lineRule="auto"/>
+      </w:pPr>
+      <w:r>
+        <w:rPr>
+          <w:rFonts w:ascii="Calibri" w:hAnsi="Calibri" w:eastAsia="微软雅黑"/>
+          <w:b w:val="0"/>
+          <w:sz w:val="22"/>
+        </w:rPr>
+        <w:t>两个模式都保留 NIC_RX、NIC_TX、FDB 三个根。eswitch 创建时 mode 写成 MLX5_ESWITCH_LEGACY，devlink 切到 switchdev 之后变成 MLX5_ESWITCH_OFFLOADS。变的是每个根里实际创建的流表和规则，以及 FDB 能不能离开固件流表。ACL 另有表类型 FS_FT_ESW_INGRESS_ACL 和 FS_FT_ESW_EGRESS_ACL，按 vport 各有一个根，两种模式都配，规则不一样。没开 eswitch 的纯网卡不走这两条路径，只有 NIC_RX 和 NIC_TX。</w:t>
+      </w:r>
+    </w:p>
+    <w:p>
+      <w:pPr>
+        <w:pStyle w:val="Heading2"/>
+      </w:pPr>
+      <w:r>
+        <w:rPr>
+          <w:rFonts w:ascii="Calibri" w:hAnsi="Calibri" w:eastAsia="微软雅黑"/>
+          <w:b/>
+          <w:color w:val="1B3A4B"/>
+          <w:sz w:val="30"/>
+        </w:rPr>
+        <w:t>3.5  legacy</w:t>
+      </w:r>
+    </w:p>
+    <w:p>
+      <w:pPr>
+        <w:jc w:val="center"/>
+      </w:pPr>
+      <w:r>
+        <w:drawing>
+          <wp:inline xmlns:a="http://schemas.openxmlformats.org/drawingml/2006/main" xmlns:pic="http://schemas.openxmlformats.org/drawingml/2006/picture">
+            <wp:extent cx="5806440" cy="3425355"/>
+            <wp:docPr id="2" name="Picture 2"/>
+            <wp:cNvGraphicFramePr>
+              <a:graphicFrameLocks noChangeAspect="1"/>
+            </wp:cNvGraphicFramePr>
+            <a:graphic>
+              <a:graphicData uri="http://schemas.openxmlformats.org/drawingml/2006/picture">
+                <pic:pic>
+                  <pic:nvPicPr>
+                    <pic:cNvPr id="0" name="22_legacy.png"/>
+                    <pic:cNvPicPr/>
+                  </pic:nvPicPr>
+                  <pic:blipFill>
+                    <a:blip r:embed="rId10"/>
+                    <a:stretch>
+                      <a:fillRect/>
+                    </a:stretch>
+                  </pic:blipFill>
+                  <pic:spPr>
+                    <a:xfrm>
+                      <a:off x="0" y="0"/>
+                      <a:ext cx="5806440" cy="3425355"/>
+                    </a:xfrm>
+                    <a:prstGeom prst="rect"/>
+                  </pic:spPr>
+                </pic:pic>
+              </a:graphicData>
+            </a:graphic>
+          </wp:inline>
+        </w:drawing>
+      </w:r>
+    </w:p>
+    <w:p>
+      <w:pPr>
+        <w:spacing w:after="240"/>
+        <w:jc w:val="center"/>
+      </w:pPr>
+      <w:r>
+        <w:rPr>
+          <w:rFonts w:ascii="Calibri" w:hAnsi="Calibri" w:eastAsia="微软雅黑"/>
+          <w:b w:val="0"/>
+          <w:color w:val="3C4650"/>
+          <w:sz w:val="18"/>
+        </w:rPr>
+        <w:t>图 22  legacy。FDB 按目的 MAC 选 vport，收包仍走该 function 自己的 NIC_RX</w:t>
+      </w:r>
+    </w:p>
+    <w:p>
+      <w:pPr>
+        <w:spacing w:after="120" w:before="0" w:line="276" w:lineRule="auto"/>
+      </w:pPr>
+      <w:r>
+        <w:rPr>
+          <w:rFonts w:ascii="Calibri" w:hAnsi="Calibri" w:eastAsia="微软雅黑"/>
+          <w:b w:val="0"/>
+          <w:sz w:val="22"/>
+        </w:rPr>
+        <w:t>esw_legacy_enable() 调用 esw_create_legacy_fdb_table()。表建在 mlx5_get_fdb_sub_ns(dev, 0)，也就是 FDB_TC_OFFLOAD 优先级下的第 0 个 chain namespace，优先级 LEGACY_FDB_PRIO = 1。命令留在固件流表，set_mode() 不会被调用，所以没有 smfs 域，也没有 hmfs context。</w:t>
+      </w:r>
+    </w:p>
+    <w:tbl>
+      <w:tblPr>
+        <w:tblStyle w:val="TableGrid"/>
+        <w:tblW w:type="auto" w:w="0"/>
+        <w:tblLook w:firstColumn="1" w:firstRow="1" w:lastColumn="0" w:lastRow="0" w:noHBand="0" w:noVBand="1" w:val="04A0"/>
+      </w:tblPr>
+      <w:tblGrid>
+        <w:gridCol w:w="2550"/>
+        <w:gridCol w:w="2550"/>
+        <w:gridCol w:w="2550"/>
+        <w:gridCol w:w="2550"/>
+      </w:tblGrid>
+      <w:tr>
+        <w:tc>
+          <w:tcPr>
+            <w:tcW w:type="dxa" w:w="2550"/>
+            <w:shd w:fill="1B3A4B" w:val="clear"/>
+          </w:tcPr>
+          <w:p>
+            <w:r/>
+            <w:r>
+              <w:rPr>
+                <w:rFonts w:ascii="Calibri" w:hAnsi="Calibri" w:eastAsia="微软雅黑"/>
+                <w:b/>
+                <w:color w:val="FFFFFF"/>
+                <w:sz w:val="18"/>
+              </w:rPr>
+              <w:t>表</w:t>
+            </w:r>
+          </w:p>
+        </w:tc>
+        <w:tc>
+          <w:tcPr>
+            <w:tcW w:type="dxa" w:w="2550"/>
+            <w:shd w:fill="1B3A4B" w:val="clear"/>
+          </w:tcPr>
+          <w:p>
+            <w:r/>
+            <w:r>
+              <w:rPr>
+                <w:rFonts w:ascii="Calibri" w:hAnsi="Calibri" w:eastAsia="微软雅黑"/>
+                <w:b/>
+                <w:color w:val="FFFFFF"/>
+                <w:sz w:val="18"/>
+              </w:rPr>
+              <w:t>位置</w:t>
+            </w:r>
+          </w:p>
+        </w:tc>
+        <w:tc>
+          <w:tcPr>
+            <w:tcW w:type="dxa" w:w="2550"/>
+            <w:shd w:fill="1B3A4B" w:val="clear"/>
+          </w:tcPr>
+          <w:p>
+            <w:r/>
+            <w:r>
+              <w:rPr>
+                <w:rFonts w:ascii="Calibri" w:hAnsi="Calibri" w:eastAsia="微软雅黑"/>
+                <w:b/>
+                <w:color w:val="FFFFFF"/>
+                <w:sz w:val="18"/>
+              </w:rPr>
+              <w:t>key</w:t>
+            </w:r>
+          </w:p>
+        </w:tc>
+        <w:tc>
+          <w:tcPr>
+            <w:tcW w:type="dxa" w:w="2550"/>
+            <w:shd w:fill="1B3A4B" w:val="clear"/>
+          </w:tcPr>
+          <w:p>
+            <w:r/>
+            <w:r>
+              <w:rPr>
+                <w:rFonts w:ascii="Calibri" w:hAnsi="Calibri" w:eastAsia="微软雅黑"/>
+                <w:b/>
+                <w:color w:val="FFFFFF"/>
+                <w:sz w:val="18"/>
+              </w:rPr>
+              <w:t>action</w:t>
+            </w:r>
+          </w:p>
+        </w:tc>
+      </w:tr>
+      <w:tr>
+        <w:tc>
+          <w:tcPr>
+            <w:tcW w:type="dxa" w:w="2550"/>
+          </w:tcPr>
+          <w:p>
+            <w:r/>
+            <w:r>
+              <w:rPr>
+                <w:rFonts w:ascii="Calibri" w:hAnsi="Calibri" w:eastAsia="微软雅黑"/>
+                <w:b w:val="0"/>
+                <w:sz w:val="16"/>
+              </w:rPr>
+              <w:t>主 FDB，地址组</w:t>
+            </w:r>
+          </w:p>
+        </w:tc>
+        <w:tc>
+          <w:tcPr>
+            <w:tcW w:type="dxa" w:w="2550"/>
+          </w:tcPr>
+          <w:p>
+            <w:r/>
+            <w:r>
+              <w:rPr>
+                <w:rFonts w:ascii="Calibri" w:hAnsi="Calibri" w:eastAsia="微软雅黑"/>
+                <w:b w:val="0"/>
+                <w:sz w:val="16"/>
+              </w:rPr>
+              <w:t>chain 0，prio 1，索引 0 到 size-3</w:t>
+            </w:r>
+          </w:p>
+        </w:tc>
+        <w:tc>
+          <w:tcPr>
+            <w:tcW w:type="dxa" w:w="2550"/>
+          </w:tcPr>
+          <w:p>
+            <w:r/>
+            <w:r>
+              <w:rPr>
+                <w:rFonts w:ascii="Calibri" w:hAnsi="Calibri" w:eastAsia="微软雅黑"/>
+                <w:b w:val="0"/>
+                <w:sz w:val="16"/>
+              </w:rPr>
+              <w:t>外层 DMAC 全匹配</w:t>
+            </w:r>
+          </w:p>
+        </w:tc>
+        <w:tc>
+          <w:tcPr>
+            <w:tcW w:type="dxa" w:w="2550"/>
+          </w:tcPr>
+          <w:p>
+            <w:r/>
+            <w:r>
+              <w:rPr>
+                <w:rFonts w:ascii="Calibri" w:hAnsi="Calibri" w:eastAsia="微软雅黑"/>
+                <w:b w:val="0"/>
+                <w:sz w:val="16"/>
+              </w:rPr>
+              <w:t>转到拥有该 MAC 的 vport</w:t>
+            </w:r>
+          </w:p>
+        </w:tc>
+      </w:tr>
+      <w:tr>
+        <w:tc>
+          <w:tcPr>
+            <w:tcW w:type="dxa" w:w="2550"/>
+          </w:tcPr>
+          <w:p>
+            <w:r/>
+            <w:r>
+              <w:rPr>
+                <w:rFonts w:ascii="Calibri" w:hAnsi="Calibri" w:eastAsia="微软雅黑"/>
+                <w:b w:val="0"/>
+                <w:sz w:val="16"/>
+              </w:rPr>
+              <w:t>主 FDB，allmulti</w:t>
+            </w:r>
+          </w:p>
+        </w:tc>
+        <w:tc>
+          <w:tcPr>
+            <w:tcW w:type="dxa" w:w="2550"/>
+          </w:tcPr>
+          <w:p>
+            <w:r/>
+            <w:r>
+              <w:rPr>
+                <w:rFonts w:ascii="Calibri" w:hAnsi="Calibri" w:eastAsia="微软雅黑"/>
+                <w:b w:val="0"/>
+                <w:sz w:val="16"/>
+              </w:rPr>
+              <w:t>同一张表，索引 size-2</w:t>
+            </w:r>
+          </w:p>
+        </w:tc>
+        <w:tc>
+          <w:tcPr>
+            <w:tcW w:type="dxa" w:w="2550"/>
+          </w:tcPr>
+          <w:p>
+            <w:r/>
+            <w:r>
+              <w:rPr>
+                <w:rFonts w:ascii="Calibri" w:hAnsi="Calibri" w:eastAsia="微软雅黑"/>
+                <w:b w:val="0"/>
+                <w:sz w:val="16"/>
+              </w:rPr>
+              <w:t>外层 DMAC 的组播位</w:t>
+            </w:r>
+          </w:p>
+        </w:tc>
+        <w:tc>
+          <w:tcPr>
+            <w:tcW w:type="dxa" w:w="2550"/>
+          </w:tcPr>
+          <w:p>
+            <w:r/>
+            <w:r>
+              <w:rPr>
+                <w:rFonts w:ascii="Calibri" w:hAnsi="Calibri" w:eastAsia="微软雅黑"/>
+                <w:b w:val="0"/>
+                <w:sz w:val="16"/>
+              </w:rPr>
+              <w:t>转到打开 allmulti 的 vport</w:t>
+            </w:r>
+          </w:p>
+        </w:tc>
+      </w:tr>
+      <w:tr>
+        <w:tc>
+          <w:tcPr>
+            <w:tcW w:type="dxa" w:w="2550"/>
+          </w:tcPr>
+          <w:p>
+            <w:r/>
+            <w:r>
+              <w:rPr>
+                <w:rFonts w:ascii="Calibri" w:hAnsi="Calibri" w:eastAsia="微软雅黑"/>
+                <w:b w:val="0"/>
+                <w:sz w:val="16"/>
+              </w:rPr>
+              <w:t>主 FDB，混杂</w:t>
+            </w:r>
+          </w:p>
+        </w:tc>
+        <w:tc>
+          <w:tcPr>
+            <w:tcW w:type="dxa" w:w="2550"/>
+          </w:tcPr>
+          <w:p>
+            <w:r/>
+            <w:r>
+              <w:rPr>
+                <w:rFonts w:ascii="Calibri" w:hAnsi="Calibri" w:eastAsia="微软雅黑"/>
+                <w:b w:val="0"/>
+                <w:sz w:val="16"/>
+              </w:rPr>
+              <w:t>同一张表，索引 size-1</w:t>
+            </w:r>
+          </w:p>
+        </w:tc>
+        <w:tc>
+          <w:tcPr>
+            <w:tcW w:type="dxa" w:w="2550"/>
+          </w:tcPr>
+          <w:p>
+            <w:r/>
+            <w:r>
+              <w:rPr>
+                <w:rFonts w:ascii="Calibri" w:hAnsi="Calibri" w:eastAsia="微软雅黑"/>
+                <w:b w:val="0"/>
+                <w:sz w:val="16"/>
+              </w:rPr>
+              <w:t>source_port = uplink</w:t>
+            </w:r>
+          </w:p>
+        </w:tc>
+        <w:tc>
+          <w:tcPr>
+            <w:tcW w:type="dxa" w:w="2550"/>
+          </w:tcPr>
+          <w:p>
+            <w:r/>
+            <w:r>
+              <w:rPr>
+                <w:rFonts w:ascii="Calibri" w:hAnsi="Calibri" w:eastAsia="微软雅黑"/>
+                <w:b w:val="0"/>
+                <w:sz w:val="16"/>
+              </w:rPr>
+              <w:t>转到打开混杂的 vport</w:t>
+            </w:r>
+          </w:p>
+        </w:tc>
+      </w:tr>
+      <w:tr>
+        <w:tc>
+          <w:tcPr>
+            <w:tcW w:type="dxa" w:w="2550"/>
+          </w:tcPr>
+          <w:p>
+            <w:r/>
+            <w:r>
+              <w:rPr>
+                <w:rFonts w:ascii="Calibri" w:hAnsi="Calibri" w:eastAsia="微软雅黑"/>
+                <w:b w:val="0"/>
+                <w:sz w:val="16"/>
+              </w:rPr>
+              <w:t>VEPA</w:t>
+            </w:r>
+          </w:p>
+        </w:tc>
+        <w:tc>
+          <w:tcPr>
+            <w:tcW w:type="dxa" w:w="2550"/>
+          </w:tcPr>
+          <w:p>
+            <w:r/>
+            <w:r>
+              <w:rPr>
+                <w:rFonts w:ascii="Calibri" w:hAnsi="Calibri" w:eastAsia="微软雅黑"/>
+                <w:b w:val="0"/>
+                <w:sz w:val="16"/>
+              </w:rPr>
+              <w:t>同一 namespace，prio 0，只在打开 VEPA 时创建</w:t>
+            </w:r>
+          </w:p>
+        </w:tc>
+        <w:tc>
+          <w:tcPr>
+            <w:tcW w:type="dxa" w:w="2550"/>
+          </w:tcPr>
+          <w:p>
+            <w:r/>
+            <w:r>
+              <w:rPr>
+                <w:rFonts w:ascii="Calibri" w:hAnsi="Calibri" w:eastAsia="微软雅黑"/>
+                <w:b w:val="0"/>
+                <w:sz w:val="16"/>
+              </w:rPr>
+              <w:t>source_port = uplink</w:t>
+            </w:r>
+          </w:p>
+        </w:tc>
+        <w:tc>
+          <w:tcPr>
+            <w:tcW w:type="dxa" w:w="2550"/>
+          </w:tcPr>
+          <w:p>
+            <w:r/>
+            <w:r>
+              <w:rPr>
+                <w:rFonts w:ascii="Calibri" w:hAnsi="Calibri" w:eastAsia="微软雅黑"/>
+                <w:b w:val="0"/>
+                <w:sz w:val="16"/>
+              </w:rPr>
+              <w:t>转到主 FDB；另一条把其余流量转到 uplink vport</w:t>
+            </w:r>
+          </w:p>
+        </w:tc>
+      </w:tr>
+      <w:tr>
+        <w:tc>
+          <w:tcPr>
+            <w:tcW w:type="dxa" w:w="2550"/>
+          </w:tcPr>
+          <w:p>
+            <w:r/>
+            <w:r>
+              <w:rPr>
+                <w:rFonts w:ascii="Calibri" w:hAnsi="Calibri" w:eastAsia="微软雅黑"/>
+                <w:b w:val="0"/>
+                <w:sz w:val="16"/>
+              </w:rPr>
+              <w:t>ingress ACL</w:t>
+            </w:r>
+          </w:p>
+        </w:tc>
+        <w:tc>
+          <w:tcPr>
+            <w:tcW w:type="dxa" w:w="2550"/>
+          </w:tcPr>
+          <w:p>
+            <w:r/>
+            <w:r>
+              <w:rPr>
+                <w:rFonts w:ascii="Calibri" w:hAnsi="Calibri" w:eastAsia="微软雅黑"/>
+                <w:b w:val="0"/>
+                <w:sz w:val="16"/>
+              </w:rPr>
+              <w:t>非管理 vport 的 ESW_INGRESS</w:t>
+            </w:r>
+          </w:p>
+        </w:tc>
+        <w:tc>
+          <w:tcPr>
+            <w:tcW w:type="dxa" w:w="2550"/>
+          </w:tcPr>
+          <w:p>
+            <w:r/>
+            <w:r>
+              <w:rPr>
+                <w:rFonts w:ascii="Calibri" w:hAnsi="Calibri" w:eastAsia="微软雅黑"/>
+                <w:b w:val="0"/>
+                <w:sz w:val="16"/>
+              </w:rPr>
+              <w:t>CVLAN 标签、SMAC</w:t>
+            </w:r>
+          </w:p>
+        </w:tc>
+        <w:tc>
+          <w:tcPr>
+            <w:tcW w:type="dxa" w:w="2550"/>
+          </w:tcPr>
+          <w:p>
+            <w:r/>
+            <w:r>
+              <w:rPr>
+                <w:rFonts w:ascii="Calibri" w:hAnsi="Calibri" w:eastAsia="微软雅黑"/>
+                <w:b w:val="0"/>
+                <w:sz w:val="16"/>
+              </w:rPr>
+              <w:t>允许合法源，其余丢弃</w:t>
+            </w:r>
+          </w:p>
+        </w:tc>
+      </w:tr>
+      <w:tr>
+        <w:tc>
+          <w:tcPr>
+            <w:tcW w:type="dxa" w:w="2550"/>
+          </w:tcPr>
+          <w:p>
+            <w:r/>
+            <w:r>
+              <w:rPr>
+                <w:rFonts w:ascii="Calibri" w:hAnsi="Calibri" w:eastAsia="微软雅黑"/>
+                <w:b w:val="0"/>
+                <w:sz w:val="16"/>
+              </w:rPr>
+              <w:t>egress ACL</w:t>
+            </w:r>
+          </w:p>
+        </w:tc>
+        <w:tc>
+          <w:tcPr>
+            <w:tcW w:type="dxa" w:w="2550"/>
+          </w:tcPr>
+          <w:p>
+            <w:r/>
+            <w:r>
+              <w:rPr>
+                <w:rFonts w:ascii="Calibri" w:hAnsi="Calibri" w:eastAsia="微软雅黑"/>
+                <w:b w:val="0"/>
+                <w:sz w:val="16"/>
+              </w:rPr>
+              <w:t>非管理 vport 的 ESW_EGRESS</w:t>
+            </w:r>
+          </w:p>
+        </w:tc>
+        <w:tc>
+          <w:tcPr>
+            <w:tcW w:type="dxa" w:w="2550"/>
+          </w:tcPr>
+          <w:p>
+            <w:r/>
+            <w:r>
+              <w:rPr>
+                <w:rFonts w:ascii="Calibri" w:hAnsi="Calibri" w:eastAsia="微软雅黑"/>
+                <w:b w:val="0"/>
+                <w:sz w:val="16"/>
+              </w:rPr>
+              <w:t>外层 CVLAN VID</w:t>
+            </w:r>
+          </w:p>
+        </w:tc>
+        <w:tc>
+          <w:tcPr>
+            <w:tcW w:type="dxa" w:w="2550"/>
+          </w:tcPr>
+          <w:p>
+            <w:r/>
+            <w:r>
+              <w:rPr>
+                <w:rFonts w:ascii="Calibri" w:hAnsi="Calibri" w:eastAsia="微软雅黑"/>
+                <w:b w:val="0"/>
+                <w:sz w:val="16"/>
+              </w:rPr>
+              <w:t>允许指定 VLAN，其余丢弃并计数</w:t>
+            </w:r>
+          </w:p>
+        </w:tc>
+      </w:tr>
+      <w:tr>
+        <w:tc>
+          <w:tcPr>
+            <w:tcW w:type="dxa" w:w="2550"/>
+          </w:tcPr>
+          <w:p>
+            <w:r/>
+            <w:r>
+              <w:rPr>
+                <w:rFonts w:ascii="Calibri" w:hAnsi="Calibri" w:eastAsia="微软雅黑"/>
+                <w:b w:val="0"/>
+                <w:sz w:val="16"/>
+              </w:rPr>
+              <w:t>NIC_RX</w:t>
+            </w:r>
+          </w:p>
+        </w:tc>
+        <w:tc>
+          <w:tcPr>
+            <w:tcW w:type="dxa" w:w="2550"/>
+          </w:tcPr>
+          <w:p>
+            <w:r/>
+            <w:r>
+              <w:rPr>
+                <w:rFonts w:ascii="Calibri" w:hAnsi="Calibri" w:eastAsia="微软雅黑"/>
+                <w:b w:val="0"/>
+                <w:sz w:val="16"/>
+              </w:rPr>
+              <w:t>PF，以及客户机里的每个 VF</w:t>
+            </w:r>
+          </w:p>
+        </w:tc>
+        <w:tc>
+          <w:tcPr>
+            <w:tcW w:type="dxa" w:w="2550"/>
+          </w:tcPr>
+          <w:p>
+            <w:r/>
+            <w:r>
+              <w:rPr>
+                <w:rFonts w:ascii="Calibri" w:hAnsi="Calibri" w:eastAsia="微软雅黑"/>
+                <w:b w:val="0"/>
+                <w:sz w:val="16"/>
+              </w:rPr>
+              <w:t>KERNEL 的 L2、TTC</w:t>
+            </w:r>
+          </w:p>
+        </w:tc>
+        <w:tc>
+          <w:tcPr>
+            <w:tcW w:type="dxa" w:w="2550"/>
+          </w:tcPr>
+          <w:p>
+            <w:r/>
+            <w:r>
+              <w:rPr>
+                <w:rFonts w:ascii="Calibri" w:hAnsi="Calibri" w:eastAsia="微软雅黑"/>
+                <w:b w:val="0"/>
+                <w:sz w:val="16"/>
+              </w:rPr>
+              <w:t>本 function 的 TIR</w:t>
+            </w:r>
+          </w:p>
+        </w:tc>
+      </w:tr>
+      <w:tr>
+        <w:tc>
+          <w:tcPr>
+            <w:tcW w:type="dxa" w:w="2550"/>
+          </w:tcPr>
+          <w:p>
+            <w:r/>
+            <w:r>
+              <w:rPr>
+                <w:rFonts w:ascii="Calibri" w:hAnsi="Calibri" w:eastAsia="微软雅黑"/>
+                <w:b w:val="0"/>
+                <w:sz w:val="16"/>
+              </w:rPr>
+              <w:t>NIC_TX</w:t>
+            </w:r>
+          </w:p>
+        </w:tc>
+        <w:tc>
+          <w:tcPr>
+            <w:tcW w:type="dxa" w:w="2550"/>
+          </w:tcPr>
+          <w:p>
+            <w:r/>
+            <w:r>
+              <w:rPr>
+                <w:rFonts w:ascii="Calibri" w:hAnsi="Calibri" w:eastAsia="微软雅黑"/>
+                <w:b w:val="0"/>
+                <w:sz w:val="16"/>
+              </w:rPr>
+              <w:t>同上</w:t>
+            </w:r>
+          </w:p>
+        </w:tc>
+        <w:tc>
+          <w:tcPr>
+            <w:tcW w:type="dxa" w:w="2550"/>
+          </w:tcPr>
+          <w:p>
+            <w:r/>
+            <w:r>
+              <w:rPr>
+                <w:rFonts w:ascii="Calibri" w:hAnsi="Calibri" w:eastAsia="微软雅黑"/>
+                <w:b w:val="0"/>
+                <w:sz w:val="16"/>
+              </w:rPr>
+              <w:t>EGRESS、IPsec、MACsec</w:t>
+            </w:r>
+          </w:p>
+        </w:tc>
+        <w:tc>
+          <w:tcPr>
+            <w:tcW w:type="dxa" w:w="2550"/>
+          </w:tcPr>
+          <w:p>
+            <w:r/>
+            <w:r>
+              <w:rPr>
+                <w:rFonts w:ascii="Calibri" w:hAnsi="Calibri" w:eastAsia="微软雅黑"/>
+                <w:b w:val="0"/>
+                <w:sz w:val="16"/>
+              </w:rPr>
+              <w:t>改头或封装后离开该 function</w:t>
+            </w:r>
+          </w:p>
+        </w:tc>
+      </w:tr>
+    </w:tbl>
+    <w:p/>
+    <w:p>
+      <w:pPr>
+        <w:spacing w:after="120" w:before="0" w:line="276" w:lineRule="auto"/>
+      </w:pPr>
+      <w:r>
+        <w:rPr>
+          <w:rFonts w:ascii="Calibri" w:hAnsi="Calibri" w:eastAsia="微软雅黑"/>
+          <w:b w:val="0"/>
+          <w:sz w:val="18"/>
+        </w:rPr>
+        <w:t>表 5  legacy 实际创建的表。管理 vport 不建 legacy ACL。</w:t>
+      </w:r>
+    </w:p>
+    <w:p>
+      <w:pPr>
+        <w:spacing w:after="120" w:before="0" w:line="276" w:lineRule="auto"/>
+      </w:pPr>
+      <w:r>
+        <w:rPr>
+          <w:rFonts w:ascii="Calibri" w:hAnsi="Calibri" w:eastAsia="微软雅黑"/>
+          <w:b w:val="0"/>
+          <w:sz w:val="22"/>
+        </w:rPr>
+        <w:t>线侧报文先在这张 FDB 里按目的 MAC 选 vport，然后进入那个 function 自己的 NIC_RX，再由 TIR 选 RQ。VF 发出的报文先过该 VF 的 NIC_TX，再回到同一张 FDB。地址规则在 __esw_fdb_set_vport_rule() 里写，目的地类型是 VPORT。</w:t>
+      </w:r>
+    </w:p>
+    <w:p>
+      <w:pPr>
+        <w:pStyle w:val="Heading2"/>
+      </w:pPr>
+      <w:r>
+        <w:rPr>
+          <w:rFonts w:ascii="Calibri" w:hAnsi="Calibri" w:eastAsia="微软雅黑"/>
+          <w:b/>
+          <w:color w:val="1B3A4B"/>
+          <w:sz w:val="30"/>
+        </w:rPr>
+        <w:t>3.6  switchdev</w:t>
+      </w:r>
+    </w:p>
+    <w:p>
+      <w:pPr>
+        <w:jc w:val="center"/>
+      </w:pPr>
+      <w:r>
+        <w:drawing>
+          <wp:inline xmlns:a="http://schemas.openxmlformats.org/drawingml/2006/main" xmlns:pic="http://schemas.openxmlformats.org/drawingml/2006/picture">
+            <wp:extent cx="5806440" cy="3499417"/>
+            <wp:docPr id="3" name="Picture 3"/>
+            <wp:cNvGraphicFramePr>
+              <a:graphicFrameLocks noChangeAspect="1"/>
+            </wp:cNvGraphicFramePr>
+            <a:graphic>
+              <a:graphicData uri="http://schemas.openxmlformats.org/drawingml/2006/picture">
+                <pic:pic>
+                  <pic:nvPicPr>
+                    <pic:cNvPr id="0" name="23_switchdev.png"/>
+                    <pic:cNvPicPr/>
+                  </pic:nvPicPr>
+                  <pic:blipFill>
+                    <a:blip r:embed="rId11"/>
+                    <a:stretch>
+                      <a:fillRect/>
+                    </a:stretch>
+                  </pic:blipFill>
+                  <pic:spPr>
+                    <a:xfrm>
+                      <a:off x="0" y="0"/>
+                      <a:ext cx="5806440" cy="3499417"/>
+                    </a:xfrm>
+                    <a:prstGeom prst="rect"/>
+                  </pic:spPr>
+                </pic:pic>
+              </a:graphicData>
+            </a:graphic>
+          </wp:inline>
+        </w:drawing>
+      </w:r>
+    </w:p>
+    <w:p>
+      <w:pPr>
+        <w:spacing w:after="240"/>
+        <w:jc w:val="center"/>
+      </w:pPr>
+      <w:r>
+        <w:rPr>
+          <w:rFonts w:ascii="Calibri" w:hAnsi="Calibri" w:eastAsia="微软雅黑"/>
+          <w:b w:val="0"/>
+          <w:color w:val="3C4650"/>
+          <w:sz w:val="18"/>
+        </w:rPr>
+        <w:t>图 23  switchdev。FDB 可以切到 HWS，代表口从 NIC_RX 的 OFFLOADS 表收包</w:t>
+      </w:r>
+    </w:p>
+    <w:p>
+      <w:pPr>
+        <w:spacing w:after="120" w:before="0" w:line="276" w:lineRule="auto"/>
+      </w:pPr>
+      <w:r>
+        <w:rPr>
+          <w:rFonts w:ascii="Calibri" w:hAnsi="Calibri" w:eastAsia="微软雅黑"/>
+          <w:b w:val="0"/>
+          <w:sz w:val="22"/>
+        </w:rPr>
+        <w:t>esw_offloads_enable() 进入 esw_offloads_steering_init()。FDB 表由 esw_create_offloads_fdb_tables() 创建，这里才会调用 mlx5_flow_namespace_set_mode()，所以 smfs 或 hmfs 只出现在这个模式。慢路径表和 TC miss 表挂在 FDB 根上，优先级分别是 FDB_SLOW_PATH 和 FDB_TC_MISS。TC chain 和 FT chain 的 namespace 在 fs_core 初始化时已经排好，表在运行时按 chain 加进去。</w:t>
+      </w:r>
+    </w:p>
+    <w:tbl>
+      <w:tblPr>
+        <w:tblStyle w:val="TableGrid"/>
+        <w:tblW w:type="auto" w:w="0"/>
+        <w:tblLook w:firstColumn="1" w:firstRow="1" w:lastColumn="0" w:lastRow="0" w:noHBand="0" w:noVBand="1" w:val="04A0"/>
+      </w:tblPr>
+      <w:tblGrid>
+        <w:gridCol w:w="2550"/>
+        <w:gridCol w:w="2550"/>
+        <w:gridCol w:w="2550"/>
+        <w:gridCol w:w="2550"/>
+      </w:tblGrid>
+      <w:tr>
+        <w:tc>
+          <w:tcPr>
+            <w:tcW w:type="dxa" w:w="2550"/>
+            <w:shd w:fill="1B3A4B" w:val="clear"/>
+          </w:tcPr>
+          <w:p>
+            <w:r/>
+            <w:r>
+              <w:rPr>
+                <w:rFonts w:ascii="Calibri" w:hAnsi="Calibri" w:eastAsia="微软雅黑"/>
+                <w:b/>
+                <w:color w:val="FFFFFF"/>
+                <w:sz w:val="18"/>
+              </w:rPr>
+              <w:t>表</w:t>
+            </w:r>
+          </w:p>
+        </w:tc>
+        <w:tc>
+          <w:tcPr>
+            <w:tcW w:type="dxa" w:w="2550"/>
+            <w:shd w:fill="1B3A4B" w:val="clear"/>
+          </w:tcPr>
+          <w:p>
+            <w:r/>
+            <w:r>
+              <w:rPr>
+                <w:rFonts w:ascii="Calibri" w:hAnsi="Calibri" w:eastAsia="微软雅黑"/>
+                <w:b/>
+                <w:color w:val="FFFFFF"/>
+                <w:sz w:val="18"/>
+              </w:rPr>
+              <w:t>位置</w:t>
+            </w:r>
+          </w:p>
+        </w:tc>
+        <w:tc>
+          <w:tcPr>
+            <w:tcW w:type="dxa" w:w="2550"/>
+            <w:shd w:fill="1B3A4B" w:val="clear"/>
+          </w:tcPr>
+          <w:p>
+            <w:r/>
+            <w:r>
+              <w:rPr>
+                <w:rFonts w:ascii="Calibri" w:hAnsi="Calibri" w:eastAsia="微软雅黑"/>
+                <w:b/>
+                <w:color w:val="FFFFFF"/>
+                <w:sz w:val="18"/>
+              </w:rPr>
+              <w:t>key</w:t>
+            </w:r>
+          </w:p>
+        </w:tc>
+        <w:tc>
+          <w:tcPr>
+            <w:tcW w:type="dxa" w:w="2550"/>
+            <w:shd w:fill="1B3A4B" w:val="clear"/>
+          </w:tcPr>
+          <w:p>
+            <w:r/>
+            <w:r>
+              <w:rPr>
+                <w:rFonts w:ascii="Calibri" w:hAnsi="Calibri" w:eastAsia="微软雅黑"/>
+                <w:b/>
+                <w:color w:val="FFFFFF"/>
+                <w:sz w:val="18"/>
+              </w:rPr>
+              <w:t>action</w:t>
+            </w:r>
+          </w:p>
+        </w:tc>
+      </w:tr>
+      <w:tr>
+        <w:tc>
+          <w:tcPr>
+            <w:tcW w:type="dxa" w:w="2550"/>
+          </w:tcPr>
+          <w:p>
+            <w:r/>
+            <w:r>
+              <w:rPr>
+                <w:rFonts w:ascii="Calibri" w:hAnsi="Calibri" w:eastAsia="微软雅黑"/>
+                <w:b w:val="0"/>
+                <w:sz w:val="16"/>
+              </w:rPr>
+              <w:t>慢路径 send-to-vport</w:t>
+            </w:r>
+          </w:p>
+        </w:tc>
+        <w:tc>
+          <w:tcPr>
+            <w:tcW w:type="dxa" w:w="2550"/>
+          </w:tcPr>
+          <w:p>
+            <w:r/>
+            <w:r>
+              <w:rPr>
+                <w:rFonts w:ascii="Calibri" w:hAnsi="Calibri" w:eastAsia="微软雅黑"/>
+                <w:b w:val="0"/>
+                <w:sz w:val="16"/>
+              </w:rPr>
+              <w:t>FDB 根，FDB_SLOW_PATH</w:t>
+            </w:r>
+          </w:p>
+        </w:tc>
+        <w:tc>
+          <w:tcPr>
+            <w:tcW w:type="dxa" w:w="2550"/>
+          </w:tcPr>
+          <w:p>
+            <w:r/>
+            <w:r>
+              <w:rPr>
+                <w:rFonts w:ascii="Calibri" w:hAnsi="Calibri" w:eastAsia="微软雅黑"/>
+                <w:b w:val="0"/>
+                <w:sz w:val="16"/>
+              </w:rPr>
+              <w:t>source_sqn，合并 eswitch 时再加 vhca id</w:t>
+            </w:r>
+          </w:p>
+        </w:tc>
+        <w:tc>
+          <w:tcPr>
+            <w:tcW w:type="dxa" w:w="2550"/>
+          </w:tcPr>
+          <w:p>
+            <w:r/>
+            <w:r>
+              <w:rPr>
+                <w:rFonts w:ascii="Calibri" w:hAnsi="Calibri" w:eastAsia="微软雅黑"/>
+                <w:b w:val="0"/>
+                <w:sz w:val="16"/>
+              </w:rPr>
+              <w:t>转到 vport</w:t>
+            </w:r>
+          </w:p>
+        </w:tc>
+      </w:tr>
+      <w:tr>
+        <w:tc>
+          <w:tcPr>
+            <w:tcW w:type="dxa" w:w="2550"/>
+          </w:tcPr>
+          <w:p>
+            <w:r/>
+            <w:r>
+              <w:rPr>
+                <w:rFonts w:ascii="Calibri" w:hAnsi="Calibri" w:eastAsia="微软雅黑"/>
+                <w:b w:val="0"/>
+                <w:sz w:val="16"/>
+              </w:rPr>
+              <w:t>慢路径 meta send-to-vport</w:t>
+            </w:r>
+          </w:p>
+        </w:tc>
+        <w:tc>
+          <w:tcPr>
+            <w:tcW w:type="dxa" w:w="2550"/>
+          </w:tcPr>
+          <w:p>
+            <w:r/>
+            <w:r>
+              <w:rPr>
+                <w:rFonts w:ascii="Calibri" w:hAnsi="Calibri" w:eastAsia="微软雅黑"/>
+                <w:b w:val="0"/>
+                <w:sz w:val="16"/>
+              </w:rPr>
+              <w:t>同一张表</w:t>
+            </w:r>
+          </w:p>
+        </w:tc>
+        <w:tc>
+          <w:tcPr>
+            <w:tcW w:type="dxa" w:w="2550"/>
+          </w:tcPr>
+          <w:p>
+            <w:r/>
+            <w:r>
+              <w:rPr>
+                <w:rFonts w:ascii="Calibri" w:hAnsi="Calibri" w:eastAsia="微软雅黑"/>
+                <w:b w:val="0"/>
+                <w:sz w:val="16"/>
+              </w:rPr>
+              <w:t>reg_c_0 的 vport 元数据，reg_c_1 的隧道位</w:t>
+            </w:r>
+          </w:p>
+        </w:tc>
+        <w:tc>
+          <w:tcPr>
+            <w:tcW w:type="dxa" w:w="2550"/>
+          </w:tcPr>
+          <w:p>
+            <w:r/>
+            <w:r>
+              <w:rPr>
+                <w:rFonts w:ascii="Calibri" w:hAnsi="Calibri" w:eastAsia="微软雅黑"/>
+                <w:b w:val="0"/>
+                <w:sz w:val="16"/>
+              </w:rPr>
+              <w:t>转到 vport</w:t>
+            </w:r>
+          </w:p>
+        </w:tc>
+      </w:tr>
+      <w:tr>
+        <w:tc>
+          <w:tcPr>
+            <w:tcW w:type="dxa" w:w="2550"/>
+          </w:tcPr>
+          <w:p>
+            <w:r/>
+            <w:r>
+              <w:rPr>
+                <w:rFonts w:ascii="Calibri" w:hAnsi="Calibri" w:eastAsia="微软雅黑"/>
+                <w:b w:val="0"/>
+                <w:sz w:val="16"/>
+              </w:rPr>
+              <w:t>慢路径 miss</w:t>
+            </w:r>
+          </w:p>
+        </w:tc>
+        <w:tc>
+          <w:tcPr>
+            <w:tcW w:type="dxa" w:w="2550"/>
+          </w:tcPr>
+          <w:p>
+            <w:r/>
+            <w:r>
+              <w:rPr>
+                <w:rFonts w:ascii="Calibri" w:hAnsi="Calibri" w:eastAsia="微软雅黑"/>
+                <w:b w:val="0"/>
+                <w:sz w:val="16"/>
+              </w:rPr>
+              <w:t>同一张表</w:t>
+            </w:r>
+          </w:p>
+        </w:tc>
+        <w:tc>
+          <w:tcPr>
+            <w:tcW w:type="dxa" w:w="2550"/>
+          </w:tcPr>
+          <w:p>
+            <w:r/>
+            <w:r>
+              <w:rPr>
+                <w:rFonts w:ascii="Calibri" w:hAnsi="Calibri" w:eastAsia="微软雅黑"/>
+                <w:b w:val="0"/>
+                <w:sz w:val="16"/>
+              </w:rPr>
+              <w:t>外层 DMAC 的组播位</w:t>
+            </w:r>
+          </w:p>
+        </w:tc>
+        <w:tc>
+          <w:tcPr>
+            <w:tcW w:type="dxa" w:w="2550"/>
+          </w:tcPr>
+          <w:p>
+            <w:r/>
+            <w:r>
+              <w:rPr>
+                <w:rFonts w:ascii="Calibri" w:hAnsi="Calibri" w:eastAsia="微软雅黑"/>
+                <w:b w:val="0"/>
+                <w:sz w:val="16"/>
+              </w:rPr>
+              <w:t>转到管理 vport</w:t>
+            </w:r>
+          </w:p>
+        </w:tc>
+      </w:tr>
+      <w:tr>
+        <w:tc>
+          <w:tcPr>
+            <w:tcW w:type="dxa" w:w="2550"/>
+          </w:tcPr>
+          <w:p>
+            <w:r/>
+            <w:r>
+              <w:rPr>
+                <w:rFonts w:ascii="Calibri" w:hAnsi="Calibri" w:eastAsia="微软雅黑"/>
+                <w:b w:val="0"/>
+                <w:sz w:val="16"/>
+              </w:rPr>
+              <w:t>TC miss</w:t>
+            </w:r>
+          </w:p>
+        </w:tc>
+        <w:tc>
+          <w:tcPr>
+            <w:tcW w:type="dxa" w:w="2550"/>
+          </w:tcPr>
+          <w:p>
+            <w:r/>
+            <w:r>
+              <w:rPr>
+                <w:rFonts w:ascii="Calibri" w:hAnsi="Calibri" w:eastAsia="微软雅黑"/>
+                <w:b w:val="0"/>
+                <w:sz w:val="16"/>
+              </w:rPr>
+              <w:t>FDB 根，FDB_TC_MISS</w:t>
+            </w:r>
+          </w:p>
+        </w:tc>
+        <w:tc>
+          <w:tcPr>
+            <w:tcW w:type="dxa" w:w="2550"/>
+          </w:tcPr>
+          <w:p>
+            <w:r/>
+            <w:r>
+              <w:rPr>
+                <w:rFonts w:ascii="Calibri" w:hAnsi="Calibri" w:eastAsia="微软雅黑"/>
+                <w:b w:val="0"/>
+                <w:sz w:val="16"/>
+              </w:rPr>
+              <w:t>空表，用来把后面的优先级接上</w:t>
+            </w:r>
+          </w:p>
+        </w:tc>
+        <w:tc>
+          <w:tcPr>
+            <w:tcW w:type="dxa" w:w="2550"/>
+          </w:tcPr>
+          <w:p>
+            <w:r/>
+            <w:r>
+              <w:rPr>
+                <w:rFonts w:ascii="Calibri" w:hAnsi="Calibri" w:eastAsia="微软雅黑"/>
+                <w:b w:val="0"/>
+                <w:sz w:val="16"/>
+              </w:rPr>
+              <w:t>默认 miss 到下一张表</w:t>
+            </w:r>
+          </w:p>
+        </w:tc>
+      </w:tr>
+      <w:tr>
+        <w:tc>
+          <w:tcPr>
+            <w:tcW w:type="dxa" w:w="2550"/>
+          </w:tcPr>
+          <w:p>
+            <w:r/>
+            <w:r>
+              <w:rPr>
+                <w:rFonts w:ascii="Calibri" w:hAnsi="Calibri" w:eastAsia="微软雅黑"/>
+                <w:b w:val="0"/>
+                <w:sz w:val="16"/>
+              </w:rPr>
+              <w:t>TC / FT chain</w:t>
+            </w:r>
+          </w:p>
+        </w:tc>
+        <w:tc>
+          <w:tcPr>
+            <w:tcW w:type="dxa" w:w="2550"/>
+          </w:tcPr>
+          <w:p>
+            <w:r/>
+            <w:r>
+              <w:rPr>
+                <w:rFonts w:ascii="Calibri" w:hAnsi="Calibri" w:eastAsia="微软雅黑"/>
+                <w:b w:val="0"/>
+                <w:sz w:val="16"/>
+              </w:rPr>
+              <w:t>FDB_TC_OFFLOAD、FDB_FT_OFFLOAD 的 chain</w:t>
+            </w:r>
+          </w:p>
+        </w:tc>
+        <w:tc>
+          <w:tcPr>
+            <w:tcW w:type="dxa" w:w="2550"/>
+          </w:tcPr>
+          <w:p>
+            <w:r/>
+            <w:r>
+              <w:rPr>
+                <w:rFonts w:ascii="Calibri" w:hAnsi="Calibri" w:eastAsia="微软雅黑"/>
+                <w:b w:val="0"/>
+                <w:sz w:val="16"/>
+              </w:rPr>
+              <w:t>当时的 flow spec</w:t>
+            </w:r>
+          </w:p>
+        </w:tc>
+        <w:tc>
+          <w:tcPr>
+            <w:tcW w:type="dxa" w:w="2550"/>
+          </w:tcPr>
+          <w:p>
+            <w:r/>
+            <w:r>
+              <w:rPr>
+                <w:rFonts w:ascii="Calibri" w:hAnsi="Calibri" w:eastAsia="微软雅黑"/>
+                <w:b w:val="0"/>
+                <w:sz w:val="16"/>
+              </w:rPr>
+              <w:t>封装、改头、跳表、vport、丢弃</w:t>
+            </w:r>
+          </w:p>
+        </w:tc>
+      </w:tr>
+      <w:tr>
+        <w:tc>
+          <w:tcPr>
+            <w:tcW w:type="dxa" w:w="2550"/>
+          </w:tcPr>
+          <w:p>
+            <w:r/>
+            <w:r>
+              <w:rPr>
+                <w:rFonts w:ascii="Calibri" w:hAnsi="Calibri" w:eastAsia="微软雅黑"/>
+                <w:b w:val="0"/>
+                <w:sz w:val="16"/>
+              </w:rPr>
+              <w:t>ft_offloads</w:t>
+            </w:r>
+          </w:p>
+        </w:tc>
+        <w:tc>
+          <w:tcPr>
+            <w:tcW w:type="dxa" w:w="2550"/>
+          </w:tcPr>
+          <w:p>
+            <w:r/>
+            <w:r>
+              <w:rPr>
+                <w:rFonts w:ascii="Calibri" w:hAnsi="Calibri" w:eastAsia="微软雅黑"/>
+                <w:b w:val="0"/>
+                <w:sz w:val="16"/>
+              </w:rPr>
+              <w:t>NIC_RX 的 OFFLOADS，prio 1</w:t>
+            </w:r>
+          </w:p>
+        </w:tc>
+        <w:tc>
+          <w:tcPr>
+            <w:tcW w:type="dxa" w:w="2550"/>
+          </w:tcPr>
+          <w:p>
+            <w:r/>
+            <w:r>
+              <w:rPr>
+                <w:rFonts w:ascii="Calibri" w:hAnsi="Calibri" w:eastAsia="微软雅黑"/>
+                <w:b w:val="0"/>
+                <w:sz w:val="16"/>
+              </w:rPr>
+              <w:t>source_port，或 reg_c_0</w:t>
+            </w:r>
+          </w:p>
+        </w:tc>
+        <w:tc>
+          <w:tcPr>
+            <w:tcW w:type="dxa" w:w="2550"/>
+          </w:tcPr>
+          <w:p>
+            <w:r/>
+            <w:r>
+              <w:rPr>
+                <w:rFonts w:ascii="Calibri" w:hAnsi="Calibri" w:eastAsia="微软雅黑"/>
+                <w:b w:val="0"/>
+                <w:sz w:val="16"/>
+              </w:rPr>
+              <w:t>转到代表口的 root 或 TTC</w:t>
+            </w:r>
+          </w:p>
+        </w:tc>
+      </w:tr>
+      <w:tr>
+        <w:tc>
+          <w:tcPr>
+            <w:tcW w:type="dxa" w:w="2550"/>
+          </w:tcPr>
+          <w:p>
+            <w:r/>
+            <w:r>
+              <w:rPr>
+                <w:rFonts w:ascii="Calibri" w:hAnsi="Calibri" w:eastAsia="微软雅黑"/>
+                <w:b w:val="0"/>
+                <w:sz w:val="16"/>
+              </w:rPr>
+              <w:t>ft_offloads 丢弃</w:t>
+            </w:r>
+          </w:p>
+        </w:tc>
+        <w:tc>
+          <w:tcPr>
+            <w:tcW w:type="dxa" w:w="2550"/>
+          </w:tcPr>
+          <w:p>
+            <w:r/>
+            <w:r>
+              <w:rPr>
+                <w:rFonts w:ascii="Calibri" w:hAnsi="Calibri" w:eastAsia="微软雅黑"/>
+                <w:b w:val="0"/>
+                <w:sz w:val="16"/>
+              </w:rPr>
+              <w:t>同一张表的最后一条</w:t>
+            </w:r>
+          </w:p>
+        </w:tc>
+        <w:tc>
+          <w:tcPr>
+            <w:tcW w:type="dxa" w:w="2550"/>
+          </w:tcPr>
+          <w:p>
+            <w:r/>
+            <w:r>
+              <w:rPr>
+                <w:rFonts w:ascii="Calibri" w:hAnsi="Calibri" w:eastAsia="微软雅黑"/>
+                <w:b w:val="0"/>
+                <w:sz w:val="16"/>
+              </w:rPr>
+              <w:t>空匹配</w:t>
+            </w:r>
+          </w:p>
+        </w:tc>
+        <w:tc>
+          <w:tcPr>
+            <w:tcW w:type="dxa" w:w="2550"/>
+          </w:tcPr>
+          <w:p>
+            <w:r/>
+            <w:r>
+              <w:rPr>
+                <w:rFonts w:ascii="Calibri" w:hAnsi="Calibri" w:eastAsia="微软雅黑"/>
+                <w:b w:val="0"/>
+                <w:sz w:val="16"/>
+              </w:rPr>
+              <w:t>丢弃</w:t>
+            </w:r>
+          </w:p>
+        </w:tc>
+      </w:tr>
+      <w:tr>
+        <w:tc>
+          <w:tcPr>
+            <w:tcW w:type="dxa" w:w="2550"/>
+          </w:tcPr>
+          <w:p>
+            <w:r/>
+            <w:r>
+              <w:rPr>
+                <w:rFonts w:ascii="Calibri" w:hAnsi="Calibri" w:eastAsia="微软雅黑"/>
+                <w:b w:val="0"/>
+                <w:sz w:val="16"/>
+              </w:rPr>
+              <w:t>restore</w:t>
+            </w:r>
+          </w:p>
+        </w:tc>
+        <w:tc>
+          <w:tcPr>
+            <w:tcW w:type="dxa" w:w="2550"/>
+          </w:tcPr>
+          <w:p>
+            <w:r/>
+            <w:r>
+              <w:rPr>
+                <w:rFonts w:ascii="Calibri" w:hAnsi="Calibri" w:eastAsia="微软雅黑"/>
+                <w:b w:val="0"/>
+                <w:sz w:val="16"/>
+              </w:rPr>
+              <w:t>NIC_RX 的 OFFLOADS，需要 reg_c1 环回能力</w:t>
+            </w:r>
+          </w:p>
+        </w:tc>
+        <w:tc>
+          <w:tcPr>
+            <w:tcW w:type="dxa" w:w="2550"/>
+          </w:tcPr>
+          <w:p>
+            <w:r/>
+            <w:r>
+              <w:rPr>
+                <w:rFonts w:ascii="Calibri" w:hAnsi="Calibri" w:eastAsia="微软雅黑"/>
+                <w:b w:val="0"/>
+                <w:sz w:val="16"/>
+              </w:rPr>
+              <w:t>reg_c_0</w:t>
+            </w:r>
+          </w:p>
+        </w:tc>
+        <w:tc>
+          <w:tcPr>
+            <w:tcW w:type="dxa" w:w="2550"/>
+          </w:tcPr>
+          <w:p>
+            <w:r/>
+            <w:r>
+              <w:rPr>
+                <w:rFonts w:ascii="Calibri" w:hAnsi="Calibri" w:eastAsia="微软雅黑"/>
+                <w:b w:val="0"/>
+                <w:sz w:val="16"/>
+              </w:rPr>
+              <w:t>把 reg_c_1 拷到 reg_b</w:t>
+            </w:r>
+          </w:p>
+        </w:tc>
+      </w:tr>
+      <w:tr>
+        <w:tc>
+          <w:tcPr>
+            <w:tcW w:type="dxa" w:w="2550"/>
+          </w:tcPr>
+          <w:p>
+            <w:r/>
+            <w:r>
+              <w:rPr>
+                <w:rFonts w:ascii="Calibri" w:hAnsi="Calibri" w:eastAsia="微软雅黑"/>
+                <w:b w:val="0"/>
+                <w:sz w:val="16"/>
+              </w:rPr>
+              <w:t>代表口 TTC</w:t>
+            </w:r>
+          </w:p>
+        </w:tc>
+        <w:tc>
+          <w:tcPr>
+            <w:tcW w:type="dxa" w:w="2550"/>
+          </w:tcPr>
+          <w:p>
+            <w:r/>
+            <w:r>
+              <w:rPr>
+                <w:rFonts w:ascii="Calibri" w:hAnsi="Calibri" w:eastAsia="微软雅黑"/>
+                <w:b w:val="0"/>
+                <w:sz w:val="16"/>
+              </w:rPr>
+              <w:t>NIC_RX 的 KERNEL</w:t>
+            </w:r>
+          </w:p>
+        </w:tc>
+        <w:tc>
+          <w:tcPr>
+            <w:tcW w:type="dxa" w:w="2550"/>
+          </w:tcPr>
+          <w:p>
+            <w:r/>
+            <w:r>
+              <w:rPr>
+                <w:rFonts w:ascii="Calibri" w:hAnsi="Calibri" w:eastAsia="微软雅黑"/>
+                <w:b w:val="0"/>
+                <w:sz w:val="16"/>
+              </w:rPr>
+              <w:t>外层 ethertype、L4</w:t>
+            </w:r>
+          </w:p>
+        </w:tc>
+        <w:tc>
+          <w:tcPr>
+            <w:tcW w:type="dxa" w:w="2550"/>
+          </w:tcPr>
+          <w:p>
+            <w:r/>
+            <w:r>
+              <w:rPr>
+                <w:rFonts w:ascii="Calibri" w:hAnsi="Calibri" w:eastAsia="微软雅黑"/>
+                <w:b w:val="0"/>
+                <w:sz w:val="16"/>
+              </w:rPr>
+              <w:t>该代表口的 TIR</w:t>
+            </w:r>
+          </w:p>
+        </w:tc>
+      </w:tr>
+      <w:tr>
+        <w:tc>
+          <w:tcPr>
+            <w:tcW w:type="dxa" w:w="2550"/>
+          </w:tcPr>
+          <w:p>
+            <w:r/>
+            <w:r>
+              <w:rPr>
+                <w:rFonts w:ascii="Calibri" w:hAnsi="Calibri" w:eastAsia="微软雅黑"/>
+                <w:b w:val="0"/>
+                <w:sz w:val="16"/>
+              </w:rPr>
+              <w:t>上行代表口 root</w:t>
+            </w:r>
+          </w:p>
+        </w:tc>
+        <w:tc>
+          <w:tcPr>
+            <w:tcW w:type="dxa" w:w="2550"/>
+          </w:tcPr>
+          <w:p>
+            <w:r/>
+            <w:r>
+              <w:rPr>
+                <w:rFonts w:ascii="Calibri" w:hAnsi="Calibri" w:eastAsia="微软雅黑"/>
+                <w:b w:val="0"/>
+                <w:sz w:val="16"/>
+              </w:rPr>
+              <w:t>NIC_RX 的 OFFLOADS，level 1</w:t>
+            </w:r>
+          </w:p>
+        </w:tc>
+        <w:tc>
+          <w:tcPr>
+            <w:tcW w:type="dxa" w:w="2550"/>
+          </w:tcPr>
+          <w:p>
+            <w:r/>
+            <w:r>
+              <w:rPr>
+                <w:rFonts w:ascii="Calibri" w:hAnsi="Calibri" w:eastAsia="微软雅黑"/>
+                <w:b w:val="0"/>
+                <w:sz w:val="16"/>
+              </w:rPr>
+              <w:t>空表</w:t>
+            </w:r>
+          </w:p>
+        </w:tc>
+        <w:tc>
+          <w:tcPr>
+            <w:tcW w:type="dxa" w:w="2550"/>
+          </w:tcPr>
+          <w:p>
+            <w:r/>
+            <w:r>
+              <w:rPr>
+                <w:rFonts w:ascii="Calibri" w:hAnsi="Calibri" w:eastAsia="微软雅黑"/>
+                <w:b w:val="0"/>
+                <w:sz w:val="16"/>
+              </w:rPr>
+              <w:t>miss 接到 ethtool 或 TTC</w:t>
+            </w:r>
+          </w:p>
+        </w:tc>
+      </w:tr>
+      <w:tr>
+        <w:tc>
+          <w:tcPr>
+            <w:tcW w:type="dxa" w:w="2550"/>
+          </w:tcPr>
+          <w:p>
+            <w:r/>
+            <w:r>
+              <w:rPr>
+                <w:rFonts w:ascii="Calibri" w:hAnsi="Calibri" w:eastAsia="微软雅黑"/>
+                <w:b w:val="0"/>
+                <w:sz w:val="16"/>
+              </w:rPr>
+              <w:t>ingress ACL</w:t>
+            </w:r>
+          </w:p>
+        </w:tc>
+        <w:tc>
+          <w:tcPr>
+            <w:tcW w:type="dxa" w:w="2550"/>
+          </w:tcPr>
+          <w:p>
+            <w:r/>
+            <w:r>
+              <w:rPr>
+                <w:rFonts w:ascii="Calibri" w:hAnsi="Calibri" w:eastAsia="微软雅黑"/>
+                <w:b w:val="0"/>
+                <w:sz w:val="16"/>
+              </w:rPr>
+              <w:t>uplink、管理 vport，以及后来启用的 vport</w:t>
+            </w:r>
+          </w:p>
+        </w:tc>
+        <w:tc>
+          <w:tcPr>
+            <w:tcW w:type="dxa" w:w="2550"/>
+          </w:tcPr>
+          <w:p>
+            <w:r/>
+            <w:r>
+              <w:rPr>
+                <w:rFonts w:ascii="Calibri" w:hAnsi="Calibri" w:eastAsia="微软雅黑"/>
+                <w:b w:val="0"/>
+                <w:sz w:val="16"/>
+              </w:rPr>
+              <w:t>未打标签的包，或全匹配</w:t>
+            </w:r>
+          </w:p>
+        </w:tc>
+        <w:tc>
+          <w:tcPr>
+            <w:tcW w:type="dxa" w:w="2550"/>
+          </w:tcPr>
+          <w:p>
+            <w:r/>
+            <w:r>
+              <w:rPr>
+                <w:rFonts w:ascii="Calibri" w:hAnsi="Calibri" w:eastAsia="微软雅黑"/>
+                <w:b w:val="0"/>
+                <w:sz w:val="16"/>
+              </w:rPr>
+              <w:t>把 vport 元数据写入 reg_c_0；可选压上 prio tag</w:t>
+            </w:r>
+          </w:p>
+        </w:tc>
+      </w:tr>
+      <w:tr>
+        <w:tc>
+          <w:tcPr>
+            <w:tcW w:type="dxa" w:w="2550"/>
+          </w:tcPr>
+          <w:p>
+            <w:r/>
+            <w:r>
+              <w:rPr>
+                <w:rFonts w:ascii="Calibri" w:hAnsi="Calibri" w:eastAsia="微软雅黑"/>
+                <w:b w:val="0"/>
+                <w:sz w:val="16"/>
+              </w:rPr>
+              <w:t>egress ACL</w:t>
+            </w:r>
+          </w:p>
+        </w:tc>
+        <w:tc>
+          <w:tcPr>
+            <w:tcW w:type="dxa" w:w="2550"/>
+          </w:tcPr>
+          <w:p>
+            <w:r/>
+            <w:r>
+              <w:rPr>
+                <w:rFonts w:ascii="Calibri" w:hAnsi="Calibri" w:eastAsia="微软雅黑"/>
+                <w:b w:val="0"/>
+                <w:sz w:val="16"/>
+              </w:rPr>
+              <w:t>同上</w:t>
+            </w:r>
+          </w:p>
+        </w:tc>
+        <w:tc>
+          <w:tcPr>
+            <w:tcW w:type="dxa" w:w="2550"/>
+          </w:tcPr>
+          <w:p>
+            <w:r/>
+            <w:r>
+              <w:rPr>
+                <w:rFonts w:ascii="Calibri" w:hAnsi="Calibri" w:eastAsia="微软雅黑"/>
+                <w:b w:val="0"/>
+                <w:sz w:val="16"/>
+              </w:rPr>
+              <w:t>全匹配，或 prio tag</w:t>
+            </w:r>
+          </w:p>
+        </w:tc>
+        <w:tc>
+          <w:tcPr>
+            <w:tcW w:type="dxa" w:w="2550"/>
+          </w:tcPr>
+          <w:p>
+            <w:r/>
+            <w:r>
+              <w:rPr>
+                <w:rFonts w:ascii="Calibri" w:hAnsi="Calibri" w:eastAsia="微软雅黑"/>
+                <w:b w:val="0"/>
+                <w:sz w:val="16"/>
+              </w:rPr>
+              <w:t>转到 vport，或弹出 prio tag</w:t>
+            </w:r>
+          </w:p>
+        </w:tc>
+      </w:tr>
+    </w:tbl>
+    <w:p/>
+    <w:p>
+      <w:pPr>
+        <w:spacing w:after="120" w:before="0" w:line="276" w:lineRule="auto"/>
+      </w:pPr>
+      <w:r>
+        <w:rPr>
+          <w:rFonts w:ascii="Calibri" w:hAnsi="Calibri" w:eastAsia="微软雅黑"/>
+          <w:b w:val="0"/>
+          <w:sz w:val="18"/>
+        </w:rPr>
+        <w:t>表 6  switchdev 实际创建的表。ft_offloads 和 restore 只在 esw_offloads_steering_init() 里出现。</w:t>
+      </w:r>
+    </w:p>
+    <w:p>
+      <w:pPr>
+        <w:spacing w:after="120" w:before="0" w:line="276" w:lineRule="auto"/>
+      </w:pPr>
+      <w:r>
+        <w:rPr>
+          <w:rFonts w:ascii="Calibri" w:hAnsi="Calibri" w:eastAsia="微软雅黑"/>
+          <w:b w:val="0"/>
+          <w:sz w:val="22"/>
+        </w:rPr>
+        <w:t>线侧报文先过 FDB。命中后目的地是 vport。代表口加载时，en_rep.c 在 ft_offloads 上为这个 vport 加一条规则，目的地是一张流表：上行口是 OFFLOADS 里的空 root，其它代表口直接是自己的 TTC。TTC 再把报文送到该代表口的 TIR。发送方向先过代表口的 NIC_TX，再进入 FDB 的 TX 侧。</w:t>
+      </w:r>
+    </w:p>
+    <w:p>
+      <w:pPr>
+        <w:spacing w:after="120" w:before="0" w:line="276" w:lineRule="auto"/>
+      </w:pPr>
+      <w:r>
+        <w:rPr>
+          <w:rFonts w:ascii="Calibri" w:hAnsi="Calibri" w:eastAsia="微软雅黑"/>
+          <w:b w:val="0"/>
+          <w:sz w:val="22"/>
+        </w:rPr>
+        <w:t>两边对照下来：legacy 的 FDB 是一张 L2 MAC 表，switchdev 的 FDB 是慢路径加上 TC chain，并且只有后者能切到 hmfs。legacy 的 NIC_RX 属于 PF 和客户机里的 VF；switchdev 在 NIC_RX 的 OFFLOADS namespace 里多出 ft_offloads 和 restore，收包的是 hypervisor 上的代表口。ACL 的根都在，legacy 用它做 spoof check 和 VLAN 过滤，switchdev 用它给报文盖上 vport 元数据。</w:t>
       </w:r>
     </w:p>
     <w:p>
@@ -1609,7 +3359,7 @@
         <w:drawing>
           <wp:inline xmlns:a="http://schemas.openxmlformats.org/drawingml/2006/main" xmlns:pic="http://schemas.openxmlformats.org/drawingml/2006/picture">
             <wp:extent cx="5806440" cy="3531588"/>
-            <wp:docPr id="2" name="Picture 2"/>
+            <wp:docPr id="4" name="Picture 4"/>
             <wp:cNvGraphicFramePr>
               <a:graphicFrameLocks noChangeAspect="1"/>
             </wp:cNvGraphicFramePr>
@@ -1621,7 +3371,7 @@
                     <pic:cNvPicPr/>
                   </pic:nvPicPr>
                   <pic:blipFill>
-                    <a:blip r:embed="rId10"/>
+                    <a:blip r:embed="rId12"/>
                     <a:stretch>
                       <a:fillRect/>
                     </a:stretch>
@@ -1703,7 +3453,7 @@
         <w:drawing>
           <wp:inline xmlns:a="http://schemas.openxmlformats.org/drawingml/2006/main" xmlns:pic="http://schemas.openxmlformats.org/drawingml/2006/picture">
             <wp:extent cx="5806440" cy="3284575"/>
-            <wp:docPr id="3" name="Picture 3"/>
+            <wp:docPr id="5" name="Picture 5"/>
             <wp:cNvGraphicFramePr>
               <a:graphicFrameLocks noChangeAspect="1"/>
             </wp:cNvGraphicFramePr>
@@ -1715,7 +3465,7 @@
                     <pic:cNvPicPr/>
                   </pic:nvPicPr>
                   <pic:blipFill>
-                    <a:blip r:embed="rId11"/>
+                    <a:blip r:embed="rId13"/>
                     <a:stretch>
                       <a:fillRect/>
                     </a:stretch>
@@ -1771,7 +3521,7 @@
         <w:drawing>
           <wp:inline xmlns:a="http://schemas.openxmlformats.org/drawingml/2006/main" xmlns:pic="http://schemas.openxmlformats.org/drawingml/2006/picture">
             <wp:extent cx="5806440" cy="3444094"/>
-            <wp:docPr id="4" name="Picture 4"/>
+            <wp:docPr id="6" name="Picture 6"/>
             <wp:cNvGraphicFramePr>
               <a:graphicFrameLocks noChangeAspect="1"/>
             </wp:cNvGraphicFramePr>
@@ -1783,7 +3533,7 @@
                     <pic:cNvPicPr/>
                   </pic:nvPicPr>
                   <pic:blipFill>
-                    <a:blip r:embed="rId12"/>
+                    <a:blip r:embed="rId14"/>
                     <a:stretch>
                       <a:fillRect/>
                     </a:stretch>
@@ -1865,7 +3615,7 @@
         <w:drawing>
           <wp:inline xmlns:a="http://schemas.openxmlformats.org/drawingml/2006/main" xmlns:pic="http://schemas.openxmlformats.org/drawingml/2006/picture">
             <wp:extent cx="5806440" cy="3360577"/>
-            <wp:docPr id="5" name="Picture 5"/>
+            <wp:docPr id="7" name="Picture 7"/>
             <wp:cNvGraphicFramePr>
               <a:graphicFrameLocks noChangeAspect="1"/>
             </wp:cNvGraphicFramePr>
@@ -1877,7 +3627,7 @@
                     <pic:cNvPicPr/>
                   </pic:nvPicPr>
                   <pic:blipFill>
-                    <a:blip r:embed="rId13"/>
+                    <a:blip r:embed="rId15"/>
                     <a:stretch>
                       <a:fillRect/>
                     </a:stretch>
@@ -1946,7 +3696,7 @@
         <w:drawing>
           <wp:inline xmlns:a="http://schemas.openxmlformats.org/drawingml/2006/main" xmlns:pic="http://schemas.openxmlformats.org/drawingml/2006/picture">
             <wp:extent cx="5806440" cy="3305084"/>
-            <wp:docPr id="6" name="Picture 6"/>
+            <wp:docPr id="8" name="Picture 8"/>
             <wp:cNvGraphicFramePr>
               <a:graphicFrameLocks noChangeAspect="1"/>
             </wp:cNvGraphicFramePr>
@@ -1958,7 +3708,7 @@
                     <pic:cNvPicPr/>
                   </pic:nvPicPr>
                   <pic:blipFill>
-                    <a:blip r:embed="rId14"/>
+                    <a:blip r:embed="rId16"/>
                     <a:stretch>
                       <a:fillRect/>
                     </a:stretch>
@@ -2000,7 +3750,7 @@
         <w:drawing>
           <wp:inline xmlns:a="http://schemas.openxmlformats.org/drawingml/2006/main" xmlns:pic="http://schemas.openxmlformats.org/drawingml/2006/picture">
             <wp:extent cx="5806440" cy="3050243"/>
-            <wp:docPr id="7" name="Picture 7"/>
+            <wp:docPr id="9" name="Picture 9"/>
             <wp:cNvGraphicFramePr>
               <a:graphicFrameLocks noChangeAspect="1"/>
             </wp:cNvGraphicFramePr>
@@ -2012,7 +3762,7 @@
                     <pic:cNvPicPr/>
                   </pic:nvPicPr>
                   <pic:blipFill>
-                    <a:blip r:embed="rId15"/>
+                    <a:blip r:embed="rId17"/>
                     <a:stretch>
                       <a:fillRect/>
                     </a:stretch>
@@ -2054,7 +3804,7 @@
         <w:drawing>
           <wp:inline xmlns:a="http://schemas.openxmlformats.org/drawingml/2006/main" xmlns:pic="http://schemas.openxmlformats.org/drawingml/2006/picture">
             <wp:extent cx="5806440" cy="3425591"/>
-            <wp:docPr id="8" name="Picture 8"/>
+            <wp:docPr id="10" name="Picture 10"/>
             <wp:cNvGraphicFramePr>
               <a:graphicFrameLocks noChangeAspect="1"/>
             </wp:cNvGraphicFramePr>
@@ -2066,7 +3816,7 @@
                     <pic:cNvPicPr/>
                   </pic:nvPicPr>
                   <pic:blipFill>
-                    <a:blip r:embed="rId16"/>
+                    <a:blip r:embed="rId18"/>
                     <a:stretch>
                       <a:fillRect/>
                     </a:stretch>
@@ -2110,7 +3860,7 @@
           <w:b w:val="0"/>
           <w:sz w:val="22"/>
         </w:rPr>
-        <w:t>switchdev 下，RX 的层次是：上行口，FDB 域（hmfs 时走 RTC RX 和 STC），目的 vport，该 function 的 NIC_RX 域，TIR，RQ，CQ，EQ。NIC_RX 域里的表是固件流表，namespace 按 BYPASS 到 ANCHOR 的优先级串起来。没有 FDB offload 时，线侧报文直接进入 NIC_RX 域。</w:t>
+        <w:t>图 5 和图 6 画的是 switchdev。RX 的层次是：上行口，FDB 域（hmfs 时走 RTC RX 和 STC），目的 vport，NIC_RX 的 OFFLOADS 表，代表口的 TTC，TIR，RQ，CQ，EQ。legacy 的路径在图 22：FDB 按 DMAC 选 vport，然后进入该 function 自己的 NIC_RX。没有 eswitch 时，线侧报文直接进入 NIC_RX 域。</w:t>
       </w:r>
     </w:p>
     <w:p>
@@ -2123,7 +3873,7 @@
           <w:b w:val="0"/>
           <w:sz w:val="22"/>
         </w:rPr>
-        <w:t>TIS 是发送侧的传输接口。主机把数据包 WQE 放进 SQ 并敲门铃之后，报文先进入该 function 的 NIC_TX 域，做完 egress 规则再离开 function。switchdev 下下一站是 FDB 域的 TX 侧，hmfs 时用 TX RTC 做哈希。没有 FDB offload 时，NIC_TX 之后直接出端口。</w:t>
+        <w:t>TIS 是发送侧的传输接口。主机把数据包 WQE 放进 SQ 并敲门铃之后，报文先进入该 function 的 NIC_TX 域。switchdev 下下一站是 FDB 域的 TX 侧，hmfs 时用 TX RTC 做哈希。legacy 下下一站是同一张按 DMAC 转发的 FDB。没有 eswitch 时，NIC_TX 之后直接出端口。</w:t>
       </w:r>
     </w:p>
     <w:p>
@@ -2320,7 +4070,7 @@
         <w:drawing>
           <wp:inline xmlns:a="http://schemas.openxmlformats.org/drawingml/2006/main" xmlns:pic="http://schemas.openxmlformats.org/drawingml/2006/picture">
             <wp:extent cx="5806440" cy="2255394"/>
-            <wp:docPr id="9" name="Picture 9"/>
+            <wp:docPr id="11" name="Picture 11"/>
             <wp:cNvGraphicFramePr>
               <a:graphicFrameLocks noChangeAspect="1"/>
             </wp:cNvGraphicFramePr>
@@ -2332,7 +4082,7 @@
                     <pic:cNvPicPr/>
                   </pic:nvPicPr>
                   <pic:blipFill>
-                    <a:blip r:embed="rId17"/>
+                    <a:blip r:embed="rId19"/>
                     <a:stretch>
                       <a:fillRect/>
                     </a:stretch>
@@ -2374,7 +4124,7 @@
         <w:drawing>
           <wp:inline xmlns:a="http://schemas.openxmlformats.org/drawingml/2006/main" xmlns:pic="http://schemas.openxmlformats.org/drawingml/2006/picture">
             <wp:extent cx="5806440" cy="2292016"/>
-            <wp:docPr id="10" name="Picture 10"/>
+            <wp:docPr id="12" name="Picture 12"/>
             <wp:cNvGraphicFramePr>
               <a:graphicFrameLocks noChangeAspect="1"/>
             </wp:cNvGraphicFramePr>
@@ -2386,7 +4136,7 @@
                     <pic:cNvPicPr/>
                   </pic:nvPicPr>
                   <pic:blipFill>
-                    <a:blip r:embed="rId18"/>
+                    <a:blip r:embed="rId20"/>
                     <a:stretch>
                       <a:fillRect/>
                     </a:stretch>
@@ -2428,7 +4178,7 @@
         <w:drawing>
           <wp:inline xmlns:a="http://schemas.openxmlformats.org/drawingml/2006/main" xmlns:pic="http://schemas.openxmlformats.org/drawingml/2006/picture">
             <wp:extent cx="5806440" cy="3225800"/>
-            <wp:docPr id="11" name="Picture 11"/>
+            <wp:docPr id="13" name="Picture 13"/>
             <wp:cNvGraphicFramePr>
               <a:graphicFrameLocks noChangeAspect="1"/>
             </wp:cNvGraphicFramePr>
@@ -2440,7 +4190,7 @@
                     <pic:cNvPicPr/>
                   </pic:nvPicPr>
                   <pic:blipFill>
-                    <a:blip r:embed="rId19"/>
+                    <a:blip r:embed="rId21"/>
                     <a:stretch>
                       <a:fillRect/>
                     </a:stretch>
@@ -2482,7 +4232,7 @@
         <w:drawing>
           <wp:inline xmlns:a="http://schemas.openxmlformats.org/drawingml/2006/main" xmlns:pic="http://schemas.openxmlformats.org/drawingml/2006/picture">
             <wp:extent cx="5806440" cy="3287984"/>
-            <wp:docPr id="12" name="Picture 12"/>
+            <wp:docPr id="14" name="Picture 14"/>
             <wp:cNvGraphicFramePr>
               <a:graphicFrameLocks noChangeAspect="1"/>
             </wp:cNvGraphicFramePr>
@@ -2494,7 +4244,7 @@
                     <pic:cNvPicPr/>
                   </pic:nvPicPr>
                   <pic:blipFill>
-                    <a:blip r:embed="rId20"/>
+                    <a:blip r:embed="rId22"/>
                     <a:stretch>
                       <a:fillRect/>
                     </a:stretch>
@@ -2536,7 +4286,7 @@
         <w:drawing>
           <wp:inline xmlns:a="http://schemas.openxmlformats.org/drawingml/2006/main" xmlns:pic="http://schemas.openxmlformats.org/drawingml/2006/picture">
             <wp:extent cx="5806440" cy="3225800"/>
-            <wp:docPr id="13" name="Picture 13"/>
+            <wp:docPr id="15" name="Picture 15"/>
             <wp:cNvGraphicFramePr>
               <a:graphicFrameLocks noChangeAspect="1"/>
             </wp:cNvGraphicFramePr>
@@ -2548,7 +4298,7 @@
                     <pic:cNvPicPr/>
                   </pic:nvPicPr>
                   <pic:blipFill>
-                    <a:blip r:embed="rId21"/>
+                    <a:blip r:embed="rId23"/>
                     <a:stretch>
                       <a:fillRect/>
                     </a:stretch>
@@ -2590,7 +4340,7 @@
         <w:drawing>
           <wp:inline xmlns:a="http://schemas.openxmlformats.org/drawingml/2006/main" xmlns:pic="http://schemas.openxmlformats.org/drawingml/2006/picture">
             <wp:extent cx="5806440" cy="3225800"/>
-            <wp:docPr id="14" name="Picture 14"/>
+            <wp:docPr id="16" name="Picture 16"/>
             <wp:cNvGraphicFramePr>
               <a:graphicFrameLocks noChangeAspect="1"/>
             </wp:cNvGraphicFramePr>
@@ -2602,7 +4352,7 @@
                     <pic:cNvPicPr/>
                   </pic:nvPicPr>
                   <pic:blipFill>
-                    <a:blip r:embed="rId22"/>
+                    <a:blip r:embed="rId24"/>
                     <a:stretch>
                       <a:fillRect/>
                     </a:stretch>
@@ -5511,7 +7261,7 @@
         <w:drawing>
           <wp:inline xmlns:a="http://schemas.openxmlformats.org/drawingml/2006/main" xmlns:pic="http://schemas.openxmlformats.org/drawingml/2006/picture">
             <wp:extent cx="5806440" cy="2272085"/>
-            <wp:docPr id="15" name="Picture 15"/>
+            <wp:docPr id="17" name="Picture 17"/>
             <wp:cNvGraphicFramePr>
               <a:graphicFrameLocks noChangeAspect="1"/>
             </wp:cNvGraphicFramePr>
@@ -5523,7 +7273,7 @@
                     <pic:cNvPicPr/>
                   </pic:nvPicPr>
                   <pic:blipFill>
-                    <a:blip r:embed="rId23"/>
+                    <a:blip r:embed="rId25"/>
                     <a:stretch>
                       <a:fillRect/>
                     </a:stretch>
@@ -5565,7 +7315,7 @@
         <w:drawing>
           <wp:inline xmlns:a="http://schemas.openxmlformats.org/drawingml/2006/main" xmlns:pic="http://schemas.openxmlformats.org/drawingml/2006/picture">
             <wp:extent cx="5806440" cy="3210620"/>
-            <wp:docPr id="16" name="Picture 16"/>
+            <wp:docPr id="18" name="Picture 18"/>
             <wp:cNvGraphicFramePr>
               <a:graphicFrameLocks noChangeAspect="1"/>
             </wp:cNvGraphicFramePr>
@@ -5577,7 +7327,7 @@
                     <pic:cNvPicPr/>
                   </pic:nvPicPr>
                   <pic:blipFill>
-                    <a:blip r:embed="rId24"/>
+                    <a:blip r:embed="rId26"/>
                     <a:stretch>
                       <a:fillRect/>
                     </a:stretch>
@@ -5619,7 +7369,7 @@
         <w:drawing>
           <wp:inline xmlns:a="http://schemas.openxmlformats.org/drawingml/2006/main" xmlns:pic="http://schemas.openxmlformats.org/drawingml/2006/picture">
             <wp:extent cx="5806440" cy="2998931"/>
-            <wp:docPr id="17" name="Picture 17"/>
+            <wp:docPr id="19" name="Picture 19"/>
             <wp:cNvGraphicFramePr>
               <a:graphicFrameLocks noChangeAspect="1"/>
             </wp:cNvGraphicFramePr>
@@ -5631,7 +7381,7 @@
                     <pic:cNvPicPr/>
                   </pic:nvPicPr>
                   <pic:blipFill>
-                    <a:blip r:embed="rId25"/>
+                    <a:blip r:embed="rId27"/>
                     <a:stretch>
                       <a:fillRect/>
                     </a:stretch>
@@ -6553,7 +8303,7 @@
         <w:drawing>
           <wp:inline xmlns:a="http://schemas.openxmlformats.org/drawingml/2006/main" xmlns:pic="http://schemas.openxmlformats.org/drawingml/2006/picture">
             <wp:extent cx="5806440" cy="2272085"/>
-            <wp:docPr id="18" name="Picture 18"/>
+            <wp:docPr id="20" name="Picture 20"/>
             <wp:cNvGraphicFramePr>
               <a:graphicFrameLocks noChangeAspect="1"/>
             </wp:cNvGraphicFramePr>
@@ -6565,7 +8315,7 @@
                     <pic:cNvPicPr/>
                   </pic:nvPicPr>
                   <pic:blipFill>
-                    <a:blip r:embed="rId26"/>
+                    <a:blip r:embed="rId28"/>
                     <a:stretch>
                       <a:fillRect/>
                     </a:stretch>
@@ -6607,7 +8357,7 @@
         <w:drawing>
           <wp:inline xmlns:a="http://schemas.openxmlformats.org/drawingml/2006/main" xmlns:pic="http://schemas.openxmlformats.org/drawingml/2006/picture">
             <wp:extent cx="5806440" cy="2272085"/>
-            <wp:docPr id="19" name="Picture 19"/>
+            <wp:docPr id="21" name="Picture 21"/>
             <wp:cNvGraphicFramePr>
               <a:graphicFrameLocks noChangeAspect="1"/>
             </wp:cNvGraphicFramePr>
@@ -6619,7 +8369,7 @@
                     <pic:cNvPicPr/>
                   </pic:nvPicPr>
                   <pic:blipFill>
-                    <a:blip r:embed="rId27"/>
+                    <a:blip r:embed="rId29"/>
                     <a:stretch>
                       <a:fillRect/>
                     </a:stretch>
@@ -6661,7 +8411,7 @@
         <w:drawing>
           <wp:inline xmlns:a="http://schemas.openxmlformats.org/drawingml/2006/main" xmlns:pic="http://schemas.openxmlformats.org/drawingml/2006/picture">
             <wp:extent cx="5806440" cy="3210620"/>
-            <wp:docPr id="20" name="Picture 20"/>
+            <wp:docPr id="22" name="Picture 22"/>
             <wp:cNvGraphicFramePr>
               <a:graphicFrameLocks noChangeAspect="1"/>
             </wp:cNvGraphicFramePr>
@@ -6673,7 +8423,7 @@
                     <pic:cNvPicPr/>
                   </pic:nvPicPr>
                   <pic:blipFill>
-                    <a:blip r:embed="rId28"/>
+                    <a:blip r:embed="rId30"/>
                     <a:stretch>
                       <a:fillRect/>
                     </a:stretch>
@@ -6715,7 +8465,7 @@
         <w:drawing>
           <wp:inline xmlns:a="http://schemas.openxmlformats.org/drawingml/2006/main" xmlns:pic="http://schemas.openxmlformats.org/drawingml/2006/picture">
             <wp:extent cx="5806440" cy="2998931"/>
-            <wp:docPr id="21" name="Picture 21"/>
+            <wp:docPr id="23" name="Picture 23"/>
             <wp:cNvGraphicFramePr>
               <a:graphicFrameLocks noChangeAspect="1"/>
             </wp:cNvGraphicFramePr>
@@ -6727,7 +8477,7 @@
                     <pic:cNvPicPr/>
                   </pic:nvPicPr>
                   <pic:blipFill>
-                    <a:blip r:embed="rId29"/>
+                    <a:blip r:embed="rId31"/>
                     <a:stretch>
                       <a:fillRect/>
                     </a:stretch>

</xml_diff>

<commit_message>
hws-analysis: define driver geometry and annotate experiment charts
Name the num_log=24 layout 驱动几何 and the 2^22-row counterfactual 紧凑几何. Spell out every experiment-chart tick, and add a short reading plus a one-line summary under each figure in the Word report.

Co-authored-by: zsdaka <zsdaka@users.noreply.github.com>
</commit_message>
<xml_diff>
--- a/mlx5-hws-analysis/mlx5-hws-model.docx
+++ b/mlx5-hws-analysis/mlx5-hws-model.docx
@@ -3496,7 +3496,20 @@
           <w:color w:val="3C4650"/>
           <w:sz w:val="18"/>
         </w:rPr>
-        <w:t>图 2  2^24 条 key 的两种行数。左边是驱动，右边是槽位数等于 key 数的排法</w:t>
+        <w:t>图 2  左边是驱动几何：2^24 行、每行 4 个槽。右边是紧凑几何：2^22 行、每行 4 个槽，槽位总数等于 2^24 条 key</w:t>
+      </w:r>
+    </w:p>
+    <w:p>
+      <w:pPr>
+        <w:spacing w:after="120" w:before="0" w:line="276" w:lineRule="auto"/>
+      </w:pPr>
+      <w:r>
+        <w:rPr>
+          <w:rFonts w:ascii="Calibri" w:hAnsi="Calibri" w:eastAsia="微软雅黑"/>
+          <w:b w:val="0"/>
+          <w:sz w:val="22"/>
+        </w:rPr>
+        <w:t>后文的“驱动几何”就是左图这套尺寸。num_log = 24 时，驱动把主表配成 2^24 行、每行 4 个 STE，碰撞表配成 2^19 行、每行 16 个 STE。它不是“槽位个数等于 key 个数”。右图那套称为紧凑几何，只在对照实验里使用。</w:t>
       </w:r>
     </w:p>
     <w:p>
@@ -3979,7 +3992,7 @@
           <w:b w:val="0"/>
           <w:sz w:val="22"/>
         </w:rPr>
-        <w:t>程序是 mlx5-hws-analysis/sim/hws_sim.c。主表和碰撞表都按槽位数组逐条写入 64 位指纹。空槽为 0。插入之后按同一哈希把每条 key 再查一遍：成功的必须命中，失败的必须查不到，比较次数不得超过 4 + 16。全部实验的 lookup_bad 都是 0。</w:t>
+        <w:t>程序是 mlx5-hws-analysis/sim/hws_sim.c。主表和碰撞表都按槽位数组逐条写入 64 位指纹。空槽为 0。插入之后按同一哈希把每条 key 再查一遍：成功的必须命中，失败的必须查不到，比较次数不得超过 4 + 16。全部实验的 lookup_bad 都是 0。这些秒数是模型程序的运行时间，不是网卡插入速率。</w:t>
       </w:r>
     </w:p>
     <w:p>
@@ -3992,7 +4005,834 @@
           <w:b w:val="0"/>
           <w:sz w:val="22"/>
         </w:rPr>
-        <w:t>驱动几何固定为 num_log = 24：主表 2^24 行 × 4，碰撞表 2^19 行 × 16。三组规模是 10,000,000、16,777,216 和 20,000,000。D-tight 把行对数改成 22，碰撞行对数为 17，插入条数仍是 16,777,216。消融实验去掉碰撞表。</w:t>
+        <w:t>驱动几何：主表 2^24 行、每行 4 个 STE，碰撞表 2^19 行、每行 16 个 STE。配满是把 16,777,216 条 key 放进这 2^24 行，平均每行 1 条，λ = 1。紧凑几何：主表 2^22 行、每行 4 个 STE，碰撞表 2^17 行、每行 16 个 STE。同一批 16,777,216 条 key 放进 2^22 行时，平均每行 4 条，λ = 4。图上的 25%、50%、70%、90%、100% 都是插入条数除以 2^24，不是槽位被填满的比例。100% 在驱动几何上是平均每行 1 条；同一批 key 放到紧凑几何上仍标成 100%，但平均每行变成 4 条。70% 是 bwc.c 开始扩行的水位。</w:t>
+      </w:r>
+    </w:p>
+    <w:tbl>
+      <w:tblPr>
+        <w:tblStyle w:val="TableGrid"/>
+        <w:tblW w:type="auto" w:w="0"/>
+        <w:tblLook w:firstColumn="1" w:firstRow="1" w:lastColumn="0" w:lastRow="0" w:noHBand="0" w:noVBand="1" w:val="04A0"/>
+      </w:tblPr>
+      <w:tblGrid>
+        <w:gridCol w:w="2550"/>
+        <w:gridCol w:w="2550"/>
+        <w:gridCol w:w="2550"/>
+        <w:gridCol w:w="2550"/>
+      </w:tblGrid>
+      <w:tr>
+        <w:tc>
+          <w:tcPr>
+            <w:tcW w:type="dxa" w:w="2550"/>
+            <w:shd w:fill="1B3A4B" w:val="clear"/>
+          </w:tcPr>
+          <w:p>
+            <w:r/>
+            <w:r>
+              <w:rPr>
+                <w:rFonts w:ascii="Calibri" w:hAnsi="Calibri" w:eastAsia="微软雅黑"/>
+                <w:b/>
+                <w:color w:val="FFFFFF"/>
+                <w:sz w:val="18"/>
+              </w:rPr>
+              <w:t>图上的刻度</w:t>
+            </w:r>
+          </w:p>
+        </w:tc>
+        <w:tc>
+          <w:tcPr>
+            <w:tcW w:type="dxa" w:w="2550"/>
+            <w:shd w:fill="1B3A4B" w:val="clear"/>
+          </w:tcPr>
+          <w:p>
+            <w:r/>
+            <w:r>
+              <w:rPr>
+                <w:rFonts w:ascii="Calibri" w:hAnsi="Calibri" w:eastAsia="微软雅黑"/>
+                <w:b/>
+                <w:color w:val="FFFFFF"/>
+                <w:sz w:val="18"/>
+              </w:rPr>
+              <w:t>插入条数</w:t>
+            </w:r>
+          </w:p>
+        </w:tc>
+        <w:tc>
+          <w:tcPr>
+            <w:tcW w:type="dxa" w:w="2550"/>
+            <w:shd w:fill="1B3A4B" w:val="clear"/>
+          </w:tcPr>
+          <w:p>
+            <w:r/>
+            <w:r>
+              <w:rPr>
+                <w:rFonts w:ascii="Calibri" w:hAnsi="Calibri" w:eastAsia="微软雅黑"/>
+                <w:b/>
+                <w:color w:val="FFFFFF"/>
+                <w:sz w:val="18"/>
+              </w:rPr>
+              <w:t>主表</w:t>
+            </w:r>
+          </w:p>
+        </w:tc>
+        <w:tc>
+          <w:tcPr>
+            <w:tcW w:type="dxa" w:w="2550"/>
+            <w:shd w:fill="1B3A4B" w:val="clear"/>
+          </w:tcPr>
+          <w:p>
+            <w:r/>
+            <w:r>
+              <w:rPr>
+                <w:rFonts w:ascii="Calibri" w:hAnsi="Calibri" w:eastAsia="微软雅黑"/>
+                <w:b/>
+                <w:color w:val="FFFFFF"/>
+                <w:sz w:val="18"/>
+              </w:rPr>
+              <w:t>这一档在看什么</w:t>
+            </w:r>
+          </w:p>
+        </w:tc>
+      </w:tr>
+      <w:tr>
+        <w:tc>
+          <w:tcPr>
+            <w:tcW w:type="dxa" w:w="2550"/>
+          </w:tcPr>
+          <w:p>
+            <w:r/>
+            <w:r>
+              <w:rPr>
+                <w:rFonts w:ascii="Calibri" w:hAnsi="Calibri" w:eastAsia="微软雅黑"/>
+                <w:b w:val="0"/>
+                <w:sz w:val="16"/>
+              </w:rPr>
+              <w:t>1000万均匀</w:t>
+            </w:r>
+          </w:p>
+        </w:tc>
+        <w:tc>
+          <w:tcPr>
+            <w:tcW w:type="dxa" w:w="2550"/>
+          </w:tcPr>
+          <w:p>
+            <w:r/>
+            <w:r>
+              <w:rPr>
+                <w:rFonts w:ascii="Calibri" w:hAnsi="Calibri" w:eastAsia="微软雅黑"/>
+                <w:b w:val="0"/>
+                <w:sz w:val="16"/>
+              </w:rPr>
+              <w:t>10,000,000</w:t>
+            </w:r>
+          </w:p>
+        </w:tc>
+        <w:tc>
+          <w:tcPr>
+            <w:tcW w:type="dxa" w:w="2550"/>
+          </w:tcPr>
+          <w:p>
+            <w:r/>
+            <w:r>
+              <w:rPr>
+                <w:rFonts w:ascii="Calibri" w:hAnsi="Calibri" w:eastAsia="微软雅黑"/>
+                <w:b w:val="0"/>
+                <w:sz w:val="16"/>
+              </w:rPr>
+              <w:t>2^24 行 × 4</w:t>
+            </w:r>
+          </w:p>
+        </w:tc>
+        <w:tc>
+          <w:tcPr>
+            <w:tcW w:type="dxa" w:w="2550"/>
+          </w:tcPr>
+          <w:p>
+            <w:r/>
+            <w:r>
+              <w:rPr>
+                <w:rFonts w:ascii="Calibri" w:hAnsi="Calibri" w:eastAsia="微软雅黑"/>
+                <w:b w:val="0"/>
+                <w:sz w:val="16"/>
+              </w:rPr>
+              <w:t>驱动几何，λ = 0.596</w:t>
+            </w:r>
+          </w:p>
+        </w:tc>
+      </w:tr>
+      <w:tr>
+        <w:tc>
+          <w:tcPr>
+            <w:tcW w:type="dxa" w:w="2550"/>
+          </w:tcPr>
+          <w:p>
+            <w:r/>
+            <w:r>
+              <w:rPr>
+                <w:rFonts w:ascii="Calibri" w:hAnsi="Calibri" w:eastAsia="微软雅黑"/>
+                <w:b w:val="0"/>
+                <w:sz w:val="16"/>
+              </w:rPr>
+              <w:t>1677万，2^24 行</w:t>
+            </w:r>
+          </w:p>
+        </w:tc>
+        <w:tc>
+          <w:tcPr>
+            <w:tcW w:type="dxa" w:w="2550"/>
+          </w:tcPr>
+          <w:p>
+            <w:r/>
+            <w:r>
+              <w:rPr>
+                <w:rFonts w:ascii="Calibri" w:hAnsi="Calibri" w:eastAsia="微软雅黑"/>
+                <w:b w:val="0"/>
+                <w:sz w:val="16"/>
+              </w:rPr>
+              <w:t>16,777,216</w:t>
+            </w:r>
+          </w:p>
+        </w:tc>
+        <w:tc>
+          <w:tcPr>
+            <w:tcW w:type="dxa" w:w="2550"/>
+          </w:tcPr>
+          <w:p>
+            <w:r/>
+            <w:r>
+              <w:rPr>
+                <w:rFonts w:ascii="Calibri" w:hAnsi="Calibri" w:eastAsia="微软雅黑"/>
+                <w:b w:val="0"/>
+                <w:sz w:val="16"/>
+              </w:rPr>
+              <w:t>2^24 行 × 4</w:t>
+            </w:r>
+          </w:p>
+        </w:tc>
+        <w:tc>
+          <w:tcPr>
+            <w:tcW w:type="dxa" w:w="2550"/>
+          </w:tcPr>
+          <w:p>
+            <w:r/>
+            <w:r>
+              <w:rPr>
+                <w:rFonts w:ascii="Calibri" w:hAnsi="Calibri" w:eastAsia="微软雅黑"/>
+                <w:b w:val="0"/>
+                <w:sz w:val="16"/>
+              </w:rPr>
+              <w:t>配满，λ = 1</w:t>
+            </w:r>
+          </w:p>
+        </w:tc>
+      </w:tr>
+      <w:tr>
+        <w:tc>
+          <w:tcPr>
+            <w:tcW w:type="dxa" w:w="2550"/>
+          </w:tcPr>
+          <w:p>
+            <w:r/>
+            <w:r>
+              <w:rPr>
+                <w:rFonts w:ascii="Calibri" w:hAnsi="Calibri" w:eastAsia="微软雅黑"/>
+                <w:b w:val="0"/>
+                <w:sz w:val="16"/>
+              </w:rPr>
+              <w:t>2000万</w:t>
+            </w:r>
+          </w:p>
+        </w:tc>
+        <w:tc>
+          <w:tcPr>
+            <w:tcW w:type="dxa" w:w="2550"/>
+          </w:tcPr>
+          <w:p>
+            <w:r/>
+            <w:r>
+              <w:rPr>
+                <w:rFonts w:ascii="Calibri" w:hAnsi="Calibri" w:eastAsia="微软雅黑"/>
+                <w:b w:val="0"/>
+                <w:sz w:val="16"/>
+              </w:rPr>
+              <w:t>20,000,000</w:t>
+            </w:r>
+          </w:p>
+        </w:tc>
+        <w:tc>
+          <w:tcPr>
+            <w:tcW w:type="dxa" w:w="2550"/>
+          </w:tcPr>
+          <w:p>
+            <w:r/>
+            <w:r>
+              <w:rPr>
+                <w:rFonts w:ascii="Calibri" w:hAnsi="Calibri" w:eastAsia="微软雅黑"/>
+                <w:b w:val="0"/>
+                <w:sz w:val="16"/>
+              </w:rPr>
+              <w:t>2^24 行 × 4</w:t>
+            </w:r>
+          </w:p>
+        </w:tc>
+        <w:tc>
+          <w:tcPr>
+            <w:tcW w:type="dxa" w:w="2550"/>
+          </w:tcPr>
+          <w:p>
+            <w:r/>
+            <w:r>
+              <w:rPr>
+                <w:rFonts w:ascii="Calibri" w:hAnsi="Calibri" w:eastAsia="微软雅黑"/>
+                <w:b w:val="0"/>
+                <w:sz w:val="16"/>
+              </w:rPr>
+              <w:t>超过配满，λ = 1.192</w:t>
+            </w:r>
+          </w:p>
+        </w:tc>
+      </w:tr>
+      <w:tr>
+        <w:tc>
+          <w:tcPr>
+            <w:tcW w:type="dxa" w:w="2550"/>
+          </w:tcPr>
+          <w:p>
+            <w:r/>
+            <w:r>
+              <w:rPr>
+                <w:rFonts w:ascii="Calibri" w:hAnsi="Calibri" w:eastAsia="微软雅黑"/>
+                <w:b w:val="0"/>
+                <w:sz w:val="16"/>
+              </w:rPr>
+              <w:t>另一哈希</w:t>
+            </w:r>
+          </w:p>
+        </w:tc>
+        <w:tc>
+          <w:tcPr>
+            <w:tcW w:type="dxa" w:w="2550"/>
+          </w:tcPr>
+          <w:p>
+            <w:r/>
+            <w:r>
+              <w:rPr>
+                <w:rFonts w:ascii="Calibri" w:hAnsi="Calibri" w:eastAsia="微软雅黑"/>
+                <w:b w:val="0"/>
+                <w:sz w:val="16"/>
+              </w:rPr>
+              <w:t>10,000,000</w:t>
+            </w:r>
+          </w:p>
+        </w:tc>
+        <w:tc>
+          <w:tcPr>
+            <w:tcW w:type="dxa" w:w="2550"/>
+          </w:tcPr>
+          <w:p>
+            <w:r/>
+            <w:r>
+              <w:rPr>
+                <w:rFonts w:ascii="Calibri" w:hAnsi="Calibri" w:eastAsia="微软雅黑"/>
+                <w:b w:val="0"/>
+                <w:sz w:val="16"/>
+              </w:rPr>
+              <w:t>2^24 行 × 4</w:t>
+            </w:r>
+          </w:p>
+        </w:tc>
+        <w:tc>
+          <w:tcPr>
+            <w:tcW w:type="dxa" w:w="2550"/>
+          </w:tcPr>
+          <w:p>
+            <w:r/>
+            <w:r>
+              <w:rPr>
+                <w:rFonts w:ascii="Calibri" w:hAnsi="Calibri" w:eastAsia="微软雅黑"/>
+                <w:b w:val="0"/>
+                <w:sz w:val="16"/>
+              </w:rPr>
+              <w:t>换一套混合常数</w:t>
+            </w:r>
+          </w:p>
+        </w:tc>
+      </w:tr>
+      <w:tr>
+        <w:tc>
+          <w:tcPr>
+            <w:tcW w:type="dxa" w:w="2550"/>
+          </w:tcPr>
+          <w:p>
+            <w:r/>
+            <w:r>
+              <w:rPr>
+                <w:rFonts w:ascii="Calibri" w:hAnsi="Calibri" w:eastAsia="微软雅黑"/>
+                <w:b w:val="0"/>
+                <w:sz w:val="16"/>
+              </w:rPr>
+              <w:t>重尾全字段</w:t>
+            </w:r>
+          </w:p>
+        </w:tc>
+        <w:tc>
+          <w:tcPr>
+            <w:tcW w:type="dxa" w:w="2550"/>
+          </w:tcPr>
+          <w:p>
+            <w:r/>
+            <w:r>
+              <w:rPr>
+                <w:rFonts w:ascii="Calibri" w:hAnsi="Calibri" w:eastAsia="微软雅黑"/>
+                <w:b w:val="0"/>
+                <w:sz w:val="16"/>
+              </w:rPr>
+              <w:t>10,000,000</w:t>
+            </w:r>
+          </w:p>
+        </w:tc>
+        <w:tc>
+          <w:tcPr>
+            <w:tcW w:type="dxa" w:w="2550"/>
+          </w:tcPr>
+          <w:p>
+            <w:r/>
+            <w:r>
+              <w:rPr>
+                <w:rFonts w:ascii="Calibri" w:hAnsi="Calibri" w:eastAsia="微软雅黑"/>
+                <w:b w:val="0"/>
+                <w:sz w:val="16"/>
+              </w:rPr>
+              <w:t>2^24 行 × 4</w:t>
+            </w:r>
+          </w:p>
+        </w:tc>
+        <w:tc>
+          <w:tcPr>
+            <w:tcW w:type="dxa" w:w="2550"/>
+          </w:tcPr>
+          <w:p>
+            <w:r/>
+            <w:r>
+              <w:rPr>
+                <w:rFonts w:ascii="Calibri" w:hAnsi="Calibri" w:eastAsia="微软雅黑"/>
+                <w:b w:val="0"/>
+                <w:sz w:val="16"/>
+              </w:rPr>
+              <w:t>Zipf 源地址再和序号一起混合</w:t>
+            </w:r>
+          </w:p>
+        </w:tc>
+      </w:tr>
+      <w:tr>
+        <w:tc>
+          <w:tcPr>
+            <w:tcW w:type="dxa" w:w="2550"/>
+          </w:tcPr>
+          <w:p>
+            <w:r/>
+            <w:r>
+              <w:rPr>
+                <w:rFonts w:ascii="Calibri" w:hAnsi="Calibri" w:eastAsia="微软雅黑"/>
+                <w:b w:val="0"/>
+                <w:sz w:val="16"/>
+              </w:rPr>
+              <w:t>CTU 采样</w:t>
+            </w:r>
+          </w:p>
+        </w:tc>
+        <w:tc>
+          <w:tcPr>
+            <w:tcW w:type="dxa" w:w="2550"/>
+          </w:tcPr>
+          <w:p>
+            <w:r/>
+            <w:r>
+              <w:rPr>
+                <w:rFonts w:ascii="Calibri" w:hAnsi="Calibri" w:eastAsia="微软雅黑"/>
+                <w:b w:val="0"/>
+                <w:sz w:val="16"/>
+              </w:rPr>
+              <w:t>10,000,000</w:t>
+            </w:r>
+          </w:p>
+        </w:tc>
+        <w:tc>
+          <w:tcPr>
+            <w:tcW w:type="dxa" w:w="2550"/>
+          </w:tcPr>
+          <w:p>
+            <w:r/>
+            <w:r>
+              <w:rPr>
+                <w:rFonts w:ascii="Calibri" w:hAnsi="Calibri" w:eastAsia="微软雅黑"/>
+                <w:b w:val="0"/>
+                <w:sz w:val="16"/>
+              </w:rPr>
+              <w:t>2^24 行 × 4</w:t>
+            </w:r>
+          </w:p>
+        </w:tc>
+        <w:tc>
+          <w:tcPr>
+            <w:tcW w:type="dxa" w:w="2550"/>
+          </w:tcPr>
+          <w:p>
+            <w:r/>
+            <w:r>
+              <w:rPr>
+                <w:rFonts w:ascii="Calibri" w:hAnsi="Calibri" w:eastAsia="微软雅黑"/>
+                <w:b w:val="0"/>
+                <w:sz w:val="16"/>
+              </w:rPr>
+              <w:t>按真实五元组的经验频率采样</w:t>
+            </w:r>
+          </w:p>
+        </w:tc>
+      </w:tr>
+      <w:tr>
+        <w:tc>
+          <w:tcPr>
+            <w:tcW w:type="dxa" w:w="2550"/>
+          </w:tcPr>
+          <w:p>
+            <w:r/>
+            <w:r>
+              <w:rPr>
+                <w:rFonts w:ascii="Calibri" w:hAnsi="Calibri" w:eastAsia="微软雅黑"/>
+                <w:b w:val="0"/>
+                <w:sz w:val="16"/>
+              </w:rPr>
+              <w:t>CTU 全量</w:t>
+            </w:r>
+          </w:p>
+        </w:tc>
+        <w:tc>
+          <w:tcPr>
+            <w:tcW w:type="dxa" w:w="2550"/>
+          </w:tcPr>
+          <w:p>
+            <w:r/>
+            <w:r>
+              <w:rPr>
+                <w:rFonts w:ascii="Calibri" w:hAnsi="Calibri" w:eastAsia="微软雅黑"/>
+                <w:b w:val="0"/>
+                <w:sz w:val="16"/>
+              </w:rPr>
+              <w:t>1,602,033</w:t>
+            </w:r>
+          </w:p>
+        </w:tc>
+        <w:tc>
+          <w:tcPr>
+            <w:tcW w:type="dxa" w:w="2550"/>
+          </w:tcPr>
+          <w:p>
+            <w:r/>
+            <w:r>
+              <w:rPr>
+                <w:rFonts w:ascii="Calibri" w:hAnsi="Calibri" w:eastAsia="微软雅黑"/>
+                <w:b w:val="0"/>
+                <w:sz w:val="16"/>
+              </w:rPr>
+              <w:t>2^24 行 × 4</w:t>
+            </w:r>
+          </w:p>
+        </w:tc>
+        <w:tc>
+          <w:tcPr>
+            <w:tcW w:type="dxa" w:w="2550"/>
+          </w:tcPr>
+          <w:p>
+            <w:r/>
+            <w:r>
+              <w:rPr>
+                <w:rFonts w:ascii="Calibri" w:hAnsi="Calibri" w:eastAsia="微软雅黑"/>
+                <w:b w:val="0"/>
+                <w:sz w:val="16"/>
+              </w:rPr>
+              <w:t>原始互异五元组</w:t>
+            </w:r>
+          </w:p>
+        </w:tc>
+      </w:tr>
+      <w:tr>
+        <w:tc>
+          <w:tcPr>
+            <w:tcW w:type="dxa" w:w="2550"/>
+          </w:tcPr>
+          <w:p>
+            <w:r/>
+            <w:r>
+              <w:rPr>
+                <w:rFonts w:ascii="Calibri" w:hAnsi="Calibri" w:eastAsia="微软雅黑"/>
+                <w:b w:val="0"/>
+                <w:sz w:val="16"/>
+              </w:rPr>
+              <w:t>无副表</w:t>
+            </w:r>
+          </w:p>
+        </w:tc>
+        <w:tc>
+          <w:tcPr>
+            <w:tcW w:type="dxa" w:w="2550"/>
+          </w:tcPr>
+          <w:p>
+            <w:r/>
+            <w:r>
+              <w:rPr>
+                <w:rFonts w:ascii="Calibri" w:hAnsi="Calibri" w:eastAsia="微软雅黑"/>
+                <w:b w:val="0"/>
+                <w:sz w:val="16"/>
+              </w:rPr>
+              <w:t>10,000,000</w:t>
+            </w:r>
+          </w:p>
+        </w:tc>
+        <w:tc>
+          <w:tcPr>
+            <w:tcW w:type="dxa" w:w="2550"/>
+          </w:tcPr>
+          <w:p>
+            <w:r/>
+            <w:r>
+              <w:rPr>
+                <w:rFonts w:ascii="Calibri" w:hAnsi="Calibri" w:eastAsia="微软雅黑"/>
+                <w:b w:val="0"/>
+                <w:sz w:val="16"/>
+              </w:rPr>
+              <w:t>2^24 行 × 4</w:t>
+            </w:r>
+          </w:p>
+        </w:tc>
+        <w:tc>
+          <w:tcPr>
+            <w:tcW w:type="dxa" w:w="2550"/>
+          </w:tcPr>
+          <w:p>
+            <w:r/>
+            <w:r>
+              <w:rPr>
+                <w:rFonts w:ascii="Calibri" w:hAnsi="Calibri" w:eastAsia="微软雅黑"/>
+                <w:b w:val="0"/>
+                <w:sz w:val="16"/>
+              </w:rPr>
+              <w:t>去掉碰撞表</w:t>
+            </w:r>
+          </w:p>
+        </w:tc>
+      </w:tr>
+      <w:tr>
+        <w:tc>
+          <w:tcPr>
+            <w:tcW w:type="dxa" w:w="2550"/>
+          </w:tcPr>
+          <w:p>
+            <w:r/>
+            <w:r>
+              <w:rPr>
+                <w:rFonts w:ascii="Calibri" w:hAnsi="Calibri" w:eastAsia="微软雅黑"/>
+                <w:b w:val="0"/>
+                <w:sz w:val="16"/>
+              </w:rPr>
+              <w:t>粗哈希</w:t>
+            </w:r>
+          </w:p>
+        </w:tc>
+        <w:tc>
+          <w:tcPr>
+            <w:tcW w:type="dxa" w:w="2550"/>
+          </w:tcPr>
+          <w:p>
+            <w:r/>
+            <w:r>
+              <w:rPr>
+                <w:rFonts w:ascii="Calibri" w:hAnsi="Calibri" w:eastAsia="微软雅黑"/>
+                <w:b w:val="0"/>
+                <w:sz w:val="16"/>
+              </w:rPr>
+              <w:t>10,000,000</w:t>
+            </w:r>
+          </w:p>
+        </w:tc>
+        <w:tc>
+          <w:tcPr>
+            <w:tcW w:type="dxa" w:w="2550"/>
+          </w:tcPr>
+          <w:p>
+            <w:r/>
+            <w:r>
+              <w:rPr>
+                <w:rFonts w:ascii="Calibri" w:hAnsi="Calibri" w:eastAsia="微软雅黑"/>
+                <w:b w:val="0"/>
+                <w:sz w:val="16"/>
+              </w:rPr>
+              <w:t>2^24 行 × 4</w:t>
+            </w:r>
+          </w:p>
+        </w:tc>
+        <w:tc>
+          <w:tcPr>
+            <w:tcW w:type="dxa" w:w="2550"/>
+          </w:tcPr>
+          <w:p>
+            <w:r/>
+            <w:r>
+              <w:rPr>
+                <w:rFonts w:ascii="Calibri" w:hAnsi="Calibri" w:eastAsia="微软雅黑"/>
+                <w:b w:val="0"/>
+                <w:sz w:val="16"/>
+              </w:rPr>
+              <w:t>行号只由 Zipf 组决定</w:t>
+            </w:r>
+          </w:p>
+        </w:tc>
+      </w:tr>
+      <w:tr>
+        <w:tc>
+          <w:tcPr>
+            <w:tcW w:type="dxa" w:w="2550"/>
+          </w:tcPr>
+          <w:p>
+            <w:r/>
+            <w:r>
+              <w:rPr>
+                <w:rFonts w:ascii="Calibri" w:hAnsi="Calibri" w:eastAsia="微软雅黑"/>
+                <w:b w:val="0"/>
+                <w:sz w:val="16"/>
+              </w:rPr>
+              <w:t>1677万，2^22 行</w:t>
+            </w:r>
+          </w:p>
+        </w:tc>
+        <w:tc>
+          <w:tcPr>
+            <w:tcW w:type="dxa" w:w="2550"/>
+          </w:tcPr>
+          <w:p>
+            <w:r/>
+            <w:r>
+              <w:rPr>
+                <w:rFonts w:ascii="Calibri" w:hAnsi="Calibri" w:eastAsia="微软雅黑"/>
+                <w:b w:val="0"/>
+                <w:sz w:val="16"/>
+              </w:rPr>
+              <w:t>16,777,216</w:t>
+            </w:r>
+          </w:p>
+        </w:tc>
+        <w:tc>
+          <w:tcPr>
+            <w:tcW w:type="dxa" w:w="2550"/>
+          </w:tcPr>
+          <w:p>
+            <w:r/>
+            <w:r>
+              <w:rPr>
+                <w:rFonts w:ascii="Calibri" w:hAnsi="Calibri" w:eastAsia="微软雅黑"/>
+                <w:b w:val="0"/>
+                <w:sz w:val="16"/>
+              </w:rPr>
+              <w:t>2^22 行 × 4</w:t>
+            </w:r>
+          </w:p>
+        </w:tc>
+        <w:tc>
+          <w:tcPr>
+            <w:tcW w:type="dxa" w:w="2550"/>
+          </w:tcPr>
+          <w:p>
+            <w:r/>
+            <w:r>
+              <w:rPr>
+                <w:rFonts w:ascii="Calibri" w:hAnsi="Calibri" w:eastAsia="微软雅黑"/>
+                <w:b w:val="0"/>
+                <w:sz w:val="16"/>
+              </w:rPr>
+              <w:t>紧凑几何，λ = 4</w:t>
+            </w:r>
+          </w:p>
+        </w:tc>
+      </w:tr>
+      <w:tr>
+        <w:tc>
+          <w:tcPr>
+            <w:tcW w:type="dxa" w:w="2550"/>
+          </w:tcPr>
+          <w:p>
+            <w:r/>
+            <w:r>
+              <w:rPr>
+                <w:rFonts w:ascii="Calibri" w:hAnsi="Calibri" w:eastAsia="微软雅黑"/>
+                <w:b w:val="0"/>
+                <w:sz w:val="16"/>
+              </w:rPr>
+              <w:t>25% 到 100%</w:t>
+            </w:r>
+          </w:p>
+        </w:tc>
+        <w:tc>
+          <w:tcPr>
+            <w:tcW w:type="dxa" w:w="2550"/>
+          </w:tcPr>
+          <w:p>
+            <w:r/>
+            <w:r>
+              <w:rPr>
+                <w:rFonts w:ascii="Calibri" w:hAnsi="Calibri" w:eastAsia="微软雅黑"/>
+                <w:b w:val="0"/>
+                <w:sz w:val="16"/>
+              </w:rPr>
+              <w:t>该比例 × 2^24</w:t>
+            </w:r>
+          </w:p>
+        </w:tc>
+        <w:tc>
+          <w:tcPr>
+            <w:tcW w:type="dxa" w:w="2550"/>
+          </w:tcPr>
+          <w:p>
+            <w:r/>
+            <w:r>
+              <w:rPr>
+                <w:rFonts w:ascii="Calibri" w:hAnsi="Calibri" w:eastAsia="微软雅黑"/>
+                <w:b w:val="0"/>
+                <w:sz w:val="16"/>
+              </w:rPr>
+              <w:t>看该图标题</w:t>
+            </w:r>
+          </w:p>
+        </w:tc>
+        <w:tc>
+          <w:tcPr>
+            <w:tcW w:type="dxa" w:w="2550"/>
+          </w:tcPr>
+          <w:p>
+            <w:r/>
+            <w:r>
+              <w:rPr>
+                <w:rFonts w:ascii="Calibri" w:hAnsi="Calibri" w:eastAsia="微软雅黑"/>
+                <w:b w:val="0"/>
+                <w:sz w:val="16"/>
+              </w:rPr>
+              <w:t>负载 = 条数 / 2^24</w:t>
+            </w:r>
+          </w:p>
+        </w:tc>
+      </w:tr>
+    </w:tbl>
+    <w:p/>
+    <w:p>
+      <w:pPr>
+        <w:spacing w:after="120" w:before="0" w:line="276" w:lineRule="auto"/>
+      </w:pPr>
+      <w:r>
+        <w:rPr>
+          <w:rFonts w:ascii="Calibri" w:hAnsi="Calibri" w:eastAsia="微软雅黑"/>
+          <w:b w:val="0"/>
+          <w:sz w:val="18"/>
+        </w:rPr>
+        <w:t>表 0  实验图横轴刻度。1677 万是 2^24 = 16,777,216 的四舍五入写法，程序里用的是精确整数。</w:t>
       </w:r>
     </w:p>
     <w:p>
@@ -4064,12 +4904,25 @@
     </w:p>
     <w:p>
       <w:pPr>
+        <w:spacing w:after="120" w:before="0" w:line="276" w:lineRule="auto"/>
+      </w:pPr>
+      <w:r>
+        <w:rPr>
+          <w:rFonts w:ascii="Calibri" w:hAnsi="Calibri" w:eastAsia="微软雅黑"/>
+          <w:b w:val="0"/>
+          <w:sz w:val="22"/>
+        </w:rPr>
+        <w:t>图 8 的横轴是一次插入实验。左图四档从左到右：1000 万条均匀、1677 万条配满、2000 万条、CTU 采样 1000 万条，主表都是 2^24 行。纵轴是主表 4 个槽放不下的 key 占该档条数的百分比。右图在这四档后面加了第五档：同样 1677 万条放进 2^22 行。右图纵轴是两级都放不下的 key，也就是插入失败率。左图不画第五档，是因为 19.53% 会把前四档千分之几的柱子压成一条线。</w:t>
+      </w:r>
+    </w:p>
+    <w:p>
+      <w:pPr>
         <w:jc w:val="center"/>
       </w:pPr>
       <w:r>
         <w:drawing>
           <wp:inline xmlns:a="http://schemas.openxmlformats.org/drawingml/2006/main" xmlns:pic="http://schemas.openxmlformats.org/drawingml/2006/picture">
-            <wp:extent cx="5806440" cy="2255394"/>
+            <wp:extent cx="5806440" cy="2451608"/>
             <wp:docPr id="11" name="Picture 11"/>
             <wp:cNvGraphicFramePr>
               <a:graphicFrameLocks noChangeAspect="1"/>
@@ -4090,7 +4943,7 @@
                   <pic:spPr>
                     <a:xfrm>
                       <a:off x="0" y="0"/>
-                      <a:ext cx="5806440" cy="2255394"/>
+                      <a:ext cx="5806440" cy="2451608"/>
                     </a:xfrm>
                     <a:prstGeom prst="rect"/>
                   </pic:spPr>
@@ -4113,7 +4966,46 @@
           <w:color w:val="3C4650"/>
           <w:sz w:val="18"/>
         </w:rPr>
-        <w:t>图 8  溢出率与失败率。左图把 D 拿开，否则 19% 会把千分之几的柱子压没</w:t>
+        <w:t>图 8  左：主表溢出率，横轴四档都是 2^24 行。右：插入失败率，最后一档是 2^22 行</w:t>
+      </w:r>
+    </w:p>
+    <w:p>
+      <w:pPr>
+        <w:spacing w:after="120" w:before="0" w:line="276" w:lineRule="auto"/>
+      </w:pPr>
+      <w:r>
+        <w:rPr>
+          <w:rFonts w:ascii="Calibri" w:hAnsi="Calibri" w:eastAsia="微软雅黑"/>
+          <w:b w:val="0"/>
+          <w:sz w:val="22"/>
+        </w:rPr>
+        <w:t>前四档仿真柱和 Poisson 公式柱贴在一起，失败率是 0。第五档失败率升到约 7.07%，公式给出同一高度。驱动几何把溢出留在主表的千分之几，紧凑几何把同一批 key 的失败率抬到百分之七。</w:t>
+      </w:r>
+    </w:p>
+    <w:p>
+      <w:pPr>
+        <w:spacing w:after="120" w:before="0" w:line="276" w:lineRule="auto"/>
+      </w:pPr>
+      <w:r>
+        <w:rPr>
+          <w:rFonts w:ascii="Calibri" w:hAnsi="Calibri" w:eastAsia="微软雅黑"/>
+          <w:b w:val="0"/>
+          <w:sz w:val="22"/>
+        </w:rPr>
+        <w:t>小结：均匀和真实五元组在驱动几何上失败为 0；把行数收成 2^22，失败率离开设计点。</w:t>
+      </w:r>
+    </w:p>
+    <w:p>
+      <w:pPr>
+        <w:spacing w:after="120" w:before="0" w:line="276" w:lineRule="auto"/>
+      </w:pPr>
+      <w:r>
+        <w:rPr>
+          <w:rFonts w:ascii="Calibri" w:hAnsi="Calibri" w:eastAsia="微软雅黑"/>
+          <w:b w:val="0"/>
+          <w:sz w:val="22"/>
+        </w:rPr>
+        <w:t>图 9 的横轴十档从左到右是：1000 万均匀、1677 万配满、2000 万、1000 万另一套哈希、1000 万重尾但全字段进哈希、CTU 采样 1000 万、CTU 全量 160 万、1000 万去掉碰撞表、1677 万放进 2^22 行、1000 万粗哈希。十档里只有“2^22 行”的主表是 2^22 行 × 4 槽，其余九档都是 2^24 行 × 4 槽。“无副表”去掉了碰撞表，其余九档都带碰撞表。纵轴三段叠在一起，加起来是 100%：绿色是主行有空槽、只发 1 次 WQE，橙色是主行已满、再发 1 次碰撞 WQE，红色是碰撞行也满、插入失败。图例在图的右侧。</w:t>
       </w:r>
     </w:p>
     <w:p>
@@ -4123,7 +5015,7 @@
       <w:r>
         <w:drawing>
           <wp:inline xmlns:a="http://schemas.openxmlformats.org/drawingml/2006/main" xmlns:pic="http://schemas.openxmlformats.org/drawingml/2006/picture">
-            <wp:extent cx="5806440" cy="2292016"/>
+            <wp:extent cx="5806440" cy="2399871"/>
             <wp:docPr id="12" name="Picture 12"/>
             <wp:cNvGraphicFramePr>
               <a:graphicFrameLocks noChangeAspect="1"/>
@@ -4144,7 +5036,7 @@
                   <pic:spPr>
                     <a:xfrm>
                       <a:off x="0" y="0"/>
-                      <a:ext cx="5806440" cy="2292016"/>
+                      <a:ext cx="5806440" cy="2399871"/>
                     </a:xfrm>
                     <a:prstGeom prst="rect"/>
                   </pic:spPr>
@@ -4167,7 +5059,46 @@
           <w:color w:val="3C4650"/>
           <w:sz w:val="18"/>
         </w:rPr>
-        <w:t>图 9  每条规则的 WQE 步数。绿色是 1 步，橙色是 2 步，红色是失败</w:t>
+        <w:t>图 9  横轴每一档是一次插入。绿=1 次 WQE，橙=2 次 WQE，红=失败</w:t>
+      </w:r>
+    </w:p>
+    <w:p>
+      <w:pPr>
+        <w:spacing w:after="120" w:before="0" w:line="276" w:lineRule="auto"/>
+      </w:pPr>
+      <w:r>
+        <w:rPr>
+          <w:rFonts w:ascii="Calibri" w:hAnsi="Calibri" w:eastAsia="微软雅黑"/>
+          <w:b w:val="0"/>
+          <w:sz w:val="22"/>
+        </w:rPr>
+        <w:t>前七档几乎全绿，橙色只有柱顶一条细边，红色是 0。无副表的失败只有 0.072%，整根柱子看起来仍是绿色，柱顶用红字标出这 7169 条，条数和均匀 1000 万的溢出条数相同。2^22 行的柱顶红字是失败 7.07%。粗哈希的柱顶红字是失败 14.1%，橙色和红色占了绝大部分，因为很多 key 挤进少数行。</w:t>
+      </w:r>
+    </w:p>
+    <w:p>
+      <w:pPr>
+        <w:spacing w:after="120" w:before="0" w:line="276" w:lineRule="auto"/>
+      </w:pPr>
+      <w:r>
+        <w:rPr>
+          <w:rFonts w:ascii="Calibri" w:hAnsi="Calibri" w:eastAsia="微软雅黑"/>
+          <w:b w:val="0"/>
+          <w:sz w:val="22"/>
+        </w:rPr>
+        <w:t>小结：成功的插入只有 1 次或 2 次 WQE。失败只出现在去掉副表、收紧行数、或哈希没有把热点打散的时候。</w:t>
+      </w:r>
+    </w:p>
+    <w:p>
+      <w:pPr>
+        <w:spacing w:after="120" w:before="0" w:line="276" w:lineRule="auto"/>
+      </w:pPr>
+      <w:r>
+        <w:rPr>
+          <w:rFonts w:ascii="Calibri" w:hAnsi="Calibri" w:eastAsia="微软雅黑"/>
+          <w:b w:val="0"/>
+          <w:sz w:val="22"/>
+        </w:rPr>
+        <w:t>图 10 的横轴 k 是哈希落到同一主表行的 key 条数，从 0 画到 12。k=0 是空行，k=4 是刚好写满 4 个槽，k&gt;4 表示这行还有 key 要进冲突表。纵轴是这样的行占主表 2^24 行的比例。实线是仿真，虚线是 Poisson。圆点是 1000 万条，λ = 0.596；方点是配满 1677 万条，λ = 1。</w:t>
       </w:r>
     </w:p>
     <w:p>
@@ -4177,7 +5108,7 @@
       <w:r>
         <w:drawing>
           <wp:inline xmlns:a="http://schemas.openxmlformats.org/drawingml/2006/main" xmlns:pic="http://schemas.openxmlformats.org/drawingml/2006/picture">
-            <wp:extent cx="5806440" cy="3225800"/>
+            <wp:extent cx="5806440" cy="3327286"/>
             <wp:docPr id="13" name="Picture 13"/>
             <wp:cNvGraphicFramePr>
               <a:graphicFrameLocks noChangeAspect="1"/>
@@ -4198,7 +5129,7 @@
                   <pic:spPr>
                     <a:xfrm>
                       <a:off x="0" y="0"/>
-                      <a:ext cx="5806440" cy="3225800"/>
+                      <a:ext cx="5806440" cy="3327286"/>
                     </a:xfrm>
                     <a:prstGeom prst="rect"/>
                   </pic:spPr>
@@ -4221,7 +5152,46 @@
           <w:color w:val="3C4650"/>
           <w:sz w:val="18"/>
         </w:rPr>
-        <w:t>图 10  均匀哈希的行到达直方图与 Poisson</w:t>
+        <w:t>图 10  横轴是一行上的到达条数 k。两条实线分别是 1000 万和配满，虚线是对应的 Poisson</w:t>
+      </w:r>
+    </w:p>
+    <w:p>
+      <w:pPr>
+        <w:spacing w:after="120" w:before="0" w:line="276" w:lineRule="auto"/>
+      </w:pPr>
+      <w:r>
+        <w:rPr>
+          <w:rFonts w:ascii="Calibri" w:hAnsi="Calibri" w:eastAsia="微软雅黑"/>
+          <w:b w:val="0"/>
+          <w:sz w:val="22"/>
+        </w:rPr>
+        <w:t>两条实线和虚线重合。配满时 k=0 和 k=1 各约占 37%，k=2 约占 18%，更长的尾巴变矮。这就是主表大约四分之三的槽空着、溢出却只有 0.44% 的原因：大多数行只来了 0 条或 1 条。</w:t>
+      </w:r>
+    </w:p>
+    <w:p>
+      <w:pPr>
+        <w:spacing w:after="120" w:before="0" w:line="276" w:lineRule="auto"/>
+      </w:pPr>
+      <w:r>
+        <w:rPr>
+          <w:rFonts w:ascii="Calibri" w:hAnsi="Calibri" w:eastAsia="微软雅黑"/>
+          <w:b w:val="0"/>
+          <w:sz w:val="22"/>
+        </w:rPr>
+        <w:t>小结：均匀哈希的行到达数服从 Poisson，图上的点和公式是同一条曲线。</w:t>
+      </w:r>
+    </w:p>
+    <w:p>
+      <w:pPr>
+        <w:spacing w:after="120" w:before="0" w:line="276" w:lineRule="auto"/>
+      </w:pPr>
+      <w:r>
+        <w:rPr>
+          <w:rFonts w:ascii="Calibri" w:hAnsi="Calibri" w:eastAsia="微软雅黑"/>
+          <w:b w:val="0"/>
+          <w:sz w:val="22"/>
+        </w:rPr>
+        <w:t>图 11 的横轴四项都按同一批 16,777,216 条均匀 key 计算。从左到右：主表槽位利用率、主表溢出占 key 数的百分比、需要第 2 次 WQE 的 key 占 key 数的百分比、插入失败占 key 数的百分比。每一组左边青色柱是驱动几何 2^24 行，右边珊瑚色柱是紧凑几何 2^22 行。利用率的分母是槽位数 4×行数，后三项的分母是 key 数。</w:t>
       </w:r>
     </w:p>
     <w:p>
@@ -4231,7 +5201,7 @@
       <w:r>
         <w:drawing>
           <wp:inline xmlns:a="http://schemas.openxmlformats.org/drawingml/2006/main" xmlns:pic="http://schemas.openxmlformats.org/drawingml/2006/picture">
-            <wp:extent cx="5806440" cy="3287984"/>
+            <wp:extent cx="5806440" cy="3381773"/>
             <wp:docPr id="14" name="Picture 14"/>
             <wp:cNvGraphicFramePr>
               <a:graphicFrameLocks noChangeAspect="1"/>
@@ -4252,7 +5222,7 @@
                   <pic:spPr>
                     <a:xfrm>
                       <a:off x="0" y="0"/>
-                      <a:ext cx="5806440" cy="3287984"/>
+                      <a:ext cx="5806440" cy="3381773"/>
                     </a:xfrm>
                     <a:prstGeom prst="rect"/>
                   </pic:spPr>
@@ -4275,7 +5245,46 @@
           <w:color w:val="3C4650"/>
           <w:sz w:val="18"/>
         </w:rPr>
-        <w:t>图 11  同一批 2^24 条均匀 key，驱动行数与 2^22 行的对照</w:t>
+        <w:t>图 11  横轴四项的含义见上。左柱 2^24 行，右柱 2^22 行，key 都是 16,777,216 条</w:t>
+      </w:r>
+    </w:p>
+    <w:p>
+      <w:pPr>
+        <w:spacing w:after="120" w:before="0" w:line="276" w:lineRule="auto"/>
+      </w:pPr>
+      <w:r>
+        <w:rPr>
+          <w:rFonts w:ascii="Calibri" w:hAnsi="Calibri" w:eastAsia="微软雅黑"/>
+          <w:b w:val="0"/>
+          <w:sz w:val="22"/>
+        </w:rPr>
+        <w:t>2^24 行的利用率约 24.9%，溢出和 2 次 WQE 都是 0.44%，失败是 0。2^22 行的利用率升到约 80.5%，溢出约 19.5%，失败约 7.07%。利用率没有到 100%，是因为溢出的 key 没有留在主表槽里。</w:t>
+      </w:r>
+    </w:p>
+    <w:p>
+      <w:pPr>
+        <w:spacing w:after="120" w:before="0" w:line="276" w:lineRule="auto"/>
+      </w:pPr>
+      <w:r>
+        <w:rPr>
+          <w:rFonts w:ascii="Calibri" w:hAnsi="Calibri" w:eastAsia="微软雅黑"/>
+          <w:b w:val="0"/>
+          <w:sz w:val="22"/>
+        </w:rPr>
+        <w:t>小结：多出来的行换来的是失败率从 7% 回到 0，代价是主表大约四分之三的槽空着。</w:t>
+      </w:r>
+    </w:p>
+    <w:p>
+      <w:pPr>
+        <w:spacing w:after="120" w:before="0" w:line="276" w:lineRule="auto"/>
+      </w:pPr>
+      <w:r>
+        <w:rPr>
+          <w:rFonts w:ascii="Calibri" w:hAnsi="Calibri" w:eastAsia="微软雅黑"/>
+          <w:b w:val="0"/>
+          <w:sz w:val="22"/>
+        </w:rPr>
+        <w:t>图 12 的横轴是 λ，等于插入条数除以主表行数。四个位置从左到右：0.596 是 1000 万条除以 2^24 行，1 是配满，1.19 是 2000 万条除以 2^24 行，4 是 1677 万条除以 2^22 行。纵轴是百分比。前三个点连成线，属于驱动几何；λ=4 的两个点单独标出，属于紧凑几何。青色是主表利用率，绿色是驱动几何的失败率，珊瑚色点是紧凑几何的利用率，橙色点是紧凑几何的失败率。</w:t>
       </w:r>
     </w:p>
     <w:p>
@@ -4285,7 +5294,7 @@
       <w:r>
         <w:drawing>
           <wp:inline xmlns:a="http://schemas.openxmlformats.org/drawingml/2006/main" xmlns:pic="http://schemas.openxmlformats.org/drawingml/2006/picture">
-            <wp:extent cx="5806440" cy="3225800"/>
+            <wp:extent cx="5806440" cy="3381773"/>
             <wp:docPr id="15" name="Picture 15"/>
             <wp:cNvGraphicFramePr>
               <a:graphicFrameLocks noChangeAspect="1"/>
@@ -4306,7 +5315,7 @@
                   <pic:spPr>
                     <a:xfrm>
                       <a:off x="0" y="0"/>
-                      <a:ext cx="5806440" cy="3225800"/>
+                      <a:ext cx="5806440" cy="3381773"/>
                     </a:xfrm>
                     <a:prstGeom prst="rect"/>
                   </pic:spPr>
@@ -4329,7 +5338,46 @@
           <w:color w:val="3C4650"/>
           <w:sz w:val="18"/>
         </w:rPr>
-        <w:t>图 12  利用率、失败率随 λ 的变化。紧凑几何的点单独标出</w:t>
+        <w:t>图 12  横轴 λ = 条数 / 行数。0.596、1、1.19 是 2^24 行，λ=4 是 2^22 行</w:t>
+      </w:r>
+    </w:p>
+    <w:p>
+      <w:pPr>
+        <w:spacing w:after="120" w:before="0" w:line="276" w:lineRule="auto"/>
+      </w:pPr>
+      <w:r>
+        <w:rPr>
+          <w:rFonts w:ascii="Calibri" w:hAnsi="Calibri" w:eastAsia="微软雅黑"/>
+          <w:b w:val="0"/>
+          <w:sz w:val="22"/>
+        </w:rPr>
+        <w:t>驱动几何上利用率随 λ 近似线性升到约 25%，失败率贴着 0。紧凑几何的利用率跳到约 80%，失败率跳到约 7%。空着的槽是行内容量：每行只放平均 1 条时，Poisson 起伏很少能填满 4 个槽。</w:t>
+      </w:r>
+    </w:p>
+    <w:p>
+      <w:pPr>
+        <w:spacing w:after="120" w:before="0" w:line="276" w:lineRule="auto"/>
+      </w:pPr>
+      <w:r>
+        <w:rPr>
+          <w:rFonts w:ascii="Calibri" w:hAnsi="Calibri" w:eastAsia="微软雅黑"/>
+          <w:b w:val="0"/>
+          <w:sz w:val="22"/>
+        </w:rPr>
+        <w:t>小结：失败率对 λ 很敏感。驱动把配满点放在 λ=1，紧凑几何把同一批 key 放到 λ=4。</w:t>
+      </w:r>
+    </w:p>
+    <w:p>
+      <w:pPr>
+        <w:spacing w:after="120" w:before="0" w:line="276" w:lineRule="auto"/>
+      </w:pPr>
+      <w:r>
+        <w:rPr>
+          <w:rFonts w:ascii="Calibri" w:hAnsi="Calibri" w:eastAsia="微软雅黑"/>
+          <w:b w:val="0"/>
+          <w:sz w:val="22"/>
+        </w:rPr>
+        <w:t>图 13 的横轴 k 仍是落到同一主表行的 key 条数，只画 0 到 20。这张图是粗哈希、1000 万条、主表 2^24 行。纵轴是这样的行占 2^24 行的比例，用对数，否则 k=0 那根约 97.9% 的柱子会把后面的柱子压成一条线。k≥47 的行有 6986 行，没有画在图里；k=47 这个桶在数据里是“47 以及更多”的合计。</w:t>
       </w:r>
     </w:p>
     <w:p>
@@ -4339,7 +5387,7 @@
       <w:r>
         <w:drawing>
           <wp:inline xmlns:a="http://schemas.openxmlformats.org/drawingml/2006/main" xmlns:pic="http://schemas.openxmlformats.org/drawingml/2006/picture">
-            <wp:extent cx="5806440" cy="3225800"/>
+            <wp:extent cx="5806440" cy="3327286"/>
             <wp:docPr id="16" name="Picture 16"/>
             <wp:cNvGraphicFramePr>
               <a:graphicFrameLocks noChangeAspect="1"/>
@@ -4360,7 +5408,7 @@
                   <pic:spPr>
                     <a:xfrm>
                       <a:off x="0" y="0"/>
-                      <a:ext cx="5806440" cy="3225800"/>
+                      <a:ext cx="5806440" cy="3327286"/>
                     </a:xfrm>
                     <a:prstGeom prst="rect"/>
                   </pic:spPr>
@@ -4383,7 +5431,33 @@
           <w:color w:val="3C4650"/>
           <w:sz w:val="18"/>
         </w:rPr>
-        <w:t>图 13  粗哈希重尾下，大多数行是空的</w:t>
+        <w:t>图 13  横轴 k=0 到 20。纵轴是行的比例，对数。粗哈希、1000 万条。k≥47 的 6986 行不在图上</w:t>
+      </w:r>
+    </w:p>
+    <w:p>
+      <w:pPr>
+        <w:spacing w:after="120" w:before="0" w:line="276" w:lineRule="auto"/>
+      </w:pPr>
+      <w:r>
+        <w:rPr>
+          <w:rFonts w:ascii="Calibri" w:hAnsi="Calibri" w:eastAsia="微软雅黑"/>
+          <w:b w:val="0"/>
+          <w:sz w:val="22"/>
+        </w:rPr>
+        <w:t>k=0 的柱子占了大约 97.9% 的行。少数行的 k 一直延伸到几十。主表利用率因此只有约 1%，热点行立刻溢出，碰撞表也接不住，失败约 14.1%。</w:t>
+      </w:r>
+    </w:p>
+    <w:p>
+      <w:pPr>
+        <w:spacing w:after="120" w:before="0" w:line="276" w:lineRule="auto"/>
+      </w:pPr>
+      <w:r>
+        <w:rPr>
+          <w:rFonts w:ascii="Calibri" w:hAnsi="Calibri" w:eastAsia="微软雅黑"/>
+          <w:b w:val="0"/>
+          <w:sz w:val="22"/>
+        </w:rPr>
+        <w:t>小结：行号如果只由一个重尾字段决定，空行占绝大多数，失败集中在少数热点行。</w:t>
       </w:r>
     </w:p>
     <w:tbl>
@@ -7255,12 +8329,25 @@
     </w:p>
     <w:p>
       <w:pPr>
+        <w:spacing w:after="120" w:before="0" w:line="276" w:lineRule="auto"/>
+      </w:pPr>
+      <w:r>
+        <w:rPr>
+          <w:rFonts w:ascii="Calibri" w:hAnsi="Calibri" w:eastAsia="微软雅黑"/>
+          <w:b w:val="0"/>
+          <w:sz w:val="22"/>
+        </w:rPr>
+        <w:t>图 14 的横轴五档都是插入条数 / 2^24，主表始终是 2^24 行 × 4。从左到右：25% = 4,194,304 条，50% = 8,388,608 条，70% = 11,744,051 条，90% = 15,099,494 条，100% = 16,777,216 条。70% 是 BWC 扩行水位。左图纵轴是主表溢出占该档条数的百分比，右图纵轴是冲突表溢出，也就是插入失败率。</w:t>
+      </w:r>
+    </w:p>
+    <w:p>
+      <w:pPr>
         <w:jc w:val="center"/>
       </w:pPr>
       <w:r>
         <w:drawing>
           <wp:inline xmlns:a="http://schemas.openxmlformats.org/drawingml/2006/main" xmlns:pic="http://schemas.openxmlformats.org/drawingml/2006/picture">
-            <wp:extent cx="5806440" cy="2272085"/>
+            <wp:extent cx="5806440" cy="2554834"/>
             <wp:docPr id="17" name="Picture 17"/>
             <wp:cNvGraphicFramePr>
               <a:graphicFrameLocks noChangeAspect="1"/>
@@ -7281,7 +8368,7 @@
                   <pic:spPr>
                     <a:xfrm>
                       <a:off x="0" y="0"/>
-                      <a:ext cx="5806440" cy="2272085"/>
+                      <a:ext cx="5806440" cy="2554834"/>
                     </a:xfrm>
                     <a:prstGeom prst="rect"/>
                   </pic:spPr>
@@ -7304,7 +8391,46 @@
           <w:color w:val="3C4650"/>
           <w:sz w:val="18"/>
         </w:rPr>
-        <w:t>图 14  五档负载下的主表溢出率和冲突表溢出率</w:t>
+        <w:t>图 14  横轴是条数 / 2^24 的五档。左为主表溢出率，右为冲突表溢出率</w:t>
+      </w:r>
+    </w:p>
+    <w:p>
+      <w:pPr>
+        <w:spacing w:after="120" w:before="0" w:line="276" w:lineRule="auto"/>
+      </w:pPr>
+      <w:r>
+        <w:rPr>
+          <w:rFonts w:ascii="Calibri" w:hAnsi="Calibri" w:eastAsia="微软雅黑"/>
+          <w:b w:val="0"/>
+          <w:sz w:val="22"/>
+        </w:rPr>
+        <w:t>左图从 25% 的 124 条（0.0030%）升到 100% 的 73,470 条（0.4379%），仿真柱和公式柱重叠。25% 这一档期望溢出只有一百条出头，相对误差会显得大一些；50% 以上相对误差回到 2% 以内。右图五档都是 0。100% 并不是槽位填满：这一档平均每行只有 1 条 key，槽位利用率约 25%。</w:t>
+      </w:r>
+    </w:p>
+    <w:p>
+      <w:pPr>
+        <w:spacing w:after="120" w:before="0" w:line="276" w:lineRule="auto"/>
+      </w:pPr>
+      <w:r>
+        <w:rPr>
+          <w:rFonts w:ascii="Calibri" w:hAnsi="Calibri" w:eastAsia="微软雅黑"/>
+          <w:b w:val="0"/>
+          <w:sz w:val="22"/>
+        </w:rPr>
+        <w:t>小结：驱动几何从 25% 加到配满，主表溢出增加，冲突表一次都没有溢出。</w:t>
+      </w:r>
+    </w:p>
+    <w:p>
+      <w:pPr>
+        <w:spacing w:after="120" w:before="0" w:line="276" w:lineRule="auto"/>
+      </w:pPr>
+      <w:r>
+        <w:rPr>
+          <w:rFonts w:ascii="Calibri" w:hAnsi="Calibri" w:eastAsia="微软雅黑"/>
+          <w:b w:val="0"/>
+          <w:sz w:val="22"/>
+        </w:rPr>
+        <w:t>图 15 的横轴是主表一行里已经写下的 STE 个数，只有 0、1、2、3、4。0 是空行，4 是四个槽都满，更长的到达被记到冲突表，所以横轴到 4 为止。同一个数字上从左到右五根柱是 25%、50%、70%、90%、100%，条数和图 14 相同。纵轴是这样的行占主表 2^24 行的百分比。</w:t>
       </w:r>
     </w:p>
     <w:p>
@@ -7314,7 +8440,7 @@
       <w:r>
         <w:drawing>
           <wp:inline xmlns:a="http://schemas.openxmlformats.org/drawingml/2006/main" xmlns:pic="http://schemas.openxmlformats.org/drawingml/2006/picture">
-            <wp:extent cx="5806440" cy="3210620"/>
+            <wp:extent cx="5806440" cy="3381773"/>
             <wp:docPr id="18" name="Picture 18"/>
             <wp:cNvGraphicFramePr>
               <a:graphicFrameLocks noChangeAspect="1"/>
@@ -7335,7 +8461,7 @@
                   <pic:spPr>
                     <a:xfrm>
                       <a:off x="0" y="0"/>
-                      <a:ext cx="5806440" cy="3210620"/>
+                      <a:ext cx="5806440" cy="3381773"/>
                     </a:xfrm>
                     <a:prstGeom prst="rect"/>
                   </pic:spPr>
@@ -7358,7 +8484,46 @@
           <w:color w:val="3C4650"/>
           <w:sz w:val="18"/>
         </w:rPr>
-        <w:t>图 15  主表每行已占用的 STE 数。深度只有 0 到 4</w:t>
+        <w:t>图 15  横轴是主表一行已占用的 STE 数，0 到 4。五根柱从左到右是 25% 到 100%</w:t>
+      </w:r>
+    </w:p>
+    <w:p>
+      <w:pPr>
+        <w:spacing w:after="120" w:before="0" w:line="276" w:lineRule="auto"/>
+      </w:pPr>
+      <w:r>
+        <w:rPr>
+          <w:rFonts w:ascii="Calibri" w:hAnsi="Calibri" w:eastAsia="微软雅黑"/>
+          <w:b w:val="0"/>
+          <w:sz w:val="22"/>
+        </w:rPr>
+        <w:t>25% 时深度 0 和 1 最高。负载升高后深度 0 变矮，深度 2、3、4 变高。100% 时深度 0 占 36.78%，1 占 36.80%，2 占 18.39%，3 占 6.13%，4 占 1.90%，与 λ=1 的 Poisson 在 0 到 3 的概率以及 P(X≥4) 对齐。</w:t>
+      </w:r>
+    </w:p>
+    <w:p>
+      <w:pPr>
+        <w:spacing w:after="120" w:before="0" w:line="276" w:lineRule="auto"/>
+      </w:pPr>
+      <w:r>
+        <w:rPr>
+          <w:rFonts w:ascii="Calibri" w:hAnsi="Calibri" w:eastAsia="微软雅黑"/>
+          <w:b w:val="0"/>
+          <w:sz w:val="22"/>
+        </w:rPr>
+        <w:t>小结：配满时只有约 1.9% 的行写满 4 个槽，所以大多数 key 留在主表。</w:t>
+      </w:r>
+    </w:p>
+    <w:p>
+      <w:pPr>
+        <w:spacing w:after="120" w:before="0" w:line="276" w:lineRule="auto"/>
+      </w:pPr>
+      <w:r>
+        <w:rPr>
+          <w:rFonts w:ascii="Calibri" w:hAnsi="Calibri" w:eastAsia="微软雅黑"/>
+          <w:b w:val="0"/>
+          <w:sz w:val="22"/>
+        </w:rPr>
+        <w:t>图 16 的横轴是冲突表一行里已经写下的 STE 个数，从 0 到 16。五条线仍是图 14 的五档负载。纵轴是这样的行占冲突表 2^19 行的百分比，用对数，因为空行远多于有 key 的行。</w:t>
       </w:r>
     </w:p>
     <w:p>
@@ -7368,7 +8533,7 @@
       <w:r>
         <w:drawing>
           <wp:inline xmlns:a="http://schemas.openxmlformats.org/drawingml/2006/main" xmlns:pic="http://schemas.openxmlformats.org/drawingml/2006/picture">
-            <wp:extent cx="5806440" cy="2998931"/>
+            <wp:extent cx="5806440" cy="3046944"/>
             <wp:docPr id="19" name="Picture 19"/>
             <wp:cNvGraphicFramePr>
               <a:graphicFrameLocks noChangeAspect="1"/>
@@ -7389,7 +8554,7 @@
                   <pic:spPr>
                     <a:xfrm>
                       <a:off x="0" y="0"/>
-                      <a:ext cx="5806440" cy="2998931"/>
+                      <a:ext cx="5806440" cy="3046944"/>
                     </a:xfrm>
                     <a:prstGeom prst="rect"/>
                   </pic:spPr>
@@ -7412,7 +8577,7 @@
           <w:color w:val="3C4650"/>
           <w:sz w:val="18"/>
         </w:rPr>
-        <w:t>图 16  冲突表每行已占用的 STE 数。空行占绝大多数，纵轴用对数</w:t>
+        <w:t>图 16  横轴是冲突表一行已占用的 STE 数，0 到 16。纵轴为行的百分比，对数坐标</w:t>
       </w:r>
     </w:p>
     <w:p>
@@ -7425,7 +8590,7 @@
           <w:b w:val="0"/>
           <w:sz w:val="22"/>
         </w:rPr>
-        <w:t>主表溢出从 25% 负载的 124 条（0.0030%，公式 0.0028%）增到 100% 负载的 73,470 条（0.4379%，公式 0.4349%）。五档的冲突表溢出条数都是 0，插入失败率是 0。25% 这一档期望溢出只有一百条出头，仿真比公式多几条，相对误差会显得大一些；50% 以上相对误差回到 2% 以内。</w:t>
+        <w:t>五条线都在深度 4 之后掉到图外，深度 5 到 16 的行数是 0。100% 时 86.92% 的冲突行深度为 0，12.19% 为 1，0.85% 为 2，最深只到 4。16 个槽的上限没有被碰到。</w:t>
       </w:r>
     </w:p>
     <w:p>
@@ -7438,7 +8603,7 @@
           <w:b w:val="0"/>
           <w:sz w:val="22"/>
         </w:rPr>
-        <w:t>主表深度是这一行里实际写下的 STE 个数，到达数超过 4 的行记为深度 4，多出来的 key 记在冲突表上。100% 负载时主表深度分布是：0 占 36.78%，1 占 36.80%，2 占 18.39%，3 占 6.13%，4 占 1.90%，与 λ = 1 的 Poisson 在 0 到 3 的概率以及 P(X ≥ 4) 对齐。冲突表同一负载下 86.92% 的行深度为 0，12.19% 为 1，0.85% 为 2，最深只到 4。深度 5 到 16 的行数是 0，所以 16 个槽的上限没有被碰到，失败率保持为 0。</w:t>
+        <w:t>小结：驱动几何的冲突表在配满时仍然很空，所以插入失败率是 0。</w:t>
       </w:r>
     </w:p>
     <w:p>
@@ -8297,12 +9462,25 @@
     </w:p>
     <w:p>
       <w:pPr>
+        <w:spacing w:after="120" w:before="0" w:line="276" w:lineRule="auto"/>
+      </w:pPr>
+      <w:r>
+        <w:rPr>
+          <w:rFonts w:ascii="Calibri" w:hAnsi="Calibri" w:eastAsia="微软雅黑"/>
+          <w:b w:val="0"/>
+          <w:sz w:val="22"/>
+        </w:rPr>
+        <w:t>图 17 的横轴和图 14 相同，仍是条数 / 2^24 的五档，条数也相同。变的是表：主表 2^22 行 × 4，冲突表 2^17 行 × 16。所以 100% 这一档平均每行是 4 条，不是 1 条。左图纵轴是主表溢出率，右图纵轴是冲突表溢出率，也就是插入失败率。</w:t>
+      </w:r>
+    </w:p>
+    <w:p>
+      <w:pPr>
         <w:jc w:val="center"/>
       </w:pPr>
       <w:r>
         <w:drawing>
           <wp:inline xmlns:a="http://schemas.openxmlformats.org/drawingml/2006/main" xmlns:pic="http://schemas.openxmlformats.org/drawingml/2006/picture">
-            <wp:extent cx="5806440" cy="2272085"/>
+            <wp:extent cx="5806440" cy="2554834"/>
             <wp:docPr id="20" name="Picture 20"/>
             <wp:cNvGraphicFramePr>
               <a:graphicFrameLocks noChangeAspect="1"/>
@@ -8323,7 +9501,7 @@
                   <pic:spPr>
                     <a:xfrm>
                       <a:off x="0" y="0"/>
-                      <a:ext cx="5806440" cy="2272085"/>
+                      <a:ext cx="5806440" cy="2554834"/>
                     </a:xfrm>
                     <a:prstGeom prst="rect"/>
                   </pic:spPr>
@@ -8346,7 +9524,46 @@
           <w:color w:val="3C4650"/>
           <w:sz w:val="18"/>
         </w:rPr>
-        <w:t>图 17  2^22 行主表的溢出率，以及冲突表溢出率（插入失败率）</w:t>
+        <w:t>图 17  横轴仍是条数 / 2^24。表已收成 2^22 行。左为溢出，右为失败</w:t>
+      </w:r>
+    </w:p>
+    <w:p>
+      <w:pPr>
+        <w:spacing w:after="120" w:before="0" w:line="276" w:lineRule="auto"/>
+      </w:pPr>
+      <w:r>
+        <w:rPr>
+          <w:rFonts w:ascii="Calibri" w:hAnsi="Calibri" w:eastAsia="微软雅黑"/>
+          <w:b w:val="0"/>
+          <w:sz w:val="22"/>
+        </w:rPr>
+        <w:t>25% 时这张小表的 λ 已经是 1，溢出 0.4310%，和驱动几何配满时的 0.4379% 是同一量级，失败是 0。50% 溢出 3.75%，失败仍是 0。70% 第一次出现失败，989 条，0.0084%。90% 失败 2.63%，100% 溢出 19.53%、失败 7.07%。每一档都和 Poisson 公式重合。</w:t>
+      </w:r>
+    </w:p>
+    <w:p>
+      <w:pPr>
+        <w:spacing w:after="120" w:before="0" w:line="276" w:lineRule="auto"/>
+      </w:pPr>
+      <w:r>
+        <w:rPr>
+          <w:rFonts w:ascii="Calibri" w:hAnsi="Calibri" w:eastAsia="微软雅黑"/>
+          <w:b w:val="0"/>
+          <w:sz w:val="22"/>
+        </w:rPr>
+        <w:t>小结：同一批 key 放到 2^22 行上，50% 以前冲突表还接得住，70% 开始失败，配满时失败约 7%。</w:t>
+      </w:r>
+    </w:p>
+    <w:p>
+      <w:pPr>
+        <w:spacing w:after="120" w:before="0" w:line="276" w:lineRule="auto"/>
+      </w:pPr>
+      <w:r>
+        <w:rPr>
+          <w:rFonts w:ascii="Calibri" w:hAnsi="Calibri" w:eastAsia="微软雅黑"/>
+          <w:b w:val="0"/>
+          <w:sz w:val="22"/>
+        </w:rPr>
+        <w:t>图 18 的横轴仍是那五档条数 / 2^24。左图纵轴是主表溢出率，用对数，因为 2^24 行的溢出是千分之几，2^22 行是百分之几到百分之二十。右图纵轴是插入失败率，线性坐标。青色是 2^24 行，珊瑚色是 2^22 行。</w:t>
       </w:r>
     </w:p>
     <w:p>
@@ -8356,7 +9573,7 @@
       <w:r>
         <w:drawing>
           <wp:inline xmlns:a="http://schemas.openxmlformats.org/drawingml/2006/main" xmlns:pic="http://schemas.openxmlformats.org/drawingml/2006/picture">
-            <wp:extent cx="5806440" cy="2272085"/>
+            <wp:extent cx="5806440" cy="2470401"/>
             <wp:docPr id="21" name="Picture 21"/>
             <wp:cNvGraphicFramePr>
               <a:graphicFrameLocks noChangeAspect="1"/>
@@ -8377,7 +9594,7 @@
                   <pic:spPr>
                     <a:xfrm>
                       <a:off x="0" y="0"/>
-                      <a:ext cx="5806440" cy="2272085"/>
+                      <a:ext cx="5806440" cy="2470401"/>
                     </a:xfrm>
                     <a:prstGeom prst="rect"/>
                   </pic:spPr>
@@ -8400,7 +9617,46 @@
           <w:color w:val="3C4650"/>
           <w:sz w:val="18"/>
         </w:rPr>
-        <w:t>图 18  同一批 key 下，2^24 行与 2^22 行的溢出和失败</w:t>
+        <w:t>图 18  横轴是同一批 key 的五档。青线 2^24 行，红线 2^22 行。左为溢出（对数），右为失败率</w:t>
+      </w:r>
+    </w:p>
+    <w:p>
+      <w:pPr>
+        <w:spacing w:after="120" w:before="0" w:line="276" w:lineRule="auto"/>
+      </w:pPr>
+      <w:r>
+        <w:rPr>
+          <w:rFonts w:ascii="Calibri" w:hAnsi="Calibri" w:eastAsia="微软雅黑"/>
+          <w:b w:val="0"/>
+          <w:sz w:val="22"/>
+        </w:rPr>
+        <w:t>两条溢出曲线一起上升，2^22 行始终高一个多数量级。失败率只有红线在 70% 之后离开 0，青线五档都贴在 0 上。</w:t>
+      </w:r>
+    </w:p>
+    <w:p>
+      <w:pPr>
+        <w:spacing w:after="120" w:before="0" w:line="276" w:lineRule="auto"/>
+      </w:pPr>
+      <w:r>
+        <w:rPr>
+          <w:rFonts w:ascii="Calibri" w:hAnsi="Calibri" w:eastAsia="微软雅黑"/>
+          <w:b w:val="0"/>
+          <w:sz w:val="22"/>
+        </w:rPr>
+        <w:t>小结：行数从 2^24 收到 2^22，溢出和失败都变大；驱动几何的失败率在这五档保持为 0。</w:t>
+      </w:r>
+    </w:p>
+    <w:p>
+      <w:pPr>
+        <w:spacing w:after="120" w:before="0" w:line="276" w:lineRule="auto"/>
+      </w:pPr>
+      <w:r>
+        <w:rPr>
+          <w:rFonts w:ascii="Calibri" w:hAnsi="Calibri" w:eastAsia="微软雅黑"/>
+          <w:b w:val="0"/>
+          <w:sz w:val="22"/>
+        </w:rPr>
+        <w:t>图 19 的横轴是 2^22 行主表里一行写下的 STE 个数，0 到 4。同一个数字上从左到右五根柱仍是 25% 到 100%。纵轴是这样的行占这 2^22 行的百分比。深度 4 表示四个槽都满，多出来的 key 在冲突表。</w:t>
       </w:r>
     </w:p>
     <w:p>
@@ -8410,7 +9666,7 @@
       <w:r>
         <w:drawing>
           <wp:inline xmlns:a="http://schemas.openxmlformats.org/drawingml/2006/main" xmlns:pic="http://schemas.openxmlformats.org/drawingml/2006/picture">
-            <wp:extent cx="5806440" cy="3210620"/>
+            <wp:extent cx="5806440" cy="3381773"/>
             <wp:docPr id="22" name="Picture 22"/>
             <wp:cNvGraphicFramePr>
               <a:graphicFrameLocks noChangeAspect="1"/>
@@ -8431,7 +9687,7 @@
                   <pic:spPr>
                     <a:xfrm>
                       <a:off x="0" y="0"/>
-                      <a:ext cx="5806440" cy="3210620"/>
+                      <a:ext cx="5806440" cy="3381773"/>
                     </a:xfrm>
                     <a:prstGeom prst="rect"/>
                   </pic:spPr>
@@ -8454,7 +9710,46 @@
           <w:color w:val="3C4650"/>
           <w:sz w:val="18"/>
         </w:rPr>
-        <w:t>图 19  2^22 行主表的每行深度。深度 4 表示这一行已经放满</w:t>
+        <w:t>图 19  横轴是 2^22 行主表的行深，0 到 4。五根柱从左到右是 25% 到 100%</w:t>
+      </w:r>
+    </w:p>
+    <w:p>
+      <w:pPr>
+        <w:spacing w:after="120" w:before="0" w:line="276" w:lineRule="auto"/>
+      </w:pPr>
+      <w:r>
+        <w:rPr>
+          <w:rFonts w:ascii="Calibri" w:hAnsi="Calibri" w:eastAsia="微软雅黑"/>
+          <w:b w:val="0"/>
+          <w:sz w:val="22"/>
+        </w:rPr>
+        <w:t>25% 的形状和驱动几何配满时一样，因为两边的 λ 都是 1。100% 时深度 4 的行占 56.66%，空行只剩 1.84%。一半以上的行已经写满，所以约五分之一的 key 进了冲突表。</w:t>
+      </w:r>
+    </w:p>
+    <w:p>
+      <w:pPr>
+        <w:spacing w:after="120" w:before="0" w:line="276" w:lineRule="auto"/>
+      </w:pPr>
+      <w:r>
+        <w:rPr>
+          <w:rFonts w:ascii="Calibri" w:hAnsi="Calibri" w:eastAsia="微软雅黑"/>
+          <w:b w:val="0"/>
+          <w:sz w:val="22"/>
+        </w:rPr>
+        <w:t>小结：2^22 行在 100% 负载时，主表多数行是满的。</w:t>
+      </w:r>
+    </w:p>
+    <w:p>
+      <w:pPr>
+        <w:spacing w:after="120" w:before="0" w:line="276" w:lineRule="auto"/>
+      </w:pPr>
+      <w:r>
+        <w:rPr>
+          <w:rFonts w:ascii="Calibri" w:hAnsi="Calibri" w:eastAsia="微软雅黑"/>
+          <w:b w:val="0"/>
+          <w:sz w:val="22"/>
+        </w:rPr>
+        <w:t>图 20 的横轴是这张紧凑表的冲突行深度，0 到 16。冲突表有 2^17 行。五条线仍是 25% 到 100%。纵轴是这样的行占 2^17 行的百分比，对数坐标。深度 16 表示 16 个槽都满，再来的 key 就是插入失败。</w:t>
       </w:r>
     </w:p>
     <w:p>
@@ -8464,7 +9759,7 @@
       <w:r>
         <w:drawing>
           <wp:inline xmlns:a="http://schemas.openxmlformats.org/drawingml/2006/main" xmlns:pic="http://schemas.openxmlformats.org/drawingml/2006/picture">
-            <wp:extent cx="5806440" cy="2998931"/>
+            <wp:extent cx="5806440" cy="3046944"/>
             <wp:docPr id="23" name="Picture 23"/>
             <wp:cNvGraphicFramePr>
               <a:graphicFrameLocks noChangeAspect="1"/>
@@ -8485,7 +9780,7 @@
                   <pic:spPr>
                     <a:xfrm>
                       <a:off x="0" y="0"/>
-                      <a:ext cx="5806440" cy="2998931"/>
+                      <a:ext cx="5806440" cy="3046944"/>
                     </a:xfrm>
                     <a:prstGeom prst="rect"/>
                   </pic:spPr>
@@ -8508,7 +9803,7 @@
           <w:color w:val="3C4650"/>
           <w:sz w:val="18"/>
         </w:rPr>
-        <w:t>图 20  2^22 行方案的冲突表每行深度</w:t>
+        <w:t>图 20  横轴是 2^17 行冲突表的行深，0 到 16。深度 16 表示该行已满</w:t>
       </w:r>
     </w:p>
     <w:p>
@@ -8521,7 +9816,7 @@
           <w:b w:val="0"/>
           <w:sz w:val="22"/>
         </w:rPr>
-        <w:t>25% 负载时，2^22 行主表的平均每行条数是 1，和 2^24 行在 100% 负载时的 λ 相同。这一档主表溢出 0.4310%，公式 0.4349%，失败 0 条。50% 时主表溢出 3.7534%，公式 3.7571%，失败仍是 0。70% 时失败第一次出现，989 条，失败率 0.0084%，公式 0.0081%。90% 时失败率 2.6347%，公式 2.6366%。100% 时主表溢出 19.5342%，公式 19.5367%；冲突表溢出即失败率 7.0698%，公式 7.0730%。同一批 16,777,216 条 key 放在 2^24 行上，失败数是 0。</w:t>
+        <w:t>25% 最深到 4，50% 最深到 12，这两档没有深度 16 的行，失败是 0。70% 第一次在深度 16 出现一截，占冲突行的 0.94%，对应 989 条失败。90% 有 73.40% 的冲突行停在 16。100% 有 97.83% 的冲突行停在 16，失败率 7.07%。</w:t>
       </w:r>
     </w:p>
     <w:p>
@@ -8534,7 +9829,20 @@
           <w:b w:val="0"/>
           <w:sz w:val="22"/>
         </w:rPr>
-        <w:t>深度图和这个拐点对齐。25% 时主表深度 0 到 4 的行占 36.81%、36.75%、18.40%、6.13%、1.91%，冲突表最深只到 4。50% 时冲突表最深到 12，16 个槽还没有被顶满，所以失败仍是 0。70% 时冲突表第一次出现深度 16 的行，占冲突行的 0.94%，对应上面那 989 条插不进去的 key。90% 时 73.40% 的冲突行已经写满。100% 时主表深度 4 的行占 56.66%，冲突表 97.83% 的行停在深度 16。槽位总数等于 key 数时，哈希方差把约五分之一的 key 推出主行，其中约 7% 在冲突行里也找不到空槽。</w:t>
+        <w:t>小结：紧凑几何的失败从冲突行顶满 16 个槽开始。驱动几何的冲突行最深只到 4，所以没有这一截。</w:t>
+      </w:r>
+    </w:p>
+    <w:p>
+      <w:pPr>
+        <w:spacing w:after="120" w:before="0" w:line="276" w:lineRule="auto"/>
+      </w:pPr>
+      <w:r>
+        <w:rPr>
+          <w:rFonts w:ascii="Calibri" w:hAnsi="Calibri" w:eastAsia="微软雅黑"/>
+          <w:b w:val="0"/>
+          <w:sz w:val="22"/>
+        </w:rPr>
+        <w:t>十三张实验图合在一起：驱动几何把配满点放在平均每行 1 条。均匀哈希、换一套混合、以及 CTU 五元组，溢出都停在公式给出的千分之几，冲突表接得住，失败是 0，成功插入只有 1 次或 2 次 WQE。同一批 key 收成 2^22 行之后，失败率升到约 7%，深度图能看到冲突行顶满。粗哈希则让少数行先满，空行占绝大多数，失败率离开设计点。</w:t>
       </w:r>
     </w:p>
     <w:p>

</xml_diff>